<commit_message>
Added notes about flashing card
</commit_message>
<xml_diff>
--- a/DIY_Hotspot/DIY_Hotspot_Project_Management.docx
+++ b/DIY_Hotspot/DIY_Hotspot_Project_Management.docx
@@ -62,11 +62,81 @@
       <w:pPr>
         <w:numPr>
           <w:ilvl w:val="0"/>
-          <w:numId w:val="2"/>
+          <w:numId w:val="7"/>
         </w:numPr>
-      </w:pPr>
-      <w:r>
+        <w:rPr>
+          <w:i/>
+          <w:iCs/>
+          <w:strike/>
+        </w:rPr>
+      </w:pPr>
+      <w:r>
+        <w:rPr>
+          <w:i/>
+          <w:iCs/>
+          <w:strike/>
+        </w:rPr>
         <w:t>Order Stuff</w:t>
+      </w:r>
+    </w:p>
+    <w:p>
+      <w:pPr>
+        <w:numPr>
+          <w:ilvl w:val="0"/>
+          <w:numId w:val="7"/>
+        </w:numPr>
+        <w:rPr>
+          <w:i/>
+          <w:iCs/>
+          <w:strike/>
+        </w:rPr>
+      </w:pPr>
+      <w:r>
+        <w:rPr>
+          <w:i/>
+          <w:iCs/>
+          <w:strike/>
+        </w:rPr>
+        <w:t xml:space="preserve">Check </w:t>
+      </w:r>
+      <w:proofErr w:type="spellStart"/>
+      <w:r>
+        <w:rPr>
+          <w:i/>
+          <w:iCs/>
+          <w:strike/>
+        </w:rPr>
+        <w:t>uSD</w:t>
+      </w:r>
+      <w:proofErr w:type="spellEnd"/>
+      <w:r>
+        <w:rPr>
+          <w:i/>
+          <w:iCs/>
+          <w:strike/>
+        </w:rPr>
+        <w:t xml:space="preserve"> Card Inventory </w:t>
+      </w:r>
+    </w:p>
+    <w:p>
+      <w:pPr>
+        <w:numPr>
+          <w:ilvl w:val="0"/>
+          <w:numId w:val="7"/>
+        </w:numPr>
+        <w:rPr>
+          <w:i/>
+          <w:iCs/>
+          <w:strike/>
+        </w:rPr>
+      </w:pPr>
+      <w:r>
+        <w:rPr>
+          <w:i/>
+          <w:iCs/>
+          <w:strike/>
+        </w:rPr>
+        <w:t>Receive Stuff</w:t>
       </w:r>
     </w:p>
     <w:p>
@@ -75,9 +145,19 @@
           <w:ilvl w:val="0"/>
           <w:numId w:val="2"/>
         </w:numPr>
-      </w:pPr>
-      <w:r>
-        <w:t xml:space="preserve">Check uSD Card Inventory </w:t>
+        <w:rPr>
+          <w:b/>
+          <w:bCs/>
+          <w:color w:val="00B050"/>
+        </w:rPr>
+      </w:pPr>
+      <w:r>
+        <w:rPr>
+          <w:b/>
+          <w:bCs/>
+          <w:color w:val="00B050"/>
+        </w:rPr>
+        <w:t>Assemble</w:t>
       </w:r>
     </w:p>
     <w:p>
@@ -88,7 +168,7 @@
         </w:numPr>
       </w:pPr>
       <w:r>
-        <w:t>Receive Stuff</w:t>
+        <w:t>Test</w:t>
       </w:r>
     </w:p>
     <w:p>
@@ -99,7 +179,7 @@
         </w:numPr>
       </w:pPr>
       <w:r>
-        <w:t>Assemble</w:t>
+        <w:t>PDCA</w:t>
       </w:r>
     </w:p>
     <w:p>
@@ -110,28 +190,6 @@
         </w:numPr>
       </w:pPr>
       <w:r>
-        <w:t>Test</w:t>
-      </w:r>
-    </w:p>
-    <w:p>
-      <w:pPr>
-        <w:numPr>
-          <w:ilvl w:val="0"/>
-          <w:numId w:val="2"/>
-        </w:numPr>
-      </w:pPr>
-      <w:r>
-        <w:t>PDCA</w:t>
-      </w:r>
-    </w:p>
-    <w:p>
-      <w:pPr>
-        <w:numPr>
-          <w:ilvl w:val="0"/>
-          <w:numId w:val="2"/>
-        </w:numPr>
-      </w:pPr>
-      <w:r>
         <w:t xml:space="preserve">Play / Learn / Experiment </w:t>
       </w:r>
     </w:p>
@@ -165,11 +223,15 @@
         <w:rPr>
           <w:b/>
           <w:bCs/>
-        </w:rPr>
-        <w:t>Raspberry Pi Zero WH (with headers)</w:t>
-      </w:r>
-      <w:r>
-        <w:t xml:space="preserve">: This compact version of the Raspberry Pi comes with pre-soldered GPIO headers. </w:t>
+          <w:color w:val="00B050"/>
+          <w:sz w:val="28"/>
+          <w:szCs w:val="28"/>
+          <w:u w:val="single"/>
+        </w:rPr>
+        <w:t xml:space="preserve">Raspberry Pi Zero WH (with headers): </w:t>
+      </w:r>
+      <w:r>
+        <w:t xml:space="preserve">This compact version of the Raspberry Pi comes with pre-soldered GPIO headers. </w:t>
       </w:r>
       <w:hyperlink r:id="rId5" w:history="1">
         <w:r>
@@ -180,7 +242,15 @@
         </w:r>
       </w:hyperlink>
       <w:r>
-        <w:t xml:space="preserve"> Store (Cost: $16) —&gt; </w:t>
+        <w:t xml:space="preserve"> Store (Cost: $</w:t>
+      </w:r>
+      <w:proofErr w:type="gramStart"/>
+      <w:r>
+        <w:t>16) —</w:t>
+      </w:r>
+      <w:proofErr w:type="gramEnd"/>
+      <w:r>
+        <w:t xml:space="preserve">&gt; </w:t>
       </w:r>
       <w:r>
         <w:rPr>
@@ -188,7 +258,16 @@
           <w:bCs/>
           <w:u w:val="single"/>
         </w:rPr>
-        <w:t>ACTUAL Total: $22.89</w:t>
+        <w:t>ACTUAL Total: $22.</w:t>
+      </w:r>
+      <w:proofErr w:type="gramStart"/>
+      <w:r>
+        <w:rPr>
+          <w:b/>
+          <w:bCs/>
+          <w:u w:val="single"/>
+        </w:rPr>
+        <w:t>89</w:t>
       </w:r>
       <w:r>
         <w:rPr>
@@ -209,6 +288,7 @@
         </w:rPr>
         <w:t>RECEIVED</w:t>
       </w:r>
+      <w:proofErr w:type="gramEnd"/>
     </w:p>
     <w:p>
       <w:r>
@@ -287,11 +367,15 @@
         <w:rPr>
           <w:b/>
           <w:bCs/>
-        </w:rPr>
-        <w:t>MMDVM Hotspot Hat + Case + Antenna + Screen Kit</w:t>
-      </w:r>
-      <w:r>
-        <w:t xml:space="preserve">: This kit includes everything you need to turn your Raspberry Pi into a digital mode hotspot. </w:t>
+          <w:color w:val="00B050"/>
+          <w:sz w:val="28"/>
+          <w:szCs w:val="28"/>
+          <w:u w:val="single"/>
+        </w:rPr>
+        <w:t>MMDVM Hotspot Hat + Case + Antenna + Screen Kit:</w:t>
+      </w:r>
+      <w:r>
+        <w:t xml:space="preserve"> This kit includes everything you need to turn your Raspberry Pi into a digital mode hotspot. </w:t>
       </w:r>
       <w:hyperlink r:id="rId7" w:history="1">
         <w:r>
@@ -309,7 +393,15 @@
         <w:t xml:space="preserve"> </w:t>
       </w:r>
       <w:r>
-        <w:t xml:space="preserve">(Cost: $17)  —&gt; </w:t>
+        <w:t>(Cost: $17</w:t>
+      </w:r>
+      <w:proofErr w:type="gramStart"/>
+      <w:r>
+        <w:t>)  —</w:t>
+      </w:r>
+      <w:proofErr w:type="gramEnd"/>
+      <w:r>
+        <w:t xml:space="preserve">&gt; </w:t>
       </w:r>
       <w:r>
         <w:rPr>
@@ -318,6 +410,25 @@
           <w:u w:val="single"/>
         </w:rPr>
         <w:t>ACTUAL Total: $13.26</w:t>
+      </w:r>
+      <w:r>
+        <w:rPr>
+          <w:b/>
+          <w:bCs/>
+          <w:u w:val="single"/>
+        </w:rPr>
+        <w:t xml:space="preserve"> </w:t>
+      </w:r>
+      <w:r>
+        <w:rPr>
+          <w:b/>
+          <w:bCs/>
+          <w:color w:val="00B050"/>
+          <w:sz w:val="28"/>
+          <w:szCs w:val="28"/>
+          <w:u w:val="single"/>
+        </w:rPr>
+        <w:t>RECEIVED</w:t>
       </w:r>
     </w:p>
     <w:p>
@@ -397,11 +508,15 @@
         <w:rPr>
           <w:b/>
           <w:bCs/>
-        </w:rPr>
-        <w:t>Pi Zero Power Supply</w:t>
-      </w:r>
-      <w:r>
-        <w:t xml:space="preserve">: To ensure your Raspberry Pi has a reliable power source. </w:t>
+          <w:color w:val="00B050"/>
+          <w:sz w:val="28"/>
+          <w:szCs w:val="28"/>
+          <w:u w:val="single"/>
+        </w:rPr>
+        <w:t>Pi Zero Power Supply:</w:t>
+      </w:r>
+      <w:r>
+        <w:t xml:space="preserve"> To ensure your Raspberry Pi has a reliable power source. </w:t>
       </w:r>
       <w:hyperlink r:id="rId9" w:history="1">
         <w:r>
@@ -419,10 +534,18 @@
         <w:t xml:space="preserve"> </w:t>
       </w:r>
       <w:r>
-        <w:t xml:space="preserve">(Cost: $7) </w:t>
-      </w:r>
-      <w:r>
-        <w:t xml:space="preserve">—&gt; </w:t>
+        <w:t>(Cost: $</w:t>
+      </w:r>
+      <w:proofErr w:type="gramStart"/>
+      <w:r>
+        <w:t xml:space="preserve">7) </w:t>
+      </w:r>
+      <w:r>
+        <w:t>—</w:t>
+      </w:r>
+      <w:proofErr w:type="gramEnd"/>
+      <w:r>
+        <w:t xml:space="preserve">&gt; </w:t>
       </w:r>
       <w:r>
         <w:rPr>
@@ -452,7 +575,31 @@
           <w:szCs w:val="28"/>
           <w:u w:val="single"/>
         </w:rPr>
-        <w:t>Ordered and Received From Amazon</w:t>
+        <w:t xml:space="preserve">Ordered and Received </w:t>
+      </w:r>
+      <w:proofErr w:type="gramStart"/>
+      <w:r>
+        <w:rPr>
+          <w:b/>
+          <w:bCs/>
+          <w:color w:val="00B050"/>
+          <w:sz w:val="28"/>
+          <w:szCs w:val="28"/>
+          <w:u w:val="single"/>
+        </w:rPr>
+        <w:t>From</w:t>
+      </w:r>
+      <w:proofErr w:type="gramEnd"/>
+      <w:r>
+        <w:rPr>
+          <w:b/>
+          <w:bCs/>
+          <w:color w:val="00B050"/>
+          <w:sz w:val="28"/>
+          <w:szCs w:val="28"/>
+          <w:u w:val="single"/>
+        </w:rPr>
+        <w:t xml:space="preserve"> Amazon</w:t>
       </w:r>
     </w:p>
     <w:p>
@@ -467,7 +614,7 @@
         </w:rPr>
         <w:lastRenderedPageBreak/>
         <w:drawing>
-          <wp:inline distT="0" distB="0" distL="0" distR="0" wp14:anchorId="016F343B" wp14:editId="0B191ADD">
+          <wp:inline distT="0" distB="0" distL="0" distR="0" wp14:anchorId="016F343B" wp14:editId="1E4A983F">
             <wp:extent cx="4572000" cy="4267200"/>
             <wp:effectExtent l="0" t="0" r="0" b="0"/>
             <wp:docPr id="1432228605" name="Picture 4"/>
@@ -530,18 +677,22 @@
       <w:pPr>
         <w:numPr>
           <w:ilvl w:val="0"/>
-          <w:numId w:val="6"/>
+          <w:numId w:val="5"/>
         </w:numPr>
       </w:pPr>
       <w:r>
         <w:rPr>
           <w:b/>
           <w:bCs/>
-        </w:rPr>
-        <w:t>MicroSD Card (8 GB minimum)</w:t>
-      </w:r>
-      <w:r>
-        <w:t xml:space="preserve">: For installing the Pi-Star operating system. </w:t>
+          <w:color w:val="00B050"/>
+          <w:sz w:val="28"/>
+          <w:szCs w:val="28"/>
+          <w:u w:val="single"/>
+        </w:rPr>
+        <w:t>MicroSD Card (8 GB minimum):</w:t>
+      </w:r>
+      <w:r>
+        <w:t xml:space="preserve"> For installing the Pi-Star operating system. </w:t>
       </w:r>
       <w:hyperlink r:id="rId11" w:history="1">
         <w:r>
@@ -552,7 +703,11 @@
         </w:r>
       </w:hyperlink>
       <w:r>
-        <w:t xml:space="preserve">(Cost: $5)  </w:t>
+        <w:t>(Cost: $5</w:t>
+      </w:r>
+      <w:proofErr w:type="gramStart"/>
+      <w:r>
+        <w:t xml:space="preserve">)  </w:t>
       </w:r>
       <w:r>
         <w:rPr>
@@ -560,8 +715,68 @@
           <w:bCs/>
           <w:u w:val="single"/>
         </w:rPr>
-        <w:t>(Check Inventory)</w:t>
-      </w:r>
+        <w:t>(</w:t>
+      </w:r>
+      <w:proofErr w:type="gramEnd"/>
+      <w:r>
+        <w:rPr>
+          <w:b/>
+          <w:bCs/>
+          <w:u w:val="single"/>
+        </w:rPr>
+        <w:t>Check Inventory)</w:t>
+      </w:r>
+      <w:r>
+        <w:rPr>
+          <w:b/>
+          <w:bCs/>
+          <w:u w:val="single"/>
+        </w:rPr>
+        <w:t xml:space="preserve"> </w:t>
+      </w:r>
+      <w:r>
+        <w:rPr>
+          <w:b/>
+          <w:bCs/>
+          <w:color w:val="00B050"/>
+          <w:sz w:val="28"/>
+          <w:szCs w:val="28"/>
+          <w:u w:val="single"/>
+        </w:rPr>
+        <w:t xml:space="preserve">Ordered and Received </w:t>
+      </w:r>
+      <w:proofErr w:type="gramStart"/>
+      <w:r>
+        <w:rPr>
+          <w:b/>
+          <w:bCs/>
+          <w:color w:val="00B050"/>
+          <w:sz w:val="28"/>
+          <w:szCs w:val="28"/>
+          <w:u w:val="single"/>
+        </w:rPr>
+        <w:t>From</w:t>
+      </w:r>
+      <w:proofErr w:type="gramEnd"/>
+      <w:r>
+        <w:rPr>
+          <w:b/>
+          <w:bCs/>
+          <w:color w:val="00B050"/>
+          <w:sz w:val="28"/>
+          <w:szCs w:val="28"/>
+          <w:u w:val="single"/>
+        </w:rPr>
+        <w:t xml:space="preserve"> Amazon</w:t>
+      </w:r>
+    </w:p>
+    <w:p>
+      <w:pPr>
+        <w:numPr>
+          <w:ilvl w:val="0"/>
+          <w:numId w:val="6"/>
+        </w:numPr>
+      </w:pPr>
     </w:p>
     <w:p>
       <w:r>
@@ -594,66 +809,1806 @@
       </w:r>
     </w:p>
     <w:p>
+      <w:pPr>
+        <w:ind w:left="720"/>
+      </w:pPr>
       <w:r>
         <w:t>WO 4/14</w:t>
       </w:r>
     </w:p>
     <w:p>
+      <w:pPr>
+        <w:ind w:left="1440"/>
+      </w:pPr>
       <w:r>
         <w:t xml:space="preserve">Planning </w:t>
       </w:r>
     </w:p>
     <w:p>
-      <w:r>
+      <w:pPr>
+        <w:ind w:left="1440"/>
+      </w:pPr>
+      <w:r>
+        <w:lastRenderedPageBreak/>
         <w:t xml:space="preserve">Procurement </w:t>
       </w:r>
     </w:p>
     <w:p>
-      <w:r>
+      <w:pPr>
+        <w:ind w:left="1440"/>
+      </w:pPr>
+      <w:r>
+        <w:t>Start Survey</w:t>
+      </w:r>
+    </w:p>
+    <w:p>
+      <w:pPr>
+        <w:ind w:left="1440"/>
+      </w:pPr>
+      <w:r>
+        <w:t xml:space="preserve">Plan Hot Spot Schedule </w:t>
+      </w:r>
+    </w:p>
+    <w:p>
+      <w:r>
+        <w:t> </w:t>
+      </w:r>
+    </w:p>
+    <w:p>
+      <w:r>
+        <w:t> </w:t>
+      </w:r>
+    </w:p>
+    <w:p>
+      <w:r>
+        <w:rPr>
+          <w:b/>
+          <w:bCs/>
+          <w:u w:val="single"/>
+        </w:rPr>
+        <w:t>Cost</w:t>
+      </w:r>
+    </w:p>
+    <w:p>
+      <w:r>
+        <w:t> </w:t>
+      </w:r>
+    </w:p>
+    <w:p>
+      <w:r>
+        <w:t>Advertised:   $45</w:t>
+      </w:r>
+    </w:p>
+    <w:p>
+      <w:r>
+        <w:t>Predict</w:t>
+      </w:r>
+      <w:proofErr w:type="gramStart"/>
+      <w:r>
+        <w:t>:  $</w:t>
+      </w:r>
+      <w:proofErr w:type="gramEnd"/>
+      <w:r>
+        <w:t>55</w:t>
+      </w:r>
+    </w:p>
+    <w:p>
+      <w:r>
+        <w:br w:type="page"/>
+      </w:r>
+    </w:p>
+    <w:p>
+      <w:pPr>
+        <w:rPr>
+          <w:b/>
+          <w:bCs/>
+          <w:sz w:val="32"/>
+          <w:szCs w:val="32"/>
+        </w:rPr>
+      </w:pPr>
+      <w:r>
+        <w:rPr>
+          <w:b/>
+          <w:bCs/>
+          <w:sz w:val="32"/>
+          <w:szCs w:val="32"/>
+        </w:rPr>
         <w:lastRenderedPageBreak/>
-        <w:t>Start Survey</w:t>
-      </w:r>
-    </w:p>
-    <w:p>
-      <w:r>
-        <w:t xml:space="preserve">Plan Hot Spot Schedule </w:t>
-      </w:r>
-    </w:p>
-    <w:p>
-      <w:r>
-        <w:t> </w:t>
-      </w:r>
-    </w:p>
-    <w:p>
-      <w:r>
-        <w:t> </w:t>
-      </w:r>
-    </w:p>
-    <w:p>
-      <w:r>
-        <w:rPr>
-          <w:b/>
-          <w:bCs/>
-          <w:u w:val="single"/>
-        </w:rPr>
-        <w:t>Cost</w:t>
-      </w:r>
-    </w:p>
-    <w:p>
-      <w:r>
-        <w:t> </w:t>
-      </w:r>
-    </w:p>
-    <w:p>
-      <w:r>
-        <w:t>Advertised:   $45</w:t>
-      </w:r>
-    </w:p>
-    <w:p>
-      <w:r>
-        <w:t>Predict:  $55</w:t>
-      </w:r>
-    </w:p>
+        <w:t>04/26/25</w:t>
+      </w:r>
+    </w:p>
+    <w:p/>
+    <w:p>
+      <w:pPr>
+        <w:pStyle w:val="ListParagraph"/>
+        <w:numPr>
+          <w:ilvl w:val="0"/>
+          <w:numId w:val="9"/>
+        </w:numPr>
+      </w:pPr>
+      <w:r>
+        <w:t xml:space="preserve">Frequency Survey </w:t>
+      </w:r>
+      <w:proofErr w:type="gramStart"/>
+      <w:r>
+        <w:t>In</w:t>
+      </w:r>
+      <w:proofErr w:type="gramEnd"/>
+      <w:r>
+        <w:t xml:space="preserve"> Process</w:t>
+      </w:r>
+    </w:p>
+    <w:p>
+      <w:pPr>
+        <w:pStyle w:val="ListParagraph"/>
+        <w:numPr>
+          <w:ilvl w:val="0"/>
+          <w:numId w:val="9"/>
+        </w:numPr>
+      </w:pPr>
+      <w:r>
+        <w:t>Assembly Planning</w:t>
+      </w:r>
+    </w:p>
+    <w:p>
+      <w:pPr>
+        <w:pStyle w:val="ListParagraph"/>
+        <w:numPr>
+          <w:ilvl w:val="1"/>
+          <w:numId w:val="9"/>
+        </w:numPr>
+      </w:pPr>
+      <w:r>
+        <w:t>Flash Card</w:t>
+      </w:r>
+    </w:p>
+    <w:p>
+      <w:pPr>
+        <w:pStyle w:val="ListParagraph"/>
+        <w:numPr>
+          <w:ilvl w:val="1"/>
+          <w:numId w:val="9"/>
+        </w:numPr>
+      </w:pPr>
+      <w:r>
+        <w:t>Ass</w:t>
+      </w:r>
+      <w:r>
+        <w:t>emble</w:t>
+      </w:r>
+    </w:p>
+    <w:p/>
+    <w:p>
+      <w:r>
+        <w:t xml:space="preserve">New </w:t>
+      </w:r>
+      <w:proofErr w:type="spellStart"/>
+      <w:r>
+        <w:t>uSD</w:t>
+      </w:r>
+      <w:proofErr w:type="spellEnd"/>
+      <w:r>
+        <w:t xml:space="preserve"> Card DS 2 dot </w:t>
+      </w:r>
+      <w:proofErr w:type="spellStart"/>
+      <w:r>
+        <w:t>Validrive</w:t>
+      </w:r>
+      <w:proofErr w:type="spellEnd"/>
+      <w:r>
+        <w:t xml:space="preserve"> Report </w:t>
+      </w:r>
+      <w:r>
+        <w:rPr>
+          <w:b/>
+          <w:bCs/>
+          <w:color w:val="00B050"/>
+          <w:sz w:val="28"/>
+          <w:szCs w:val="28"/>
+        </w:rPr>
+        <w:t>(PASS – ACCEPT):</w:t>
+      </w:r>
+    </w:p>
+    <w:p/>
+    <w:p/>
+    <w:p>
+      <w:r>
+        <w:rPr>
+          <w:b/>
+          <w:bCs/>
+        </w:rPr>
+        <w:t>Report #1</w:t>
+      </w:r>
+    </w:p>
+    <w:tbl>
+      <w:tblPr>
+        <w:tblW w:w="0" w:type="auto"/>
+        <w:jc w:val="center"/>
+        <w:tblLayout w:type="fixed"/>
+        <w:tblCellMar>
+          <w:left w:w="10" w:type="dxa"/>
+          <w:right w:w="10" w:type="dxa"/>
+        </w:tblCellMar>
+        <w:tblLook w:val="0000" w:firstRow="0" w:lastRow="0" w:firstColumn="0" w:lastColumn="0" w:noHBand="0" w:noVBand="0"/>
+      </w:tblPr>
+      <w:tblGrid>
+        <w:gridCol w:w="2500"/>
+        <w:gridCol w:w="3600"/>
+      </w:tblGrid>
+      <w:tr>
+        <w:trPr>
+          <w:jc w:val="center"/>
+        </w:trPr>
+        <w:tc>
+          <w:tcPr>
+            <w:tcW w:w="2500" w:type="dxa"/>
+            <w:tcBorders>
+              <w:top w:val="nil"/>
+              <w:left w:val="nil"/>
+              <w:bottom w:val="nil"/>
+              <w:right w:val="nil"/>
+            </w:tcBorders>
+          </w:tcPr>
+          <w:p>
+            <w:r>
+              <w:t xml:space="preserve">  test date and time</w:t>
+            </w:r>
+          </w:p>
+        </w:tc>
+        <w:tc>
+          <w:tcPr>
+            <w:tcW w:w="3600" w:type="dxa"/>
+            <w:tcBorders>
+              <w:top w:val="nil"/>
+              <w:left w:val="nil"/>
+              <w:bottom w:val="nil"/>
+              <w:right w:val="nil"/>
+            </w:tcBorders>
+          </w:tcPr>
+          <w:p>
+            <w:r>
+              <w:t> 4/21/</w:t>
+            </w:r>
+            <w:proofErr w:type="gramStart"/>
+            <w:r>
+              <w:t>2025  at</w:t>
+            </w:r>
+            <w:proofErr w:type="gramEnd"/>
+            <w:r>
+              <w:t>  2:47 PM</w:t>
+            </w:r>
+          </w:p>
+        </w:tc>
+      </w:tr>
+      <w:tr>
+        <w:trPr>
+          <w:jc w:val="center"/>
+        </w:trPr>
+        <w:tc>
+          <w:tcPr>
+            <w:tcW w:w="2500" w:type="dxa"/>
+            <w:tcBorders>
+              <w:top w:val="nil"/>
+              <w:left w:val="nil"/>
+              <w:bottom w:val="nil"/>
+              <w:right w:val="nil"/>
+            </w:tcBorders>
+          </w:tcPr>
+          <w:p>
+            <w:r>
+              <w:t xml:space="preserve">  declared drive size</w:t>
+            </w:r>
+          </w:p>
+        </w:tc>
+        <w:tc>
+          <w:tcPr>
+            <w:tcW w:w="3600" w:type="dxa"/>
+            <w:tcBorders>
+              <w:top w:val="nil"/>
+              <w:left w:val="nil"/>
+              <w:bottom w:val="nil"/>
+              <w:right w:val="nil"/>
+            </w:tcBorders>
+          </w:tcPr>
+          <w:p>
+            <w:r>
+              <w:t> 63,864,569,856 (63.9GB)</w:t>
+            </w:r>
+          </w:p>
+        </w:tc>
+      </w:tr>
+      <w:tr>
+        <w:trPr>
+          <w:jc w:val="center"/>
+        </w:trPr>
+        <w:tc>
+          <w:tcPr>
+            <w:tcW w:w="2500" w:type="dxa"/>
+            <w:tcBorders>
+              <w:top w:val="nil"/>
+              <w:left w:val="nil"/>
+              <w:bottom w:val="nil"/>
+              <w:right w:val="nil"/>
+            </w:tcBorders>
+          </w:tcPr>
+          <w:p>
+            <w:r>
+              <w:t xml:space="preserve">  validated drive size</w:t>
+            </w:r>
+          </w:p>
+        </w:tc>
+        <w:tc>
+          <w:tcPr>
+            <w:tcW w:w="3600" w:type="dxa"/>
+            <w:tcBorders>
+              <w:top w:val="nil"/>
+              <w:left w:val="nil"/>
+              <w:bottom w:val="nil"/>
+              <w:right w:val="nil"/>
+            </w:tcBorders>
+          </w:tcPr>
+          <w:p>
+            <w:r>
+              <w:t> 63,864,569,856 (63.9GB)</w:t>
+            </w:r>
+          </w:p>
+        </w:tc>
+      </w:tr>
+      <w:tr>
+        <w:trPr>
+          <w:jc w:val="center"/>
+        </w:trPr>
+        <w:tc>
+          <w:tcPr>
+            <w:tcW w:w="2500" w:type="dxa"/>
+            <w:tcBorders>
+              <w:top w:val="nil"/>
+              <w:left w:val="nil"/>
+              <w:bottom w:val="nil"/>
+              <w:right w:val="nil"/>
+            </w:tcBorders>
+          </w:tcPr>
+          <w:p>
+            <w:r>
+              <w:t xml:space="preserve">  highest valid region</w:t>
+            </w:r>
+          </w:p>
+        </w:tc>
+        <w:tc>
+          <w:tcPr>
+            <w:tcW w:w="3600" w:type="dxa"/>
+            <w:tcBorders>
+              <w:top w:val="nil"/>
+              <w:left w:val="nil"/>
+              <w:bottom w:val="nil"/>
+              <w:right w:val="nil"/>
+            </w:tcBorders>
+          </w:tcPr>
+          <w:p>
+            <w:r>
+              <w:t> 63,864,569,856 (63.9GB)</w:t>
+            </w:r>
+          </w:p>
+        </w:tc>
+      </w:tr>
+      <w:tr>
+        <w:trPr>
+          <w:jc w:val="center"/>
+        </w:trPr>
+        <w:tc>
+          <w:tcPr>
+            <w:tcW w:w="2500" w:type="dxa"/>
+            <w:tcBorders>
+              <w:top w:val="nil"/>
+              <w:left w:val="nil"/>
+              <w:bottom w:val="nil"/>
+              <w:right w:val="nil"/>
+            </w:tcBorders>
+          </w:tcPr>
+          <w:p>
+            <w:r>
+              <w:t xml:space="preserve">  hub or drive vendor</w:t>
+            </w:r>
+          </w:p>
+        </w:tc>
+        <w:tc>
+          <w:tcPr>
+            <w:tcW w:w="3600" w:type="dxa"/>
+            <w:tcBorders>
+              <w:top w:val="nil"/>
+              <w:left w:val="nil"/>
+              <w:bottom w:val="nil"/>
+              <w:right w:val="nil"/>
+            </w:tcBorders>
+          </w:tcPr>
+          <w:p>
+            <w:r>
+              <w:t> mass</w:t>
+            </w:r>
+          </w:p>
+        </w:tc>
+      </w:tr>
+      <w:tr>
+        <w:trPr>
+          <w:jc w:val="center"/>
+        </w:trPr>
+        <w:tc>
+          <w:tcPr>
+            <w:tcW w:w="2500" w:type="dxa"/>
+            <w:tcBorders>
+              <w:top w:val="nil"/>
+              <w:left w:val="nil"/>
+              <w:bottom w:val="nil"/>
+              <w:right w:val="nil"/>
+            </w:tcBorders>
+          </w:tcPr>
+          <w:p>
+            <w:r>
+              <w:t xml:space="preserve">  hub or drive product</w:t>
+            </w:r>
+          </w:p>
+        </w:tc>
+        <w:tc>
+          <w:tcPr>
+            <w:tcW w:w="3600" w:type="dxa"/>
+            <w:tcBorders>
+              <w:top w:val="nil"/>
+              <w:left w:val="nil"/>
+              <w:bottom w:val="nil"/>
+              <w:right w:val="nil"/>
+            </w:tcBorders>
+          </w:tcPr>
+          <w:p>
+            <w:r>
+              <w:t> </w:t>
+            </w:r>
+            <w:proofErr w:type="spellStart"/>
+            <w:r>
+              <w:t>storage_device</w:t>
+            </w:r>
+            <w:proofErr w:type="spellEnd"/>
+          </w:p>
+        </w:tc>
+      </w:tr>
+      <w:tr>
+        <w:trPr>
+          <w:jc w:val="center"/>
+        </w:trPr>
+        <w:tc>
+          <w:tcPr>
+            <w:tcW w:w="2500" w:type="dxa"/>
+            <w:tcBorders>
+              <w:top w:val="nil"/>
+              <w:left w:val="nil"/>
+              <w:bottom w:val="nil"/>
+              <w:right w:val="nil"/>
+            </w:tcBorders>
+          </w:tcPr>
+          <w:p>
+            <w:r>
+              <w:t xml:space="preserve">  serial number</w:t>
+            </w:r>
+          </w:p>
+        </w:tc>
+        <w:tc>
+          <w:tcPr>
+            <w:tcW w:w="3600" w:type="dxa"/>
+            <w:tcBorders>
+              <w:top w:val="nil"/>
+              <w:left w:val="nil"/>
+              <w:bottom w:val="nil"/>
+              <w:right w:val="nil"/>
+            </w:tcBorders>
+          </w:tcPr>
+          <w:p>
+            <w:r>
+              <w:t> 121220160204</w:t>
+            </w:r>
+          </w:p>
+        </w:tc>
+      </w:tr>
+    </w:tbl>
+    <w:p/>
+    <w:p>
+      <w:r>
+        <w:rPr>
+          <w:noProof/>
+        </w:rPr>
+        <w:drawing>
+          <wp:inline distT="0" distB="0" distL="0" distR="0" wp14:anchorId="51C7C57D" wp14:editId="77F03AA1">
+            <wp:extent cx="3416300" cy="1689100"/>
+            <wp:effectExtent l="0" t="0" r="0" b="6350"/>
+            <wp:docPr id="1409445467" name="Picture 2" descr="A green and blue squares&#10;&#10;AI-generated content may be incorrect."/>
+            <wp:cNvGraphicFramePr>
+              <a:graphicFrameLocks xmlns:a="http://schemas.openxmlformats.org/drawingml/2006/main" noChangeAspect="1"/>
+            </wp:cNvGraphicFramePr>
+            <a:graphic xmlns:a="http://schemas.openxmlformats.org/drawingml/2006/main">
+              <a:graphicData uri="http://schemas.openxmlformats.org/drawingml/2006/picture">
+                <pic:pic xmlns:pic="http://schemas.openxmlformats.org/drawingml/2006/picture">
+                  <pic:nvPicPr>
+                    <pic:cNvPr id="1409445467" name="Picture 2" descr="A green and blue squares&#10;&#10;AI-generated content may be incorrect."/>
+                    <pic:cNvPicPr>
+                      <a:picLocks noChangeAspect="1" noChangeArrowheads="1"/>
+                    </pic:cNvPicPr>
+                  </pic:nvPicPr>
+                  <pic:blipFill>
+                    <a:blip r:embed="rId12">
+                      <a:extLst>
+                        <a:ext uri="{28A0092B-C50C-407E-A947-70E740481C1C}">
+                          <a14:useLocalDpi xmlns:a14="http://schemas.microsoft.com/office/drawing/2010/main" val="0"/>
+                        </a:ext>
+                      </a:extLst>
+                    </a:blip>
+                    <a:srcRect/>
+                    <a:stretch>
+                      <a:fillRect/>
+                    </a:stretch>
+                  </pic:blipFill>
+                  <pic:spPr bwMode="auto">
+                    <a:xfrm>
+                      <a:off x="0" y="0"/>
+                      <a:ext cx="3416300" cy="1689100"/>
+                    </a:xfrm>
+                    <a:prstGeom prst="rect">
+                      <a:avLst/>
+                    </a:prstGeom>
+                    <a:noFill/>
+                    <a:ln>
+                      <a:noFill/>
+                    </a:ln>
+                  </pic:spPr>
+                </pic:pic>
+              </a:graphicData>
+            </a:graphic>
+          </wp:inline>
+        </w:drawing>
+      </w:r>
+    </w:p>
+    <w:p>
+      <w:r>
+        <w:t>performance details</w:t>
+      </w:r>
+    </w:p>
+    <w:tbl>
+      <w:tblPr>
+        <w:tblW w:w="0" w:type="auto"/>
+        <w:jc w:val="center"/>
+        <w:tblLayout w:type="fixed"/>
+        <w:tblCellMar>
+          <w:left w:w="10" w:type="dxa"/>
+          <w:right w:w="10" w:type="dxa"/>
+        </w:tblCellMar>
+        <w:tblLook w:val="0000" w:firstRow="0" w:lastRow="0" w:firstColumn="0" w:lastColumn="0" w:noHBand="0" w:noVBand="0"/>
+      </w:tblPr>
+      <w:tblGrid>
+        <w:gridCol w:w="1400"/>
+        <w:gridCol w:w="1950"/>
+        <w:gridCol w:w="1950"/>
+      </w:tblGrid>
+      <w:tr>
+        <w:trPr>
+          <w:jc w:val="center"/>
+        </w:trPr>
+        <w:tc>
+          <w:tcPr>
+            <w:tcW w:w="1400" w:type="dxa"/>
+            <w:tcBorders>
+              <w:top w:val="nil"/>
+              <w:left w:val="nil"/>
+              <w:bottom w:val="nil"/>
+              <w:right w:val="nil"/>
+            </w:tcBorders>
+          </w:tcPr>
+          <w:p/>
+        </w:tc>
+        <w:tc>
+          <w:tcPr>
+            <w:tcW w:w="1950" w:type="dxa"/>
+            <w:tcBorders>
+              <w:top w:val="nil"/>
+              <w:left w:val="nil"/>
+              <w:bottom w:val="nil"/>
+              <w:right w:val="nil"/>
+            </w:tcBorders>
+          </w:tcPr>
+          <w:p>
+            <w:r>
+              <w:t xml:space="preserve">             read</w:t>
+            </w:r>
+          </w:p>
+        </w:tc>
+        <w:tc>
+          <w:tcPr>
+            <w:tcW w:w="1950" w:type="dxa"/>
+            <w:tcBorders>
+              <w:top w:val="nil"/>
+              <w:left w:val="nil"/>
+              <w:bottom w:val="nil"/>
+              <w:right w:val="nil"/>
+            </w:tcBorders>
+          </w:tcPr>
+          <w:p>
+            <w:r>
+              <w:t xml:space="preserve">            write</w:t>
+            </w:r>
+          </w:p>
+        </w:tc>
+      </w:tr>
+      <w:tr>
+        <w:trPr>
+          <w:jc w:val="center"/>
+        </w:trPr>
+        <w:tc>
+          <w:tcPr>
+            <w:tcW w:w="1400" w:type="dxa"/>
+            <w:tcBorders>
+              <w:top w:val="nil"/>
+              <w:left w:val="nil"/>
+              <w:bottom w:val="nil"/>
+              <w:right w:val="nil"/>
+            </w:tcBorders>
+          </w:tcPr>
+          <w:p>
+            <w:r>
+              <w:t xml:space="preserve">  samples</w:t>
+            </w:r>
+          </w:p>
+        </w:tc>
+        <w:tc>
+          <w:tcPr>
+            <w:tcW w:w="1950" w:type="dxa"/>
+            <w:tcBorders>
+              <w:top w:val="nil"/>
+              <w:left w:val="nil"/>
+              <w:bottom w:val="nil"/>
+              <w:right w:val="nil"/>
+            </w:tcBorders>
+          </w:tcPr>
+          <w:p>
+            <w:r>
+              <w:t xml:space="preserve">         1,152</w:t>
+            </w:r>
+          </w:p>
+        </w:tc>
+        <w:tc>
+          <w:tcPr>
+            <w:tcW w:w="1950" w:type="dxa"/>
+            <w:tcBorders>
+              <w:top w:val="nil"/>
+              <w:left w:val="nil"/>
+              <w:bottom w:val="nil"/>
+              <w:right w:val="nil"/>
+            </w:tcBorders>
+          </w:tcPr>
+          <w:p>
+            <w:r>
+              <w:t xml:space="preserve">         1,152</w:t>
+            </w:r>
+          </w:p>
+        </w:tc>
+      </w:tr>
+      <w:tr>
+        <w:trPr>
+          <w:jc w:val="center"/>
+        </w:trPr>
+        <w:tc>
+          <w:tcPr>
+            <w:tcW w:w="1400" w:type="dxa"/>
+            <w:tcBorders>
+              <w:top w:val="nil"/>
+              <w:left w:val="nil"/>
+              <w:bottom w:val="nil"/>
+              <w:right w:val="nil"/>
+            </w:tcBorders>
+          </w:tcPr>
+          <w:p>
+            <w:r>
+              <w:t xml:space="preserve">  minimum</w:t>
+            </w:r>
+          </w:p>
+        </w:tc>
+        <w:tc>
+          <w:tcPr>
+            <w:tcW w:w="1950" w:type="dxa"/>
+            <w:tcBorders>
+              <w:top w:val="nil"/>
+              <w:left w:val="nil"/>
+              <w:bottom w:val="nil"/>
+              <w:right w:val="nil"/>
+            </w:tcBorders>
+          </w:tcPr>
+          <w:p>
+            <w:r>
+              <w:t xml:space="preserve">           551</w:t>
+            </w:r>
+          </w:p>
+        </w:tc>
+        <w:tc>
+          <w:tcPr>
+            <w:tcW w:w="1950" w:type="dxa"/>
+            <w:tcBorders>
+              <w:top w:val="nil"/>
+              <w:left w:val="nil"/>
+              <w:bottom w:val="nil"/>
+              <w:right w:val="nil"/>
+            </w:tcBorders>
+          </w:tcPr>
+          <w:p>
+            <w:r>
+              <w:t xml:space="preserve">           566</w:t>
+            </w:r>
+          </w:p>
+        </w:tc>
+      </w:tr>
+      <w:tr>
+        <w:trPr>
+          <w:jc w:val="center"/>
+        </w:trPr>
+        <w:tc>
+          <w:tcPr>
+            <w:tcW w:w="1400" w:type="dxa"/>
+            <w:tcBorders>
+              <w:top w:val="nil"/>
+              <w:left w:val="nil"/>
+              <w:bottom w:val="nil"/>
+              <w:right w:val="nil"/>
+            </w:tcBorders>
+          </w:tcPr>
+          <w:p>
+            <w:r>
+              <w:t xml:space="preserve">  maximum</w:t>
+            </w:r>
+          </w:p>
+        </w:tc>
+        <w:tc>
+          <w:tcPr>
+            <w:tcW w:w="1950" w:type="dxa"/>
+            <w:tcBorders>
+              <w:top w:val="nil"/>
+              <w:left w:val="nil"/>
+              <w:bottom w:val="nil"/>
+              <w:right w:val="nil"/>
+            </w:tcBorders>
+          </w:tcPr>
+          <w:p>
+            <w:r>
+              <w:t xml:space="preserve">        16,838</w:t>
+            </w:r>
+          </w:p>
+        </w:tc>
+        <w:tc>
+          <w:tcPr>
+            <w:tcW w:w="1950" w:type="dxa"/>
+            <w:tcBorders>
+              <w:top w:val="nil"/>
+              <w:left w:val="nil"/>
+              <w:bottom w:val="nil"/>
+              <w:right w:val="nil"/>
+            </w:tcBorders>
+          </w:tcPr>
+          <w:p>
+            <w:r>
+              <w:t xml:space="preserve">        31,767</w:t>
+            </w:r>
+          </w:p>
+        </w:tc>
+      </w:tr>
+      <w:tr>
+        <w:trPr>
+          <w:jc w:val="center"/>
+        </w:trPr>
+        <w:tc>
+          <w:tcPr>
+            <w:tcW w:w="1400" w:type="dxa"/>
+            <w:tcBorders>
+              <w:top w:val="nil"/>
+              <w:left w:val="nil"/>
+              <w:bottom w:val="nil"/>
+              <w:right w:val="nil"/>
+            </w:tcBorders>
+          </w:tcPr>
+          <w:p>
+            <w:r>
+              <w:t xml:space="preserve">  average</w:t>
+            </w:r>
+          </w:p>
+        </w:tc>
+        <w:tc>
+          <w:tcPr>
+            <w:tcW w:w="1950" w:type="dxa"/>
+            <w:tcBorders>
+              <w:top w:val="nil"/>
+              <w:left w:val="nil"/>
+              <w:bottom w:val="nil"/>
+              <w:right w:val="nil"/>
+            </w:tcBorders>
+          </w:tcPr>
+          <w:p>
+            <w:r>
+              <w:t xml:space="preserve">         1,451</w:t>
+            </w:r>
+          </w:p>
+        </w:tc>
+        <w:tc>
+          <w:tcPr>
+            <w:tcW w:w="1950" w:type="dxa"/>
+            <w:tcBorders>
+              <w:top w:val="nil"/>
+              <w:left w:val="nil"/>
+              <w:bottom w:val="nil"/>
+              <w:right w:val="nil"/>
+            </w:tcBorders>
+          </w:tcPr>
+          <w:p>
+            <w:r>
+              <w:t xml:space="preserve">           737</w:t>
+            </w:r>
+          </w:p>
+        </w:tc>
+      </w:tr>
+      <w:tr>
+        <w:trPr>
+          <w:jc w:val="center"/>
+        </w:trPr>
+        <w:tc>
+          <w:tcPr>
+            <w:tcW w:w="1400" w:type="dxa"/>
+            <w:tcBorders>
+              <w:top w:val="nil"/>
+              <w:left w:val="nil"/>
+              <w:bottom w:val="nil"/>
+              <w:right w:val="nil"/>
+            </w:tcBorders>
+          </w:tcPr>
+          <w:p>
+            <w:r>
+              <w:t xml:space="preserve">  median</w:t>
+            </w:r>
+          </w:p>
+        </w:tc>
+        <w:tc>
+          <w:tcPr>
+            <w:tcW w:w="1950" w:type="dxa"/>
+            <w:tcBorders>
+              <w:top w:val="nil"/>
+              <w:left w:val="nil"/>
+              <w:bottom w:val="nil"/>
+              <w:right w:val="nil"/>
+            </w:tcBorders>
+          </w:tcPr>
+          <w:p>
+            <w:r>
+              <w:t xml:space="preserve">         1,100</w:t>
+            </w:r>
+          </w:p>
+        </w:tc>
+        <w:tc>
+          <w:tcPr>
+            <w:tcW w:w="1950" w:type="dxa"/>
+            <w:tcBorders>
+              <w:top w:val="nil"/>
+              <w:left w:val="nil"/>
+              <w:bottom w:val="nil"/>
+              <w:right w:val="nil"/>
+            </w:tcBorders>
+          </w:tcPr>
+          <w:p>
+            <w:r>
+              <w:t xml:space="preserve">           666</w:t>
+            </w:r>
+          </w:p>
+        </w:tc>
+      </w:tr>
+      <w:tr>
+        <w:trPr>
+          <w:jc w:val="center"/>
+        </w:trPr>
+        <w:tc>
+          <w:tcPr>
+            <w:tcW w:w="1400" w:type="dxa"/>
+            <w:tcBorders>
+              <w:top w:val="nil"/>
+              <w:left w:val="nil"/>
+              <w:bottom w:val="nil"/>
+              <w:right w:val="nil"/>
+            </w:tcBorders>
+          </w:tcPr>
+          <w:p>
+            <w:r>
+              <w:t xml:space="preserve">  std dev</w:t>
+            </w:r>
+          </w:p>
+        </w:tc>
+        <w:tc>
+          <w:tcPr>
+            <w:tcW w:w="1950" w:type="dxa"/>
+            <w:tcBorders>
+              <w:top w:val="nil"/>
+              <w:left w:val="nil"/>
+              <w:bottom w:val="nil"/>
+              <w:right w:val="nil"/>
+            </w:tcBorders>
+          </w:tcPr>
+          <w:p>
+            <w:r>
+              <w:t xml:space="preserve">           994</w:t>
+            </w:r>
+          </w:p>
+        </w:tc>
+        <w:tc>
+          <w:tcPr>
+            <w:tcW w:w="1950" w:type="dxa"/>
+            <w:tcBorders>
+              <w:top w:val="nil"/>
+              <w:left w:val="nil"/>
+              <w:bottom w:val="nil"/>
+              <w:right w:val="nil"/>
+            </w:tcBorders>
+          </w:tcPr>
+          <w:p>
+            <w:r>
+              <w:t xml:space="preserve">         1,175</w:t>
+            </w:r>
+          </w:p>
+        </w:tc>
+      </w:tr>
+      <w:tr>
+        <w:trPr>
+          <w:jc w:val="center"/>
+        </w:trPr>
+        <w:tc>
+          <w:tcPr>
+            <w:tcW w:w="1400" w:type="dxa"/>
+            <w:tcBorders>
+              <w:top w:val="nil"/>
+              <w:left w:val="nil"/>
+              <w:bottom w:val="nil"/>
+              <w:right w:val="nil"/>
+            </w:tcBorders>
+          </w:tcPr>
+          <w:p>
+            <w:r>
+              <w:t xml:space="preserve">  variance</w:t>
+            </w:r>
+          </w:p>
+        </w:tc>
+        <w:tc>
+          <w:tcPr>
+            <w:tcW w:w="1950" w:type="dxa"/>
+            <w:tcBorders>
+              <w:top w:val="nil"/>
+              <w:left w:val="nil"/>
+              <w:bottom w:val="nil"/>
+              <w:right w:val="nil"/>
+            </w:tcBorders>
+          </w:tcPr>
+          <w:p>
+            <w:r>
+              <w:t xml:space="preserve">         0.685</w:t>
+            </w:r>
+          </w:p>
+        </w:tc>
+        <w:tc>
+          <w:tcPr>
+            <w:tcW w:w="1950" w:type="dxa"/>
+            <w:tcBorders>
+              <w:top w:val="nil"/>
+              <w:left w:val="nil"/>
+              <w:bottom w:val="nil"/>
+              <w:right w:val="nil"/>
+            </w:tcBorders>
+          </w:tcPr>
+          <w:p>
+            <w:r>
+              <w:t xml:space="preserve">         1.593</w:t>
+            </w:r>
+          </w:p>
+        </w:tc>
+      </w:tr>
+      <w:tr>
+        <w:trPr>
+          <w:jc w:val="center"/>
+        </w:trPr>
+        <w:tc>
+          <w:tcPr>
+            <w:tcW w:w="1400" w:type="dxa"/>
+            <w:tcBorders>
+              <w:top w:val="nil"/>
+              <w:left w:val="nil"/>
+              <w:bottom w:val="nil"/>
+              <w:right w:val="nil"/>
+            </w:tcBorders>
+          </w:tcPr>
+          <w:p>
+            <w:r>
+              <w:t xml:space="preserve">  total time</w:t>
+            </w:r>
+          </w:p>
+        </w:tc>
+        <w:tc>
+          <w:tcPr>
+            <w:tcW w:w="1950" w:type="dxa"/>
+            <w:tcBorders>
+              <w:top w:val="nil"/>
+              <w:left w:val="nil"/>
+              <w:bottom w:val="nil"/>
+              <w:right w:val="nil"/>
+            </w:tcBorders>
+          </w:tcPr>
+          <w:p>
+            <w:r>
+              <w:t xml:space="preserve">     1,671,909</w:t>
+            </w:r>
+          </w:p>
+        </w:tc>
+        <w:tc>
+          <w:tcPr>
+            <w:tcW w:w="1950" w:type="dxa"/>
+            <w:tcBorders>
+              <w:top w:val="nil"/>
+              <w:left w:val="nil"/>
+              <w:bottom w:val="nil"/>
+              <w:right w:val="nil"/>
+            </w:tcBorders>
+          </w:tcPr>
+          <w:p>
+            <w:r>
+              <w:t xml:space="preserve">       850,080</w:t>
+            </w:r>
+          </w:p>
+        </w:tc>
+      </w:tr>
+      <w:tr>
+        <w:trPr>
+          <w:jc w:val="center"/>
+        </w:trPr>
+        <w:tc>
+          <w:tcPr>
+            <w:tcW w:w="1400" w:type="dxa"/>
+            <w:tcBorders>
+              <w:top w:val="nil"/>
+              <w:left w:val="nil"/>
+              <w:bottom w:val="nil"/>
+              <w:right w:val="nil"/>
+            </w:tcBorders>
+          </w:tcPr>
+          <w:p>
+            <w:r>
+              <w:t xml:space="preserve">  percent</w:t>
+            </w:r>
+          </w:p>
+        </w:tc>
+        <w:tc>
+          <w:tcPr>
+            <w:tcW w:w="1950" w:type="dxa"/>
+            <w:tcBorders>
+              <w:top w:val="nil"/>
+              <w:left w:val="nil"/>
+              <w:bottom w:val="nil"/>
+              <w:right w:val="nil"/>
+            </w:tcBorders>
+          </w:tcPr>
+          <w:p>
+            <w:r>
+              <w:t xml:space="preserve">        66.29%</w:t>
+            </w:r>
+          </w:p>
+        </w:tc>
+        <w:tc>
+          <w:tcPr>
+            <w:tcW w:w="1950" w:type="dxa"/>
+            <w:tcBorders>
+              <w:top w:val="nil"/>
+              <w:left w:val="nil"/>
+              <w:bottom w:val="nil"/>
+              <w:right w:val="nil"/>
+            </w:tcBorders>
+          </w:tcPr>
+          <w:p>
+            <w:r>
+              <w:t xml:space="preserve">        33.71%</w:t>
+            </w:r>
+          </w:p>
+        </w:tc>
+      </w:tr>
+    </w:tbl>
+    <w:p>
+      <w:r>
+        <w:rPr>
+          <w:i/>
+          <w:iCs/>
+        </w:rPr>
+        <w:t>time measurements in microseconds</w:t>
+      </w:r>
+    </w:p>
+    <w:p/>
+    <w:p/>
+    <w:p/>
+    <w:p/>
+    <w:p>
+      <w:r>
+        <w:rPr>
+          <w:b/>
+          <w:bCs/>
+        </w:rPr>
+        <w:t>Setting Up Your Hotspot:</w:t>
+      </w:r>
+    </w:p>
+    <w:p>
+      <w:r>
+        <w:rPr>
+          <w:b/>
+          <w:bCs/>
+        </w:rPr>
+        <w:t>Flashing Pi-Star onto the MicroSD Card</w:t>
+      </w:r>
+    </w:p>
+    <w:p>
+      <w:pPr>
+        <w:pStyle w:val="ListParagraph"/>
+        <w:numPr>
+          <w:ilvl w:val="1"/>
+          <w:numId w:val="5"/>
+        </w:numPr>
+      </w:pPr>
+      <w:r>
+        <w:rPr>
+          <w:b/>
+          <w:bCs/>
+          <w:color w:val="00B050"/>
+        </w:rPr>
+        <w:t>Download Rufus</w:t>
+      </w:r>
+      <w:r>
+        <w:t xml:space="preserve">: Head to the </w:t>
+      </w:r>
+      <w:hyperlink r:id="rId13" w:history="1">
+        <w:r>
+          <w:rPr>
+            <w:rStyle w:val="Hyperlink"/>
+          </w:rPr>
+          <w:t xml:space="preserve">Rufus website </w:t>
+        </w:r>
+      </w:hyperlink>
+      <w:r>
+        <w:t>and download the latest version for your Windows PC. Install Rufus by following the on-screen instructions.</w:t>
+      </w:r>
+    </w:p>
+    <w:p>
+      <w:pPr>
+        <w:pStyle w:val="ListParagraph"/>
+        <w:numPr>
+          <w:ilvl w:val="0"/>
+          <w:numId w:val="5"/>
+        </w:numPr>
+      </w:pPr>
+      <w:r>
+        <w:drawing>
+          <wp:inline distT="0" distB="0" distL="0" distR="0" wp14:anchorId="563F10AA" wp14:editId="60D4BDCF">
+            <wp:extent cx="4521432" cy="876345"/>
+            <wp:effectExtent l="0" t="0" r="0" b="0"/>
+            <wp:docPr id="154046832" name="Picture 1" descr="A close up of a computer&#10;&#10;AI-generated content may be incorrect."/>
+            <wp:cNvGraphicFramePr>
+              <a:graphicFrameLocks xmlns:a="http://schemas.openxmlformats.org/drawingml/2006/main" noChangeAspect="1"/>
+            </wp:cNvGraphicFramePr>
+            <a:graphic xmlns:a="http://schemas.openxmlformats.org/drawingml/2006/main">
+              <a:graphicData uri="http://schemas.openxmlformats.org/drawingml/2006/picture">
+                <pic:pic xmlns:pic="http://schemas.openxmlformats.org/drawingml/2006/picture">
+                  <pic:nvPicPr>
+                    <pic:cNvPr id="154046832" name="Picture 1" descr="A close up of a computer&#10;&#10;AI-generated content may be incorrect."/>
+                    <pic:cNvPicPr/>
+                  </pic:nvPicPr>
+                  <pic:blipFill>
+                    <a:blip r:embed="rId14"/>
+                    <a:stretch>
+                      <a:fillRect/>
+                    </a:stretch>
+                  </pic:blipFill>
+                  <pic:spPr>
+                    <a:xfrm>
+                      <a:off x="0" y="0"/>
+                      <a:ext cx="4521432" cy="876345"/>
+                    </a:xfrm>
+                    <a:prstGeom prst="rect">
+                      <a:avLst/>
+                    </a:prstGeom>
+                  </pic:spPr>
+                </pic:pic>
+              </a:graphicData>
+            </a:graphic>
+          </wp:inline>
+        </w:drawing>
+      </w:r>
+    </w:p>
+    <w:p>
+      <w:pPr>
+        <w:pStyle w:val="ListParagraph"/>
+      </w:pPr>
+    </w:p>
+    <w:p/>
+    <w:p/>
+    <w:p/>
+    <w:p>
+      <w:r>
+        <w:rPr>
+          <w:b/>
+          <w:bCs/>
+        </w:rPr>
+        <w:lastRenderedPageBreak/>
+        <w:t xml:space="preserve">2. </w:t>
+      </w:r>
+      <w:r>
+        <w:rPr>
+          <w:b/>
+          <w:bCs/>
+          <w:color w:val="00B050"/>
+        </w:rPr>
+        <w:t>Download Pi-Star</w:t>
+      </w:r>
+      <w:r>
+        <w:t>: Visit the Pi-Star website to download the latest Pi-Star image file. Extract the .zip file to a folder on your PC.</w:t>
+      </w:r>
+    </w:p>
+    <w:p/>
+    <w:p>
+      <w:r>
+        <w:t>MD5 hash of Pi-Star_RPi_V4.2.3_18-Apr-2025.img:</w:t>
+      </w:r>
+    </w:p>
+    <w:p>
+      <w:r>
+        <w:t>4f3d947fc4d7e1c501fbaa19c2c85816</w:t>
+      </w:r>
+    </w:p>
+    <w:p>
+      <w:proofErr w:type="spellStart"/>
+      <w:r>
+        <w:t>CertUtil</w:t>
+      </w:r>
+      <w:proofErr w:type="spellEnd"/>
+      <w:r>
+        <w:t>: -</w:t>
+      </w:r>
+      <w:proofErr w:type="spellStart"/>
+      <w:r>
+        <w:t>hashfile</w:t>
+      </w:r>
+      <w:proofErr w:type="spellEnd"/>
+      <w:r>
+        <w:t xml:space="preserve"> command completed successfully.</w:t>
+      </w:r>
+    </w:p>
+    <w:p/>
+    <w:p>
+      <w:r>
+        <w:t xml:space="preserve">Expected Value:  </w:t>
+      </w:r>
+      <w:r>
+        <w:t>4f3d947fc4d7e1c501fbaa19c2c</w:t>
+      </w:r>
+      <w:proofErr w:type="gramStart"/>
+      <w:r>
+        <w:t>85816  Pi-Star_RPi_V4.2.3_18-Apr-2025.img</w:t>
+      </w:r>
+      <w:proofErr w:type="gramEnd"/>
+    </w:p>
+    <w:p>
+      <w:pPr>
+        <w:rPr>
+          <w:b/>
+          <w:bCs/>
+          <w:color w:val="00B050"/>
+        </w:rPr>
+      </w:pPr>
+      <w:r>
+        <w:rPr>
+          <w:b/>
+          <w:bCs/>
+          <w:color w:val="00B050"/>
+        </w:rPr>
+        <w:t xml:space="preserve">Expected:   </w:t>
+      </w:r>
+      <w:r>
+        <w:rPr>
+          <w:b/>
+          <w:bCs/>
+          <w:color w:val="00B050"/>
+        </w:rPr>
+        <w:t>4f3d94</w:t>
+      </w:r>
+      <w:r>
+        <w:rPr>
+          <w:b/>
+          <w:bCs/>
+          <w:color w:val="00B050"/>
+        </w:rPr>
+        <w:t xml:space="preserve"> </w:t>
+      </w:r>
+      <w:r>
+        <w:rPr>
+          <w:b/>
+          <w:bCs/>
+          <w:color w:val="00B050"/>
+        </w:rPr>
+        <w:t>7fc4d7</w:t>
+      </w:r>
+      <w:r>
+        <w:rPr>
+          <w:b/>
+          <w:bCs/>
+          <w:color w:val="00B050"/>
+        </w:rPr>
+        <w:t xml:space="preserve"> </w:t>
+      </w:r>
+      <w:r>
+        <w:rPr>
+          <w:b/>
+          <w:bCs/>
+          <w:color w:val="00B050"/>
+        </w:rPr>
+        <w:t>e1c501</w:t>
+      </w:r>
+      <w:r>
+        <w:rPr>
+          <w:b/>
+          <w:bCs/>
+          <w:color w:val="00B050"/>
+        </w:rPr>
+        <w:t xml:space="preserve"> </w:t>
+      </w:r>
+      <w:r>
+        <w:rPr>
+          <w:b/>
+          <w:bCs/>
+          <w:color w:val="00B050"/>
+        </w:rPr>
+        <w:t>fbaa19</w:t>
+      </w:r>
+      <w:r>
+        <w:rPr>
+          <w:b/>
+          <w:bCs/>
+          <w:color w:val="00B050"/>
+        </w:rPr>
+        <w:t xml:space="preserve"> </w:t>
+      </w:r>
+      <w:r>
+        <w:rPr>
+          <w:b/>
+          <w:bCs/>
+          <w:color w:val="00B050"/>
+        </w:rPr>
+        <w:t>c2c85816</w:t>
+      </w:r>
+    </w:p>
+    <w:p>
+      <w:pPr>
+        <w:rPr>
+          <w:b/>
+          <w:bCs/>
+          <w:color w:val="00B050"/>
+        </w:rPr>
+      </w:pPr>
+      <w:proofErr w:type="gramStart"/>
+      <w:r>
+        <w:rPr>
+          <w:b/>
+          <w:bCs/>
+          <w:color w:val="00B050"/>
+        </w:rPr>
+        <w:t>Actual</w:t>
+      </w:r>
+      <w:proofErr w:type="gramEnd"/>
+      <w:r>
+        <w:rPr>
+          <w:b/>
+          <w:bCs/>
+          <w:color w:val="00B050"/>
+        </w:rPr>
+        <w:t xml:space="preserve">:         </w:t>
+      </w:r>
+      <w:r>
+        <w:rPr>
+          <w:b/>
+          <w:bCs/>
+          <w:color w:val="00B050"/>
+        </w:rPr>
+        <w:t>4f3d94</w:t>
+      </w:r>
+      <w:r>
+        <w:rPr>
+          <w:b/>
+          <w:bCs/>
+          <w:color w:val="00B050"/>
+        </w:rPr>
+        <w:t xml:space="preserve"> </w:t>
+      </w:r>
+      <w:r>
+        <w:rPr>
+          <w:b/>
+          <w:bCs/>
+          <w:color w:val="00B050"/>
+        </w:rPr>
+        <w:t>7fc4d7</w:t>
+      </w:r>
+      <w:r>
+        <w:rPr>
+          <w:b/>
+          <w:bCs/>
+          <w:color w:val="00B050"/>
+        </w:rPr>
+        <w:t xml:space="preserve"> </w:t>
+      </w:r>
+      <w:r>
+        <w:rPr>
+          <w:b/>
+          <w:bCs/>
+          <w:color w:val="00B050"/>
+        </w:rPr>
+        <w:t>e1c501</w:t>
+      </w:r>
+      <w:r>
+        <w:rPr>
+          <w:b/>
+          <w:bCs/>
+          <w:color w:val="00B050"/>
+        </w:rPr>
+        <w:t xml:space="preserve"> </w:t>
+      </w:r>
+      <w:r>
+        <w:rPr>
+          <w:b/>
+          <w:bCs/>
+          <w:color w:val="00B050"/>
+        </w:rPr>
+        <w:t>fbaa19</w:t>
+      </w:r>
+      <w:r>
+        <w:rPr>
+          <w:b/>
+          <w:bCs/>
+          <w:color w:val="00B050"/>
+        </w:rPr>
+        <w:t xml:space="preserve"> </w:t>
+      </w:r>
+      <w:r>
+        <w:rPr>
+          <w:b/>
+          <w:bCs/>
+          <w:color w:val="00B050"/>
+        </w:rPr>
+        <w:t>c2c85816</w:t>
+      </w:r>
+    </w:p>
+    <w:p>
+      <w:pPr>
+        <w:rPr>
+          <w:b/>
+          <w:bCs/>
+          <w:color w:val="00B050"/>
+        </w:rPr>
+      </w:pPr>
+    </w:p>
+    <w:p>
+      <w:pPr>
+        <w:rPr>
+          <w:b/>
+          <w:bCs/>
+          <w:color w:val="00B050"/>
+        </w:rPr>
+      </w:pPr>
+      <w:r>
+        <w:rPr>
+          <w:b/>
+          <w:bCs/>
+          <w:color w:val="00B050"/>
+        </w:rPr>
+        <w:t>Good Check</w:t>
+      </w:r>
+      <w:r>
+        <w:rPr>
+          <w:b/>
+          <w:bCs/>
+          <w:color w:val="00B050"/>
+        </w:rPr>
+        <w:t xml:space="preserve">sum </w:t>
+      </w:r>
+      <w:r>
+        <w:rPr>
+          <w:b/>
+          <w:bCs/>
+          <w:color w:val="00B050"/>
+        </w:rPr>
+        <w:sym w:font="Wingdings" w:char="F0E0"/>
+      </w:r>
+      <w:r>
+        <w:rPr>
+          <w:b/>
+          <w:bCs/>
+          <w:color w:val="00B050"/>
+        </w:rPr>
+        <w:t xml:space="preserve"> Proceed</w:t>
+      </w:r>
+    </w:p>
+    <w:p/>
+    <w:p/>
+    <w:p/>
+    <w:p>
+      <w:r>
+        <w:rPr>
+          <w:b/>
+          <w:bCs/>
+        </w:rPr>
+        <w:t xml:space="preserve">3. </w:t>
+      </w:r>
+      <w:r>
+        <w:rPr>
+          <w:b/>
+          <w:bCs/>
+          <w:color w:val="00B050"/>
+        </w:rPr>
+        <w:t>Prepare the MicroSD Card</w:t>
+      </w:r>
+      <w:r>
+        <w:t>: Insert the MicroSD card into your computer's card reader. Ensure it is recognized and assigned a drive letter.</w:t>
+      </w:r>
+    </w:p>
+    <w:p>
+      <w:r>
+        <w:rPr>
+          <w:b/>
+          <w:bCs/>
+        </w:rPr>
+        <w:t xml:space="preserve">4. </w:t>
+      </w:r>
+      <w:r>
+        <w:rPr>
+          <w:b/>
+          <w:bCs/>
+          <w:color w:val="00B050"/>
+        </w:rPr>
+        <w:t>Configure Rufus</w:t>
+      </w:r>
+      <w:r>
+        <w:t>:</w:t>
+      </w:r>
+    </w:p>
+    <w:p>
+      <w:pPr>
+        <w:numPr>
+          <w:ilvl w:val="0"/>
+          <w:numId w:val="10"/>
+        </w:numPr>
+        <w:rPr>
+          <w:color w:val="00B050"/>
+        </w:rPr>
+      </w:pPr>
+      <w:r>
+        <w:rPr>
+          <w:color w:val="00B050"/>
+        </w:rPr>
+        <w:t>Open Rufus and select your MicroSD card as the "Device".</w:t>
+      </w:r>
+    </w:p>
+    <w:p>
+      <w:pPr>
+        <w:numPr>
+          <w:ilvl w:val="0"/>
+          <w:numId w:val="10"/>
+        </w:numPr>
+        <w:rPr>
+          <w:color w:val="00B050"/>
+        </w:rPr>
+      </w:pPr>
+      <w:r>
+        <w:rPr>
+          <w:color w:val="00B050"/>
+        </w:rPr>
+        <w:t>Click "Select" to choose the Pi-Star .</w:t>
+      </w:r>
+      <w:proofErr w:type="spellStart"/>
+      <w:r>
+        <w:rPr>
+          <w:color w:val="00B050"/>
+        </w:rPr>
+        <w:t>img</w:t>
+      </w:r>
+      <w:proofErr w:type="spellEnd"/>
+      <w:r>
+        <w:rPr>
+          <w:color w:val="00B050"/>
+        </w:rPr>
+        <w:t xml:space="preserve"> file you extracted.</w:t>
+      </w:r>
+    </w:p>
+    <w:p>
+      <w:pPr>
+        <w:numPr>
+          <w:ilvl w:val="0"/>
+          <w:numId w:val="10"/>
+        </w:numPr>
+        <w:rPr>
+          <w:color w:val="00B050"/>
+        </w:rPr>
+      </w:pPr>
+      <w:r>
+        <w:rPr>
+          <w:color w:val="00B050"/>
+        </w:rPr>
+        <w:t>Set the "File system" to FAT32 and leave the "Cluster size" on default.</w:t>
+      </w:r>
+    </w:p>
+    <w:p>
+      <w:pPr>
+        <w:numPr>
+          <w:ilvl w:val="0"/>
+          <w:numId w:val="10"/>
+        </w:numPr>
+        <w:rPr>
+          <w:color w:val="FF0000"/>
+        </w:rPr>
+      </w:pPr>
+      <w:r>
+        <w:rPr>
+          <w:color w:val="FF0000"/>
+        </w:rPr>
+        <w:t>Optionally, name your Pi-Star card under "New volume label".</w:t>
+      </w:r>
+    </w:p>
+    <w:p>
+      <w:pPr>
+        <w:numPr>
+          <w:ilvl w:val="0"/>
+          <w:numId w:val="10"/>
+        </w:numPr>
+      </w:pPr>
+      <w:r>
+        <w:lastRenderedPageBreak/>
+        <w:drawing>
+          <wp:inline distT="0" distB="0" distL="0" distR="0" wp14:anchorId="332A7BDF" wp14:editId="235E107D">
+            <wp:extent cx="4438878" cy="6121715"/>
+            <wp:effectExtent l="0" t="0" r="0" b="0"/>
+            <wp:docPr id="1738485448" name="Picture 1" descr="A screenshot of a computer&#10;&#10;AI-generated content may be incorrect."/>
+            <wp:cNvGraphicFramePr>
+              <a:graphicFrameLocks xmlns:a="http://schemas.openxmlformats.org/drawingml/2006/main" noChangeAspect="1"/>
+            </wp:cNvGraphicFramePr>
+            <a:graphic xmlns:a="http://schemas.openxmlformats.org/drawingml/2006/main">
+              <a:graphicData uri="http://schemas.openxmlformats.org/drawingml/2006/picture">
+                <pic:pic xmlns:pic="http://schemas.openxmlformats.org/drawingml/2006/picture">
+                  <pic:nvPicPr>
+                    <pic:cNvPr id="1738485448" name="Picture 1" descr="A screenshot of a computer&#10;&#10;AI-generated content may be incorrect."/>
+                    <pic:cNvPicPr/>
+                  </pic:nvPicPr>
+                  <pic:blipFill>
+                    <a:blip r:embed="rId15"/>
+                    <a:stretch>
+                      <a:fillRect/>
+                    </a:stretch>
+                  </pic:blipFill>
+                  <pic:spPr>
+                    <a:xfrm>
+                      <a:off x="0" y="0"/>
+                      <a:ext cx="4438878" cy="6121715"/>
+                    </a:xfrm>
+                    <a:prstGeom prst="rect">
+                      <a:avLst/>
+                    </a:prstGeom>
+                  </pic:spPr>
+                </pic:pic>
+              </a:graphicData>
+            </a:graphic>
+          </wp:inline>
+        </w:drawing>
+      </w:r>
+    </w:p>
+    <w:p>
+      <w:r>
+        <w:rPr>
+          <w:b/>
+          <w:bCs/>
+        </w:rPr>
+        <w:t xml:space="preserve">5. </w:t>
+      </w:r>
+      <w:r>
+        <w:rPr>
+          <w:b/>
+          <w:bCs/>
+          <w:color w:val="00B050"/>
+        </w:rPr>
+        <w:t>Start Flashing</w:t>
+      </w:r>
+      <w:r>
+        <w:t xml:space="preserve">: Click "Start" in Rufus. Confirm you're okay with erasing the MicroSD card's data and wait for the flashing process to complete. </w:t>
+      </w:r>
+      <w:r>
+        <w:rPr>
+          <w:color w:val="00B050"/>
+        </w:rPr>
+        <w:t>Close Rufus and eject the MicroSD card safely.</w:t>
+      </w:r>
+    </w:p>
+    <w:p/>
+    <w:p/>
+    <w:p>
+      <w:r>
+        <w:t>===========================================================</w:t>
+      </w:r>
+    </w:p>
+    <w:p/>
+    <w:p>
+      <w:r>
+        <w:lastRenderedPageBreak/>
+        <w:t>Remember, all you need to do, is download the zipped version of the image</w:t>
+      </w:r>
+      <w:r>
+        <w:br/>
+        <w:t xml:space="preserve">that is most suitable for your Pi / Single Board Computer, Unzip the </w:t>
+      </w:r>
+      <w:r>
+        <w:br/>
+        <w:t xml:space="preserve">download, and then flash the image to your SD card (using your </w:t>
+      </w:r>
+      <w:proofErr w:type="spellStart"/>
+      <w:r>
+        <w:t>prefered</w:t>
+      </w:r>
+      <w:proofErr w:type="spellEnd"/>
+      <w:r>
+        <w:br/>
+        <w:t>image writing tool - see links below for some basic instructions), boot the</w:t>
+      </w:r>
+      <w:r>
+        <w:br/>
+        <w:t>Pi, wait 30-40 secs and then login to the admin portal in order to finish</w:t>
+      </w:r>
+      <w:r>
+        <w:br/>
+        <w:t>the setup your Pi-Star.</w:t>
+      </w:r>
+      <w:r>
+        <w:br/>
+      </w:r>
+      <w:r>
+        <w:br/>
+        <w:t xml:space="preserve">here: </w:t>
+      </w:r>
+      <w:hyperlink r:id="rId16" w:history="1">
+        <w:r>
+          <w:rPr>
+            <w:rStyle w:val="Hyperlink"/>
+          </w:rPr>
+          <w:t>http://pi-star/admin/</w:t>
+        </w:r>
+      </w:hyperlink>
+      <w:r>
+        <w:br/>
+      </w:r>
+      <w:r>
+        <w:br/>
+        <w:t>Default Username: pi-star</w:t>
+      </w:r>
+      <w:r>
+        <w:br/>
+        <w:t>Default Password: raspberry</w:t>
+      </w:r>
+      <w:r>
+        <w:br/>
+      </w:r>
+      <w:r>
+        <w:br/>
+        <w:t xml:space="preserve">For help getting started, see this *EXCELLENT* video by Craig (W1MSG): </w:t>
+      </w:r>
+      <w:hyperlink r:id="rId17" w:history="1">
+        <w:r>
+          <w:rPr>
+            <w:rStyle w:val="Hyperlink"/>
+          </w:rPr>
+          <w:t>Here</w:t>
+        </w:r>
+      </w:hyperlink>
+    </w:p>
+    <w:p/>
+    <w:p/>
     <w:p/>
     <w:sectPr>
       <w:pgSz w:w="12240" w:h="15840"/>
@@ -1115,6 +3070,155 @@
     </w:lvl>
   </w:abstractNum>
   <w:abstractNum w:abstractNumId="3" w15:restartNumberingAfterBreak="0">
+    <w:nsid w:val="21A31948"/>
+    <w:multiLevelType w:val="multilevel"/>
+    <w:tmpl w:val="08FE4D0E"/>
+    <w:lvl w:ilvl="0">
+      <w:start w:val="1"/>
+      <w:numFmt w:val="bullet"/>
+      <w:lvlText w:val=""/>
+      <w:lvlJc w:val="left"/>
+      <w:pPr>
+        <w:tabs>
+          <w:tab w:val="num" w:pos="720"/>
+        </w:tabs>
+        <w:ind w:left="720" w:hanging="360"/>
+      </w:pPr>
+      <w:rPr>
+        <w:rFonts w:ascii="Symbol" w:hAnsi="Symbol" w:hint="default"/>
+        <w:sz w:val="20"/>
+      </w:rPr>
+    </w:lvl>
+    <w:lvl w:ilvl="1" w:tentative="1">
+      <w:start w:val="1"/>
+      <w:numFmt w:val="bullet"/>
+      <w:lvlText w:val=""/>
+      <w:lvlJc w:val="left"/>
+      <w:pPr>
+        <w:tabs>
+          <w:tab w:val="num" w:pos="1440"/>
+        </w:tabs>
+        <w:ind w:left="1440" w:hanging="360"/>
+      </w:pPr>
+      <w:rPr>
+        <w:rFonts w:ascii="Symbol" w:hAnsi="Symbol" w:hint="default"/>
+        <w:sz w:val="20"/>
+      </w:rPr>
+    </w:lvl>
+    <w:lvl w:ilvl="2" w:tentative="1">
+      <w:start w:val="1"/>
+      <w:numFmt w:val="bullet"/>
+      <w:lvlText w:val=""/>
+      <w:lvlJc w:val="left"/>
+      <w:pPr>
+        <w:tabs>
+          <w:tab w:val="num" w:pos="2160"/>
+        </w:tabs>
+        <w:ind w:left="2160" w:hanging="360"/>
+      </w:pPr>
+      <w:rPr>
+        <w:rFonts w:ascii="Symbol" w:hAnsi="Symbol" w:hint="default"/>
+        <w:sz w:val="20"/>
+      </w:rPr>
+    </w:lvl>
+    <w:lvl w:ilvl="3" w:tentative="1">
+      <w:start w:val="1"/>
+      <w:numFmt w:val="bullet"/>
+      <w:lvlText w:val=""/>
+      <w:lvlJc w:val="left"/>
+      <w:pPr>
+        <w:tabs>
+          <w:tab w:val="num" w:pos="2880"/>
+        </w:tabs>
+        <w:ind w:left="2880" w:hanging="360"/>
+      </w:pPr>
+      <w:rPr>
+        <w:rFonts w:ascii="Symbol" w:hAnsi="Symbol" w:hint="default"/>
+        <w:sz w:val="20"/>
+      </w:rPr>
+    </w:lvl>
+    <w:lvl w:ilvl="4" w:tentative="1">
+      <w:start w:val="1"/>
+      <w:numFmt w:val="bullet"/>
+      <w:lvlText w:val=""/>
+      <w:lvlJc w:val="left"/>
+      <w:pPr>
+        <w:tabs>
+          <w:tab w:val="num" w:pos="3600"/>
+        </w:tabs>
+        <w:ind w:left="3600" w:hanging="360"/>
+      </w:pPr>
+      <w:rPr>
+        <w:rFonts w:ascii="Symbol" w:hAnsi="Symbol" w:hint="default"/>
+        <w:sz w:val="20"/>
+      </w:rPr>
+    </w:lvl>
+    <w:lvl w:ilvl="5" w:tentative="1">
+      <w:start w:val="1"/>
+      <w:numFmt w:val="bullet"/>
+      <w:lvlText w:val=""/>
+      <w:lvlJc w:val="left"/>
+      <w:pPr>
+        <w:tabs>
+          <w:tab w:val="num" w:pos="4320"/>
+        </w:tabs>
+        <w:ind w:left="4320" w:hanging="360"/>
+      </w:pPr>
+      <w:rPr>
+        <w:rFonts w:ascii="Symbol" w:hAnsi="Symbol" w:hint="default"/>
+        <w:sz w:val="20"/>
+      </w:rPr>
+    </w:lvl>
+    <w:lvl w:ilvl="6" w:tentative="1">
+      <w:start w:val="1"/>
+      <w:numFmt w:val="bullet"/>
+      <w:lvlText w:val=""/>
+      <w:lvlJc w:val="left"/>
+      <w:pPr>
+        <w:tabs>
+          <w:tab w:val="num" w:pos="5040"/>
+        </w:tabs>
+        <w:ind w:left="5040" w:hanging="360"/>
+      </w:pPr>
+      <w:rPr>
+        <w:rFonts w:ascii="Symbol" w:hAnsi="Symbol" w:hint="default"/>
+        <w:sz w:val="20"/>
+      </w:rPr>
+    </w:lvl>
+    <w:lvl w:ilvl="7" w:tentative="1">
+      <w:start w:val="1"/>
+      <w:numFmt w:val="bullet"/>
+      <w:lvlText w:val=""/>
+      <w:lvlJc w:val="left"/>
+      <w:pPr>
+        <w:tabs>
+          <w:tab w:val="num" w:pos="5760"/>
+        </w:tabs>
+        <w:ind w:left="5760" w:hanging="360"/>
+      </w:pPr>
+      <w:rPr>
+        <w:rFonts w:ascii="Symbol" w:hAnsi="Symbol" w:hint="default"/>
+        <w:sz w:val="20"/>
+      </w:rPr>
+    </w:lvl>
+    <w:lvl w:ilvl="8" w:tentative="1">
+      <w:start w:val="1"/>
+      <w:numFmt w:val="bullet"/>
+      <w:lvlText w:val=""/>
+      <w:lvlJc w:val="left"/>
+      <w:pPr>
+        <w:tabs>
+          <w:tab w:val="num" w:pos="6480"/>
+        </w:tabs>
+        <w:ind w:left="6480" w:hanging="360"/>
+      </w:pPr>
+      <w:rPr>
+        <w:rFonts w:ascii="Symbol" w:hAnsi="Symbol" w:hint="default"/>
+        <w:sz w:val="20"/>
+      </w:rPr>
+    </w:lvl>
+  </w:abstractNum>
+  <w:abstractNum w:abstractNumId="4" w15:restartNumberingAfterBreak="0">
     <w:nsid w:val="2C0B4F3A"/>
     <w:multiLevelType w:val="multilevel"/>
     <w:tmpl w:val="481603D0"/>
@@ -1263,10 +3367,10 @@
       </w:rPr>
     </w:lvl>
   </w:abstractNum>
-  <w:abstractNum w:abstractNumId="4" w15:restartNumberingAfterBreak="0">
+  <w:abstractNum w:abstractNumId="5" w15:restartNumberingAfterBreak="0">
     <w:nsid w:val="42E16BF5"/>
     <w:multiLevelType w:val="multilevel"/>
-    <w:tmpl w:val="C742BB0E"/>
+    <w:tmpl w:val="7A04507A"/>
     <w:lvl w:ilvl="0">
       <w:start w:val="1"/>
       <w:numFmt w:val="bullet"/>
@@ -1283,20 +3387,17 @@
         <w:sz w:val="20"/>
       </w:rPr>
     </w:lvl>
-    <w:lvl w:ilvl="1" w:tentative="1">
-      <w:start w:val="1"/>
-      <w:numFmt w:val="bullet"/>
-      <w:lvlText w:val=""/>
-      <w:lvlJc w:val="left"/>
-      <w:pPr>
-        <w:tabs>
-          <w:tab w:val="num" w:pos="1440"/>
-        </w:tabs>
+    <w:lvl w:ilvl="1">
+      <w:start w:val="1"/>
+      <w:numFmt w:val="decimal"/>
+      <w:lvlText w:val="%2."/>
+      <w:lvlJc w:val="left"/>
+      <w:pPr>
         <w:ind w:left="1440" w:hanging="360"/>
       </w:pPr>
       <w:rPr>
-        <w:rFonts w:ascii="Symbol" w:hAnsi="Symbol" w:hint="default"/>
-        <w:sz w:val="20"/>
+        <w:rFonts w:hint="default"/>
+        <w:b/>
       </w:rPr>
     </w:lvl>
     <w:lvl w:ilvl="2" w:tentative="1">
@@ -1412,7 +3513,7 @@
       </w:rPr>
     </w:lvl>
   </w:abstractNum>
-  <w:abstractNum w:abstractNumId="5" w15:restartNumberingAfterBreak="0">
+  <w:abstractNum w:abstractNumId="6" w15:restartNumberingAfterBreak="0">
     <w:nsid w:val="48692A8A"/>
     <w:multiLevelType w:val="multilevel"/>
     <w:tmpl w:val="3264A654"/>
@@ -1561,23 +3662,482 @@
       </w:rPr>
     </w:lvl>
   </w:abstractNum>
+  <w:abstractNum w:abstractNumId="7" w15:restartNumberingAfterBreak="0">
+    <w:nsid w:val="5FF20ACE"/>
+    <w:multiLevelType w:val="multilevel"/>
+    <w:tmpl w:val="54300600"/>
+    <w:lvl w:ilvl="0">
+      <w:start w:val="1"/>
+      <w:numFmt w:val="bullet"/>
+      <w:lvlText w:val=""/>
+      <w:lvlJc w:val="left"/>
+      <w:pPr>
+        <w:tabs>
+          <w:tab w:val="num" w:pos="720"/>
+        </w:tabs>
+        <w:ind w:left="720" w:hanging="360"/>
+      </w:pPr>
+      <w:rPr>
+        <w:rFonts w:ascii="Wingdings" w:hAnsi="Wingdings" w:hint="default"/>
+        <w:sz w:val="20"/>
+      </w:rPr>
+    </w:lvl>
+    <w:lvl w:ilvl="1" w:tentative="1">
+      <w:start w:val="1"/>
+      <w:numFmt w:val="bullet"/>
+      <w:lvlText w:val=""/>
+      <w:lvlJc w:val="left"/>
+      <w:pPr>
+        <w:tabs>
+          <w:tab w:val="num" w:pos="1440"/>
+        </w:tabs>
+        <w:ind w:left="1440" w:hanging="360"/>
+      </w:pPr>
+      <w:rPr>
+        <w:rFonts w:ascii="Symbol" w:hAnsi="Symbol" w:hint="default"/>
+        <w:sz w:val="20"/>
+      </w:rPr>
+    </w:lvl>
+    <w:lvl w:ilvl="2" w:tentative="1">
+      <w:start w:val="1"/>
+      <w:numFmt w:val="bullet"/>
+      <w:lvlText w:val=""/>
+      <w:lvlJc w:val="left"/>
+      <w:pPr>
+        <w:tabs>
+          <w:tab w:val="num" w:pos="2160"/>
+        </w:tabs>
+        <w:ind w:left="2160" w:hanging="360"/>
+      </w:pPr>
+      <w:rPr>
+        <w:rFonts w:ascii="Symbol" w:hAnsi="Symbol" w:hint="default"/>
+        <w:sz w:val="20"/>
+      </w:rPr>
+    </w:lvl>
+    <w:lvl w:ilvl="3" w:tentative="1">
+      <w:start w:val="1"/>
+      <w:numFmt w:val="bullet"/>
+      <w:lvlText w:val=""/>
+      <w:lvlJc w:val="left"/>
+      <w:pPr>
+        <w:tabs>
+          <w:tab w:val="num" w:pos="2880"/>
+        </w:tabs>
+        <w:ind w:left="2880" w:hanging="360"/>
+      </w:pPr>
+      <w:rPr>
+        <w:rFonts w:ascii="Symbol" w:hAnsi="Symbol" w:hint="default"/>
+        <w:sz w:val="20"/>
+      </w:rPr>
+    </w:lvl>
+    <w:lvl w:ilvl="4" w:tentative="1">
+      <w:start w:val="1"/>
+      <w:numFmt w:val="bullet"/>
+      <w:lvlText w:val=""/>
+      <w:lvlJc w:val="left"/>
+      <w:pPr>
+        <w:tabs>
+          <w:tab w:val="num" w:pos="3600"/>
+        </w:tabs>
+        <w:ind w:left="3600" w:hanging="360"/>
+      </w:pPr>
+      <w:rPr>
+        <w:rFonts w:ascii="Symbol" w:hAnsi="Symbol" w:hint="default"/>
+        <w:sz w:val="20"/>
+      </w:rPr>
+    </w:lvl>
+    <w:lvl w:ilvl="5" w:tentative="1">
+      <w:start w:val="1"/>
+      <w:numFmt w:val="bullet"/>
+      <w:lvlText w:val=""/>
+      <w:lvlJc w:val="left"/>
+      <w:pPr>
+        <w:tabs>
+          <w:tab w:val="num" w:pos="4320"/>
+        </w:tabs>
+        <w:ind w:left="4320" w:hanging="360"/>
+      </w:pPr>
+      <w:rPr>
+        <w:rFonts w:ascii="Symbol" w:hAnsi="Symbol" w:hint="default"/>
+        <w:sz w:val="20"/>
+      </w:rPr>
+    </w:lvl>
+    <w:lvl w:ilvl="6" w:tentative="1">
+      <w:start w:val="1"/>
+      <w:numFmt w:val="bullet"/>
+      <w:lvlText w:val=""/>
+      <w:lvlJc w:val="left"/>
+      <w:pPr>
+        <w:tabs>
+          <w:tab w:val="num" w:pos="5040"/>
+        </w:tabs>
+        <w:ind w:left="5040" w:hanging="360"/>
+      </w:pPr>
+      <w:rPr>
+        <w:rFonts w:ascii="Symbol" w:hAnsi="Symbol" w:hint="default"/>
+        <w:sz w:val="20"/>
+      </w:rPr>
+    </w:lvl>
+    <w:lvl w:ilvl="7" w:tentative="1">
+      <w:start w:val="1"/>
+      <w:numFmt w:val="bullet"/>
+      <w:lvlText w:val=""/>
+      <w:lvlJc w:val="left"/>
+      <w:pPr>
+        <w:tabs>
+          <w:tab w:val="num" w:pos="5760"/>
+        </w:tabs>
+        <w:ind w:left="5760" w:hanging="360"/>
+      </w:pPr>
+      <w:rPr>
+        <w:rFonts w:ascii="Symbol" w:hAnsi="Symbol" w:hint="default"/>
+        <w:sz w:val="20"/>
+      </w:rPr>
+    </w:lvl>
+    <w:lvl w:ilvl="8" w:tentative="1">
+      <w:start w:val="1"/>
+      <w:numFmt w:val="bullet"/>
+      <w:lvlText w:val=""/>
+      <w:lvlJc w:val="left"/>
+      <w:pPr>
+        <w:tabs>
+          <w:tab w:val="num" w:pos="6480"/>
+        </w:tabs>
+        <w:ind w:left="6480" w:hanging="360"/>
+      </w:pPr>
+      <w:rPr>
+        <w:rFonts w:ascii="Symbol" w:hAnsi="Symbol" w:hint="default"/>
+        <w:sz w:val="20"/>
+      </w:rPr>
+    </w:lvl>
+  </w:abstractNum>
+  <w:abstractNum w:abstractNumId="8" w15:restartNumberingAfterBreak="0">
+    <w:nsid w:val="607D6EE7"/>
+    <w:multiLevelType w:val="multilevel"/>
+    <w:tmpl w:val="A600C958"/>
+    <w:lvl w:ilvl="0">
+      <w:start w:val="1"/>
+      <w:numFmt w:val="bullet"/>
+      <w:lvlText w:val=""/>
+      <w:lvlJc w:val="left"/>
+      <w:pPr>
+        <w:tabs>
+          <w:tab w:val="num" w:pos="720"/>
+        </w:tabs>
+        <w:ind w:left="720" w:hanging="360"/>
+      </w:pPr>
+      <w:rPr>
+        <w:rFonts w:ascii="Symbol" w:hAnsi="Symbol" w:hint="default"/>
+        <w:sz w:val="20"/>
+      </w:rPr>
+    </w:lvl>
+    <w:lvl w:ilvl="1">
+      <w:start w:val="1"/>
+      <w:numFmt w:val="bullet"/>
+      <w:lvlText w:val=""/>
+      <w:lvlJc w:val="left"/>
+      <w:pPr>
+        <w:tabs>
+          <w:tab w:val="num" w:pos="1440"/>
+        </w:tabs>
+        <w:ind w:left="1440" w:hanging="360"/>
+      </w:pPr>
+      <w:rPr>
+        <w:rFonts w:ascii="Symbol" w:hAnsi="Symbol" w:hint="default"/>
+        <w:sz w:val="20"/>
+      </w:rPr>
+    </w:lvl>
+    <w:lvl w:ilvl="2" w:tentative="1">
+      <w:start w:val="1"/>
+      <w:numFmt w:val="bullet"/>
+      <w:lvlText w:val=""/>
+      <w:lvlJc w:val="left"/>
+      <w:pPr>
+        <w:tabs>
+          <w:tab w:val="num" w:pos="2160"/>
+        </w:tabs>
+        <w:ind w:left="2160" w:hanging="360"/>
+      </w:pPr>
+      <w:rPr>
+        <w:rFonts w:ascii="Symbol" w:hAnsi="Symbol" w:hint="default"/>
+        <w:sz w:val="20"/>
+      </w:rPr>
+    </w:lvl>
+    <w:lvl w:ilvl="3" w:tentative="1">
+      <w:start w:val="1"/>
+      <w:numFmt w:val="bullet"/>
+      <w:lvlText w:val=""/>
+      <w:lvlJc w:val="left"/>
+      <w:pPr>
+        <w:tabs>
+          <w:tab w:val="num" w:pos="2880"/>
+        </w:tabs>
+        <w:ind w:left="2880" w:hanging="360"/>
+      </w:pPr>
+      <w:rPr>
+        <w:rFonts w:ascii="Symbol" w:hAnsi="Symbol" w:hint="default"/>
+        <w:sz w:val="20"/>
+      </w:rPr>
+    </w:lvl>
+    <w:lvl w:ilvl="4" w:tentative="1">
+      <w:start w:val="1"/>
+      <w:numFmt w:val="bullet"/>
+      <w:lvlText w:val=""/>
+      <w:lvlJc w:val="left"/>
+      <w:pPr>
+        <w:tabs>
+          <w:tab w:val="num" w:pos="3600"/>
+        </w:tabs>
+        <w:ind w:left="3600" w:hanging="360"/>
+      </w:pPr>
+      <w:rPr>
+        <w:rFonts w:ascii="Symbol" w:hAnsi="Symbol" w:hint="default"/>
+        <w:sz w:val="20"/>
+      </w:rPr>
+    </w:lvl>
+    <w:lvl w:ilvl="5" w:tentative="1">
+      <w:start w:val="1"/>
+      <w:numFmt w:val="bullet"/>
+      <w:lvlText w:val=""/>
+      <w:lvlJc w:val="left"/>
+      <w:pPr>
+        <w:tabs>
+          <w:tab w:val="num" w:pos="4320"/>
+        </w:tabs>
+        <w:ind w:left="4320" w:hanging="360"/>
+      </w:pPr>
+      <w:rPr>
+        <w:rFonts w:ascii="Symbol" w:hAnsi="Symbol" w:hint="default"/>
+        <w:sz w:val="20"/>
+      </w:rPr>
+    </w:lvl>
+    <w:lvl w:ilvl="6" w:tentative="1">
+      <w:start w:val="1"/>
+      <w:numFmt w:val="bullet"/>
+      <w:lvlText w:val=""/>
+      <w:lvlJc w:val="left"/>
+      <w:pPr>
+        <w:tabs>
+          <w:tab w:val="num" w:pos="5040"/>
+        </w:tabs>
+        <w:ind w:left="5040" w:hanging="360"/>
+      </w:pPr>
+      <w:rPr>
+        <w:rFonts w:ascii="Symbol" w:hAnsi="Symbol" w:hint="default"/>
+        <w:sz w:val="20"/>
+      </w:rPr>
+    </w:lvl>
+    <w:lvl w:ilvl="7" w:tentative="1">
+      <w:start w:val="1"/>
+      <w:numFmt w:val="bullet"/>
+      <w:lvlText w:val=""/>
+      <w:lvlJc w:val="left"/>
+      <w:pPr>
+        <w:tabs>
+          <w:tab w:val="num" w:pos="5760"/>
+        </w:tabs>
+        <w:ind w:left="5760" w:hanging="360"/>
+      </w:pPr>
+      <w:rPr>
+        <w:rFonts w:ascii="Symbol" w:hAnsi="Symbol" w:hint="default"/>
+        <w:sz w:val="20"/>
+      </w:rPr>
+    </w:lvl>
+    <w:lvl w:ilvl="8" w:tentative="1">
+      <w:start w:val="1"/>
+      <w:numFmt w:val="bullet"/>
+      <w:lvlText w:val=""/>
+      <w:lvlJc w:val="left"/>
+      <w:pPr>
+        <w:tabs>
+          <w:tab w:val="num" w:pos="6480"/>
+        </w:tabs>
+        <w:ind w:left="6480" w:hanging="360"/>
+      </w:pPr>
+      <w:rPr>
+        <w:rFonts w:ascii="Symbol" w:hAnsi="Symbol" w:hint="default"/>
+        <w:sz w:val="20"/>
+      </w:rPr>
+    </w:lvl>
+  </w:abstractNum>
+  <w:abstractNum w:abstractNumId="9" w15:restartNumberingAfterBreak="0">
+    <w:nsid w:val="6CE30487"/>
+    <w:multiLevelType w:val="multilevel"/>
+    <w:tmpl w:val="54300600"/>
+    <w:lvl w:ilvl="0">
+      <w:start w:val="1"/>
+      <w:numFmt w:val="bullet"/>
+      <w:lvlText w:val=""/>
+      <w:lvlJc w:val="left"/>
+      <w:pPr>
+        <w:tabs>
+          <w:tab w:val="num" w:pos="720"/>
+        </w:tabs>
+        <w:ind w:left="720" w:hanging="360"/>
+      </w:pPr>
+      <w:rPr>
+        <w:rFonts w:ascii="Wingdings" w:hAnsi="Wingdings" w:hint="default"/>
+        <w:sz w:val="20"/>
+      </w:rPr>
+    </w:lvl>
+    <w:lvl w:ilvl="1" w:tentative="1">
+      <w:start w:val="1"/>
+      <w:numFmt w:val="bullet"/>
+      <w:lvlText w:val=""/>
+      <w:lvlJc w:val="left"/>
+      <w:pPr>
+        <w:tabs>
+          <w:tab w:val="num" w:pos="1440"/>
+        </w:tabs>
+        <w:ind w:left="1440" w:hanging="360"/>
+      </w:pPr>
+      <w:rPr>
+        <w:rFonts w:ascii="Symbol" w:hAnsi="Symbol" w:hint="default"/>
+        <w:sz w:val="20"/>
+      </w:rPr>
+    </w:lvl>
+    <w:lvl w:ilvl="2" w:tentative="1">
+      <w:start w:val="1"/>
+      <w:numFmt w:val="bullet"/>
+      <w:lvlText w:val=""/>
+      <w:lvlJc w:val="left"/>
+      <w:pPr>
+        <w:tabs>
+          <w:tab w:val="num" w:pos="2160"/>
+        </w:tabs>
+        <w:ind w:left="2160" w:hanging="360"/>
+      </w:pPr>
+      <w:rPr>
+        <w:rFonts w:ascii="Symbol" w:hAnsi="Symbol" w:hint="default"/>
+        <w:sz w:val="20"/>
+      </w:rPr>
+    </w:lvl>
+    <w:lvl w:ilvl="3" w:tentative="1">
+      <w:start w:val="1"/>
+      <w:numFmt w:val="bullet"/>
+      <w:lvlText w:val=""/>
+      <w:lvlJc w:val="left"/>
+      <w:pPr>
+        <w:tabs>
+          <w:tab w:val="num" w:pos="2880"/>
+        </w:tabs>
+        <w:ind w:left="2880" w:hanging="360"/>
+      </w:pPr>
+      <w:rPr>
+        <w:rFonts w:ascii="Symbol" w:hAnsi="Symbol" w:hint="default"/>
+        <w:sz w:val="20"/>
+      </w:rPr>
+    </w:lvl>
+    <w:lvl w:ilvl="4" w:tentative="1">
+      <w:start w:val="1"/>
+      <w:numFmt w:val="bullet"/>
+      <w:lvlText w:val=""/>
+      <w:lvlJc w:val="left"/>
+      <w:pPr>
+        <w:tabs>
+          <w:tab w:val="num" w:pos="3600"/>
+        </w:tabs>
+        <w:ind w:left="3600" w:hanging="360"/>
+      </w:pPr>
+      <w:rPr>
+        <w:rFonts w:ascii="Symbol" w:hAnsi="Symbol" w:hint="default"/>
+        <w:sz w:val="20"/>
+      </w:rPr>
+    </w:lvl>
+    <w:lvl w:ilvl="5" w:tentative="1">
+      <w:start w:val="1"/>
+      <w:numFmt w:val="bullet"/>
+      <w:lvlText w:val=""/>
+      <w:lvlJc w:val="left"/>
+      <w:pPr>
+        <w:tabs>
+          <w:tab w:val="num" w:pos="4320"/>
+        </w:tabs>
+        <w:ind w:left="4320" w:hanging="360"/>
+      </w:pPr>
+      <w:rPr>
+        <w:rFonts w:ascii="Symbol" w:hAnsi="Symbol" w:hint="default"/>
+        <w:sz w:val="20"/>
+      </w:rPr>
+    </w:lvl>
+    <w:lvl w:ilvl="6" w:tentative="1">
+      <w:start w:val="1"/>
+      <w:numFmt w:val="bullet"/>
+      <w:lvlText w:val=""/>
+      <w:lvlJc w:val="left"/>
+      <w:pPr>
+        <w:tabs>
+          <w:tab w:val="num" w:pos="5040"/>
+        </w:tabs>
+        <w:ind w:left="5040" w:hanging="360"/>
+      </w:pPr>
+      <w:rPr>
+        <w:rFonts w:ascii="Symbol" w:hAnsi="Symbol" w:hint="default"/>
+        <w:sz w:val="20"/>
+      </w:rPr>
+    </w:lvl>
+    <w:lvl w:ilvl="7" w:tentative="1">
+      <w:start w:val="1"/>
+      <w:numFmt w:val="bullet"/>
+      <w:lvlText w:val=""/>
+      <w:lvlJc w:val="left"/>
+      <w:pPr>
+        <w:tabs>
+          <w:tab w:val="num" w:pos="5760"/>
+        </w:tabs>
+        <w:ind w:left="5760" w:hanging="360"/>
+      </w:pPr>
+      <w:rPr>
+        <w:rFonts w:ascii="Symbol" w:hAnsi="Symbol" w:hint="default"/>
+        <w:sz w:val="20"/>
+      </w:rPr>
+    </w:lvl>
+    <w:lvl w:ilvl="8" w:tentative="1">
+      <w:start w:val="1"/>
+      <w:numFmt w:val="bullet"/>
+      <w:lvlText w:val=""/>
+      <w:lvlJc w:val="left"/>
+      <w:pPr>
+        <w:tabs>
+          <w:tab w:val="num" w:pos="6480"/>
+        </w:tabs>
+        <w:ind w:left="6480" w:hanging="360"/>
+      </w:pPr>
+      <w:rPr>
+        <w:rFonts w:ascii="Symbol" w:hAnsi="Symbol" w:hint="default"/>
+        <w:sz w:val="20"/>
+      </w:rPr>
+    </w:lvl>
+  </w:abstractNum>
   <w:num w:numId="1" w16cid:durableId="1224100648">
-    <w:abstractNumId w:val="5"/>
+    <w:abstractNumId w:val="6"/>
   </w:num>
   <w:num w:numId="2" w16cid:durableId="462499139">
     <w:abstractNumId w:val="1"/>
   </w:num>
   <w:num w:numId="3" w16cid:durableId="1084182276">
-    <w:abstractNumId w:val="3"/>
+    <w:abstractNumId w:val="4"/>
   </w:num>
   <w:num w:numId="4" w16cid:durableId="1293175750">
     <w:abstractNumId w:val="2"/>
   </w:num>
   <w:num w:numId="5" w16cid:durableId="1385904858">
-    <w:abstractNumId w:val="4"/>
+    <w:abstractNumId w:val="5"/>
   </w:num>
   <w:num w:numId="6" w16cid:durableId="422070613">
     <w:abstractNumId w:val="0"/>
+  </w:num>
+  <w:num w:numId="7" w16cid:durableId="1072509075">
+    <w:abstractNumId w:val="7"/>
+  </w:num>
+  <w:num w:numId="8" w16cid:durableId="1033917594">
+    <w:abstractNumId w:val="9"/>
+  </w:num>
+  <w:num w:numId="9" w16cid:durableId="1983844424">
+    <w:abstractNumId w:val="8"/>
+  </w:num>
+  <w:num w:numId="10" w16cid:durableId="944072138">
+    <w:abstractNumId w:val="3"/>
   </w:num>
 </w:numbering>
 </file>
@@ -2185,7 +4745,6 @@
   <w:style w:type="character" w:default="1" w:styleId="DefaultParagraphFont">
     <w:name w:val="Default Paragraph Font"/>
     <w:uiPriority w:val="1"/>
-    <w:semiHidden/>
     <w:unhideWhenUsed/>
   </w:style>
   <w:style w:type="table" w:default="1" w:styleId="TableNormal">
@@ -2522,6 +5081,18 @@
       <w:shd w:val="clear" w:color="auto" w:fill="E1DFDD"/>
     </w:rPr>
   </w:style>
+  <w:style w:type="character" w:styleId="FollowedHyperlink">
+    <w:name w:val="FollowedHyperlink"/>
+    <w:basedOn w:val="DefaultParagraphFont"/>
+    <w:uiPriority w:val="99"/>
+    <w:semiHidden/>
+    <w:unhideWhenUsed/>
+    <w:rsid w:val="00845221"/>
+    <w:rPr>
+      <w:color w:val="96607D" w:themeColor="followedHyperlink"/>
+      <w:u w:val="single"/>
+    </w:rPr>
+  </w:style>
 </w:styles>
 </file>
 

</xml_diff>

<commit_message>
First Setup of JumboSpot Hotspot
</commit_message>
<xml_diff>
--- a/DIY_Hotspot/DIY_Hotspot_Project_Management.docx
+++ b/DIY_Hotspot/DIY_Hotspot_Project_Management.docx
@@ -97,25 +97,7 @@
           <w:iCs/>
           <w:strike/>
         </w:rPr>
-        <w:t xml:space="preserve">Check </w:t>
-      </w:r>
-      <w:proofErr w:type="spellStart"/>
-      <w:r>
-        <w:rPr>
-          <w:i/>
-          <w:iCs/>
-          <w:strike/>
-        </w:rPr>
-        <w:t>uSD</w:t>
-      </w:r>
-      <w:proofErr w:type="spellEnd"/>
-      <w:r>
-        <w:rPr>
-          <w:i/>
-          <w:iCs/>
-          <w:strike/>
-        </w:rPr>
-        <w:t xml:space="preserve"> Card Inventory </w:t>
+        <w:t xml:space="preserve">Check uSD Card Inventory </w:t>
       </w:r>
     </w:p>
     <w:p>
@@ -534,18 +516,10 @@
         <w:t xml:space="preserve"> </w:t>
       </w:r>
       <w:r>
-        <w:t>(Cost: $</w:t>
-      </w:r>
-      <w:proofErr w:type="gramStart"/>
-      <w:r>
-        <w:t xml:space="preserve">7) </w:t>
-      </w:r>
-      <w:r>
-        <w:t>—</w:t>
-      </w:r>
-      <w:proofErr w:type="gramEnd"/>
-      <w:r>
-        <w:t xml:space="preserve">&gt; </w:t>
+        <w:t xml:space="preserve">(Cost: $7) </w:t>
+      </w:r>
+      <w:r>
+        <w:t xml:space="preserve">—&gt; </w:t>
       </w:r>
       <w:r>
         <w:rPr>
@@ -575,31 +549,7 @@
           <w:szCs w:val="28"/>
           <w:u w:val="single"/>
         </w:rPr>
-        <w:t xml:space="preserve">Ordered and Received </w:t>
-      </w:r>
-      <w:proofErr w:type="gramStart"/>
-      <w:r>
-        <w:rPr>
-          <w:b/>
-          <w:bCs/>
-          <w:color w:val="00B050"/>
-          <w:sz w:val="28"/>
-          <w:szCs w:val="28"/>
-          <w:u w:val="single"/>
-        </w:rPr>
-        <w:t>From</w:t>
-      </w:r>
-      <w:proofErr w:type="gramEnd"/>
-      <w:r>
-        <w:rPr>
-          <w:b/>
-          <w:bCs/>
-          <w:color w:val="00B050"/>
-          <w:sz w:val="28"/>
-          <w:szCs w:val="28"/>
-          <w:u w:val="single"/>
-        </w:rPr>
-        <w:t xml:space="preserve"> Amazon</w:t>
+        <w:t>Ordered and Received From Amazon</w:t>
       </w:r>
     </w:p>
     <w:p>
@@ -614,7 +564,7 @@
         </w:rPr>
         <w:lastRenderedPageBreak/>
         <w:drawing>
-          <wp:inline distT="0" distB="0" distL="0" distR="0" wp14:anchorId="016F343B" wp14:editId="1E4A983F">
+          <wp:inline distT="0" distB="0" distL="0" distR="0" wp14:anchorId="016F343B" wp14:editId="7D2D9AFA">
             <wp:extent cx="4572000" cy="4267200"/>
             <wp:effectExtent l="0" t="0" r="0" b="0"/>
             <wp:docPr id="1432228605" name="Picture 4"/>
@@ -703,11 +653,7 @@
         </w:r>
       </w:hyperlink>
       <w:r>
-        <w:t>(Cost: $5</w:t>
-      </w:r>
-      <w:proofErr w:type="gramStart"/>
-      <w:r>
-        <w:t xml:space="preserve">)  </w:t>
+        <w:t xml:space="preserve">(Cost: $5)  </w:t>
       </w:r>
       <w:r>
         <w:rPr>
@@ -715,16 +661,7 @@
           <w:bCs/>
           <w:u w:val="single"/>
         </w:rPr>
-        <w:t>(</w:t>
-      </w:r>
-      <w:proofErr w:type="gramEnd"/>
-      <w:r>
-        <w:rPr>
-          <w:b/>
-          <w:bCs/>
-          <w:u w:val="single"/>
-        </w:rPr>
-        <w:t>Check Inventory)</w:t>
+        <w:t>(Check Inventory)</w:t>
       </w:r>
       <w:r>
         <w:rPr>
@@ -743,31 +680,7 @@
           <w:szCs w:val="28"/>
           <w:u w:val="single"/>
         </w:rPr>
-        <w:t xml:space="preserve">Ordered and Received </w:t>
-      </w:r>
-      <w:proofErr w:type="gramStart"/>
-      <w:r>
-        <w:rPr>
-          <w:b/>
-          <w:bCs/>
-          <w:color w:val="00B050"/>
-          <w:sz w:val="28"/>
-          <w:szCs w:val="28"/>
-          <w:u w:val="single"/>
-        </w:rPr>
-        <w:t>From</w:t>
-      </w:r>
-      <w:proofErr w:type="gramEnd"/>
-      <w:r>
-        <w:rPr>
-          <w:b/>
-          <w:bCs/>
-          <w:color w:val="00B050"/>
-          <w:sz w:val="28"/>
-          <w:szCs w:val="28"/>
-          <w:u w:val="single"/>
-        </w:rPr>
-        <w:t xml:space="preserve"> Amazon</w:t>
+        <w:t>Ordered and Received From Amazon</w:t>
       </w:r>
     </w:p>
     <w:p>
@@ -881,15 +794,7 @@
     </w:p>
     <w:p>
       <w:r>
-        <w:t>Predict</w:t>
-      </w:r>
-      <w:proofErr w:type="gramStart"/>
-      <w:r>
-        <w:t>:  $</w:t>
-      </w:r>
-      <w:proofErr w:type="gramEnd"/>
-      <w:r>
-        <w:t>55</w:t>
+        <w:t>Predict:  $55</w:t>
       </w:r>
     </w:p>
     <w:p>
@@ -927,15 +832,7 @@
         </w:numPr>
       </w:pPr>
       <w:r>
-        <w:t xml:space="preserve">Frequency Survey </w:t>
-      </w:r>
-      <w:proofErr w:type="gramStart"/>
-      <w:r>
-        <w:t>In</w:t>
-      </w:r>
-      <w:proofErr w:type="gramEnd"/>
-      <w:r>
-        <w:t xml:space="preserve"> Process</w:t>
+        <w:t>Frequency Survey In Process</w:t>
       </w:r>
     </w:p>
     <w:p>
@@ -980,23 +877,7 @@
     <w:p/>
     <w:p>
       <w:r>
-        <w:t xml:space="preserve">New </w:t>
-      </w:r>
-      <w:proofErr w:type="spellStart"/>
-      <w:r>
-        <w:t>uSD</w:t>
-      </w:r>
-      <w:proofErr w:type="spellEnd"/>
-      <w:r>
-        <w:t xml:space="preserve"> Card DS 2 dot </w:t>
-      </w:r>
-      <w:proofErr w:type="spellStart"/>
-      <w:r>
-        <w:t>Validrive</w:t>
-      </w:r>
-      <w:proofErr w:type="spellEnd"/>
-      <w:r>
-        <w:t xml:space="preserve"> Report </w:t>
+        <w:t xml:space="preserve">New uSD Card DS 2 dot Validrive Report </w:t>
       </w:r>
       <w:r>
         <w:rPr>
@@ -1067,15 +948,7 @@
           </w:tcPr>
           <w:p>
             <w:r>
-              <w:t> 4/21/</w:t>
-            </w:r>
-            <w:proofErr w:type="gramStart"/>
-            <w:r>
-              <w:t>2025  at</w:t>
-            </w:r>
-            <w:proofErr w:type="gramEnd"/>
-            <w:r>
-              <w:t>  2:47 PM</w:t>
+              <w:t> 4/21/2025  at  2:47 PM</w:t>
             </w:r>
           </w:p>
         </w:tc>
@@ -1260,13 +1133,8 @@
           </w:tcPr>
           <w:p>
             <w:r>
-              <w:t> </w:t>
+              <w:t> storage_device</w:t>
             </w:r>
-            <w:proofErr w:type="spellStart"/>
-            <w:r>
-              <w:t>storage_device</w:t>
-            </w:r>
-            <w:proofErr w:type="spellEnd"/>
           </w:p>
         </w:tc>
       </w:tr>
@@ -1983,6 +1851,9 @@
         </w:numPr>
       </w:pPr>
       <w:r>
+        <w:rPr>
+          <w:noProof/>
+        </w:rPr>
         <w:drawing>
           <wp:inline distT="0" distB="0" distL="0" distR="0" wp14:anchorId="563F10AA" wp14:editId="60D4BDCF">
             <wp:extent cx="4521432" cy="876345"/>
@@ -2061,21 +1932,8 @@
       </w:r>
     </w:p>
     <w:p>
-      <w:proofErr w:type="spellStart"/>
-      <w:r>
-        <w:t>CertUtil</w:t>
-      </w:r>
-      <w:proofErr w:type="spellEnd"/>
-      <w:r>
-        <w:t>: -</w:t>
-      </w:r>
-      <w:proofErr w:type="spellStart"/>
-      <w:r>
-        <w:t>hashfile</w:t>
-      </w:r>
-      <w:proofErr w:type="spellEnd"/>
-      <w:r>
-        <w:t xml:space="preserve"> command completed successfully.</w:t>
+      <w:r>
+        <w:t>CertUtil: -hashfile command completed successfully.</w:t>
       </w:r>
     </w:p>
     <w:p/>
@@ -2084,13 +1942,8 @@
         <w:t xml:space="preserve">Expected Value:  </w:t>
       </w:r>
       <w:r>
-        <w:t>4f3d947fc4d7e1c501fbaa19c2c</w:t>
-      </w:r>
-      <w:proofErr w:type="gramStart"/>
-      <w:r>
-        <w:t>85816  Pi-Star_RPi_V4.2.3_18-Apr-2025.img</w:t>
-      </w:r>
-      <w:proofErr w:type="gramEnd"/>
+        <w:t>4f3d947fc4d7e1c501fbaa19c2c85816  Pi-Star_RPi_V4.2.3_18-Apr-2025.img</w:t>
+      </w:r>
     </w:p>
     <w:p>
       <w:pPr>
@@ -2106,146 +1959,24 @@
           <w:bCs/>
           <w:color w:val="00B050"/>
         </w:rPr>
-        <w:t xml:space="preserve">Expected:   </w:t>
-      </w:r>
-      <w:r>
+        <w:t>Expected:   4f3d94 7fc4d7 e1c501 fbaa19 c2c85816</w:t>
+      </w:r>
+    </w:p>
+    <w:p>
+      <w:pPr>
         <w:rPr>
           <w:b/>
           <w:bCs/>
           <w:color w:val="00B050"/>
         </w:rPr>
-        <w:t>4f3d94</w:t>
-      </w:r>
+      </w:pPr>
       <w:r>
         <w:rPr>
           <w:b/>
           <w:bCs/>
           <w:color w:val="00B050"/>
         </w:rPr>
-        <w:t xml:space="preserve"> </w:t>
-      </w:r>
-      <w:r>
-        <w:rPr>
-          <w:b/>
-          <w:bCs/>
-          <w:color w:val="00B050"/>
-        </w:rPr>
-        <w:t>7fc4d7</w:t>
-      </w:r>
-      <w:r>
-        <w:rPr>
-          <w:b/>
-          <w:bCs/>
-          <w:color w:val="00B050"/>
-        </w:rPr>
-        <w:t xml:space="preserve"> </w:t>
-      </w:r>
-      <w:r>
-        <w:rPr>
-          <w:b/>
-          <w:bCs/>
-          <w:color w:val="00B050"/>
-        </w:rPr>
-        <w:t>e1c501</w:t>
-      </w:r>
-      <w:r>
-        <w:rPr>
-          <w:b/>
-          <w:bCs/>
-          <w:color w:val="00B050"/>
-        </w:rPr>
-        <w:t xml:space="preserve"> </w:t>
-      </w:r>
-      <w:r>
-        <w:rPr>
-          <w:b/>
-          <w:bCs/>
-          <w:color w:val="00B050"/>
-        </w:rPr>
-        <w:t>fbaa19</w:t>
-      </w:r>
-      <w:r>
-        <w:rPr>
-          <w:b/>
-          <w:bCs/>
-          <w:color w:val="00B050"/>
-        </w:rPr>
-        <w:t xml:space="preserve"> </w:t>
-      </w:r>
-      <w:r>
-        <w:rPr>
-          <w:b/>
-          <w:bCs/>
-          <w:color w:val="00B050"/>
-        </w:rPr>
-        <w:t>c2c85816</w:t>
-      </w:r>
-    </w:p>
-    <w:p>
-      <w:pPr>
-        <w:rPr>
-          <w:b/>
-          <w:bCs/>
-          <w:color w:val="00B050"/>
-        </w:rPr>
-      </w:pPr>
-      <w:proofErr w:type="gramStart"/>
-      <w:r>
-        <w:rPr>
-          <w:b/>
-          <w:bCs/>
-          <w:color w:val="00B050"/>
-        </w:rPr>
-        <w:t>Actual</w:t>
-      </w:r>
-      <w:proofErr w:type="gramEnd"/>
-      <w:r>
-        <w:rPr>
-          <w:b/>
-          <w:bCs/>
-          <w:color w:val="00B050"/>
-        </w:rPr>
-        <w:t xml:space="preserve">:         </w:t>
-      </w:r>
-      <w:r>
-        <w:rPr>
-          <w:b/>
-          <w:bCs/>
-          <w:color w:val="00B050"/>
-        </w:rPr>
-        <w:t>4f3d94</w:t>
-      </w:r>
-      <w:r>
-        <w:rPr>
-          <w:b/>
-          <w:bCs/>
-          <w:color w:val="00B050"/>
-        </w:rPr>
-        <w:t xml:space="preserve"> </w:t>
-      </w:r>
-      <w:r>
-        <w:rPr>
-          <w:b/>
-          <w:bCs/>
-          <w:color w:val="00B050"/>
-        </w:rPr>
-        <w:t>7fc4d7</w:t>
-      </w:r>
-      <w:r>
-        <w:rPr>
-          <w:b/>
-          <w:bCs/>
-          <w:color w:val="00B050"/>
-        </w:rPr>
-        <w:t xml:space="preserve"> </w:t>
-      </w:r>
-      <w:r>
-        <w:rPr>
-          <w:b/>
-          <w:bCs/>
-          <w:color w:val="00B050"/>
-        </w:rPr>
-        <w:t>e1c501</w:t>
+        <w:t>Actual:         4f3d94 7fc4d7 e1c501</w:t>
       </w:r>
       <w:r>
         <w:rPr>
@@ -2404,21 +2135,7 @@
         <w:rPr>
           <w:color w:val="00B050"/>
         </w:rPr>
-        <w:t>Click "Select" to choose the Pi-Star .</w:t>
-      </w:r>
-      <w:proofErr w:type="spellStart"/>
-      <w:r>
-        <w:rPr>
-          <w:color w:val="00B050"/>
-        </w:rPr>
-        <w:t>img</w:t>
-      </w:r>
-      <w:proofErr w:type="spellEnd"/>
-      <w:r>
-        <w:rPr>
-          <w:color w:val="00B050"/>
-        </w:rPr>
-        <w:t xml:space="preserve"> file you extracted.</w:t>
+        <w:t>Click "Select" to choose the Pi-Star .img file you extracted.</w:t>
       </w:r>
     </w:p>
     <w:p>
@@ -2463,6 +2180,9 @@
         </w:numPr>
       </w:pPr>
       <w:r>
+        <w:rPr>
+          <w:noProof/>
+        </w:rPr>
         <w:lastRenderedPageBreak/>
         <w:drawing>
           <wp:inline distT="0" distB="0" distL="0" distR="0" wp14:anchorId="332A7BDF" wp14:editId="235E107D">
@@ -2546,13 +2266,8 @@
       </w:r>
       <w:r>
         <w:br/>
-        <w:t xml:space="preserve">download, and then flash the image to your SD card (using your </w:t>
-      </w:r>
-      <w:proofErr w:type="spellStart"/>
-      <w:r>
-        <w:t>prefered</w:t>
-      </w:r>
-      <w:proofErr w:type="spellEnd"/>
+        <w:t>download, and then flash the image to your SD card (using your prefered</w:t>
+      </w:r>
       <w:r>
         <w:br/>
         <w:t>image writing tool - see links below for some basic instructions), boot the</w:t>
@@ -2609,7 +2324,2165 @@
     </w:p>
     <w:p/>
     <w:p/>
+    <w:p>
+      <w:r>
+        <w:br w:type="page"/>
+      </w:r>
+    </w:p>
+    <w:p>
+      <w:pPr>
+        <w:rPr>
+          <w:b/>
+          <w:bCs/>
+          <w:sz w:val="36"/>
+          <w:szCs w:val="36"/>
+          <w:u w:val="single"/>
+        </w:rPr>
+      </w:pPr>
+      <w:r>
+        <w:rPr>
+          <w:b/>
+          <w:bCs/>
+          <w:sz w:val="36"/>
+          <w:szCs w:val="36"/>
+          <w:u w:val="single"/>
+        </w:rPr>
+        <w:lastRenderedPageBreak/>
+        <w:t>04/28/25</w:t>
+      </w:r>
+    </w:p>
     <w:p/>
+    <w:p>
+      <w:pPr>
+        <w:rPr>
+          <w:b/>
+          <w:bCs/>
+          <w:color w:val="00B050"/>
+        </w:rPr>
+      </w:pPr>
+      <w:r>
+        <w:rPr>
+          <w:b/>
+          <w:bCs/>
+          <w:color w:val="00B050"/>
+        </w:rPr>
+        <w:t>Would not power on – Swapped to Cana Kit Power supply (Success)</w:t>
+      </w:r>
+    </w:p>
+    <w:p>
+      <w:pPr>
+        <w:rPr>
+          <w:b/>
+          <w:bCs/>
+          <w:color w:val="FF0000"/>
+        </w:rPr>
+      </w:pPr>
+      <w:r>
+        <w:rPr>
+          <w:b/>
+          <w:bCs/>
+          <w:color w:val="FF0000"/>
+        </w:rPr>
+        <w:t xml:space="preserve">Would not boot – Tried </w:t>
+      </w:r>
+      <w:r>
+        <w:rPr>
+          <w:b/>
+          <w:bCs/>
+          <w:color w:val="FF0000"/>
+        </w:rPr>
+        <w:t>Raspberry Pi OS – FAIL</w:t>
+      </w:r>
+    </w:p>
+    <w:p>
+      <w:pPr>
+        <w:rPr>
+          <w:b/>
+          <w:bCs/>
+          <w:color w:val="00B050"/>
+        </w:rPr>
+      </w:pPr>
+      <w:r>
+        <w:rPr>
+          <w:b/>
+          <w:bCs/>
+          <w:color w:val="00B050"/>
+        </w:rPr>
+        <w:t>Looks like the Rasp</w:t>
+      </w:r>
+      <w:r>
+        <w:rPr>
+          <w:b/>
+          <w:bCs/>
+          <w:color w:val="00B050"/>
+        </w:rPr>
+        <w:t>berry Pi Zero W (WH</w:t>
+      </w:r>
+      <w:r>
+        <w:rPr>
+          <w:b/>
+          <w:bCs/>
+          <w:color w:val="00B050"/>
+        </w:rPr>
+        <w:t>?) needs the legcy OS – Try That</w:t>
+      </w:r>
+      <w:r>
+        <w:rPr>
+          <w:b/>
+          <w:bCs/>
+          <w:color w:val="00B050"/>
+        </w:rPr>
+        <w:t xml:space="preserve"> (</w:t>
+      </w:r>
+      <w:r>
+        <w:rPr>
+          <w:b/>
+          <w:bCs/>
+          <w:color w:val="00B050"/>
+        </w:rPr>
+        <w:t>Success – Took a LONG time to be recognized on Wireless network)</w:t>
+      </w:r>
+    </w:p>
+    <w:p>
+      <w:pPr>
+        <w:pStyle w:val="ListParagraph"/>
+        <w:numPr>
+          <w:ilvl w:val="0"/>
+          <w:numId w:val="11"/>
+        </w:numPr>
+        <w:rPr>
+          <w:b/>
+          <w:bCs/>
+          <w:color w:val="00B050"/>
+        </w:rPr>
+      </w:pPr>
+      <w:r>
+        <w:rPr>
+          <w:b/>
+          <w:bCs/>
+          <w:color w:val="00B050"/>
+        </w:rPr>
+        <w:t>Successfully SSH’d in via Putty and ran OS updates</w:t>
+      </w:r>
+      <w:r>
+        <w:rPr>
+          <w:b/>
+          <w:bCs/>
+          <w:color w:val="00B050"/>
+        </w:rPr>
+        <w:t>.</w:t>
+      </w:r>
+    </w:p>
+    <w:p>
+      <w:pPr>
+        <w:pStyle w:val="ListParagraph"/>
+        <w:numPr>
+          <w:ilvl w:val="1"/>
+          <w:numId w:val="11"/>
+        </w:numPr>
+        <w:rPr>
+          <w:b/>
+          <w:bCs/>
+          <w:color w:val="00B050"/>
+        </w:rPr>
+      </w:pPr>
+      <w:r>
+        <w:rPr>
+          <w:b/>
+          <w:bCs/>
+          <w:color w:val="00B050"/>
+        </w:rPr>
+        <w:t>sudo apt-get update</w:t>
+      </w:r>
+    </w:p>
+    <w:p>
+      <w:pPr>
+        <w:pStyle w:val="ListParagraph"/>
+        <w:numPr>
+          <w:ilvl w:val="1"/>
+          <w:numId w:val="11"/>
+        </w:numPr>
+        <w:rPr>
+          <w:b/>
+          <w:bCs/>
+          <w:color w:val="00B050"/>
+        </w:rPr>
+      </w:pPr>
+      <w:r>
+        <w:rPr>
+          <w:b/>
+          <w:bCs/>
+          <w:color w:val="00B050"/>
+        </w:rPr>
+        <w:t>sudo apt-get upgrade</w:t>
+      </w:r>
+    </w:p>
+    <w:p>
+      <w:pPr>
+        <w:pStyle w:val="ListParagraph"/>
+        <w:numPr>
+          <w:ilvl w:val="1"/>
+          <w:numId w:val="11"/>
+        </w:numPr>
+        <w:rPr>
+          <w:b/>
+          <w:bCs/>
+          <w:color w:val="00B050"/>
+        </w:rPr>
+      </w:pPr>
+      <w:r>
+        <w:rPr>
+          <w:b/>
+          <w:bCs/>
+          <w:color w:val="00B050"/>
+        </w:rPr>
+        <w:t>sudo apt-get dist-upgrade</w:t>
+      </w:r>
+    </w:p>
+    <w:p>
+      <w:pPr>
+        <w:rPr>
+          <w:b/>
+          <w:bCs/>
+          <w:color w:val="00B050"/>
+        </w:rPr>
+      </w:pPr>
+    </w:p>
+    <w:p>
+      <w:pPr>
+        <w:rPr>
+          <w:b/>
+          <w:bCs/>
+          <w:color w:val="00B050"/>
+        </w:rPr>
+      </w:pPr>
+    </w:p>
+    <w:p>
+      <w:r>
+        <w:t>sudo apt-get update</w:t>
+      </w:r>
+    </w:p>
+    <w:p>
+      <w:r>
+        <w:t>sudo apt-get upgrade</w:t>
+      </w:r>
+    </w:p>
+    <w:p>
+      <w:r>
+        <w:t>sudo apt-get dist-upgrade</w:t>
+      </w:r>
+    </w:p>
+    <w:p>
+      <w:r>
+        <w:t>logout or exit</w:t>
+      </w:r>
+    </w:p>
+    <w:p>
+      <w:r>
+        <w:t>sudo reboot</w:t>
+      </w:r>
+    </w:p>
+    <w:p>
+      <w:r>
+        <w:t xml:space="preserve">sudo </w:t>
+      </w:r>
+      <w:r>
+        <w:t>shutdown -h now</w:t>
+      </w:r>
+    </w:p>
+    <w:p>
+      <w:pPr>
+        <w:rPr>
+          <w:b/>
+          <w:bCs/>
+          <w:color w:val="00B050"/>
+        </w:rPr>
+      </w:pPr>
+    </w:p>
+    <w:p>
+      <w:pPr>
+        <w:rPr>
+          <w:b/>
+          <w:bCs/>
+          <w:color w:val="00B050"/>
+        </w:rPr>
+      </w:pPr>
+    </w:p>
+    <w:p>
+      <w:pPr>
+        <w:rPr>
+          <w:b/>
+          <w:bCs/>
+          <w:color w:val="00B050"/>
+        </w:rPr>
+      </w:pPr>
+      <w:r>
+        <w:rPr>
+          <w:b/>
+          <w:bCs/>
+          <w:color w:val="00B050"/>
+        </w:rPr>
+        <w:br w:type="page"/>
+      </w:r>
+    </w:p>
+    <w:p>
+      <w:pPr>
+        <w:rPr>
+          <w:b/>
+          <w:bCs/>
+          <w:color w:val="00B050"/>
+        </w:rPr>
+      </w:pPr>
+      <w:r>
+        <w:rPr>
+          <w:b/>
+          <w:bCs/>
+          <w:noProof/>
+          <w:color w:val="00B050"/>
+        </w:rPr>
+        <w:lastRenderedPageBreak/>
+        <w:drawing>
+          <wp:inline distT="0" distB="0" distL="0" distR="0" wp14:anchorId="049B5D8E" wp14:editId="75838EA8">
+            <wp:extent cx="5943600" cy="3683635"/>
+            <wp:effectExtent l="0" t="0" r="0" b="0"/>
+            <wp:docPr id="1876721090" name="Picture 1" descr="A black wireless router with a white wire&#10;&#10;AI-generated content may be incorrect."/>
+            <wp:cNvGraphicFramePr>
+              <a:graphicFrameLocks xmlns:a="http://schemas.openxmlformats.org/drawingml/2006/main" noChangeAspect="1"/>
+            </wp:cNvGraphicFramePr>
+            <a:graphic xmlns:a="http://schemas.openxmlformats.org/drawingml/2006/main">
+              <a:graphicData uri="http://schemas.openxmlformats.org/drawingml/2006/picture">
+                <pic:pic xmlns:pic="http://schemas.openxmlformats.org/drawingml/2006/picture">
+                  <pic:nvPicPr>
+                    <pic:cNvPr id="1876721090" name="Picture 1" descr="A black wireless router with a white wire&#10;&#10;AI-generated content may be incorrect."/>
+                    <pic:cNvPicPr/>
+                  </pic:nvPicPr>
+                  <pic:blipFill>
+                    <a:blip r:embed="rId18"/>
+                    <a:stretch>
+                      <a:fillRect/>
+                    </a:stretch>
+                  </pic:blipFill>
+                  <pic:spPr>
+                    <a:xfrm>
+                      <a:off x="0" y="0"/>
+                      <a:ext cx="5943600" cy="3683635"/>
+                    </a:xfrm>
+                    <a:prstGeom prst="rect">
+                      <a:avLst/>
+                    </a:prstGeom>
+                  </pic:spPr>
+                </pic:pic>
+              </a:graphicData>
+            </a:graphic>
+          </wp:inline>
+        </w:drawing>
+      </w:r>
+    </w:p>
+    <w:p>
+      <w:pPr>
+        <w:rPr>
+          <w:b/>
+          <w:bCs/>
+          <w:color w:val="00B050"/>
+        </w:rPr>
+      </w:pPr>
+    </w:p>
+    <w:p>
+      <w:pPr>
+        <w:rPr>
+          <w:b/>
+          <w:bCs/>
+          <w:color w:val="00B050"/>
+        </w:rPr>
+      </w:pPr>
+    </w:p>
+    <w:p>
+      <w:pPr>
+        <w:rPr>
+          <w:b/>
+          <w:bCs/>
+          <w:color w:val="00B050"/>
+        </w:rPr>
+      </w:pPr>
+      <w:r>
+        <w:rPr>
+          <w:b/>
+          <w:bCs/>
+          <w:noProof/>
+          <w:color w:val="00B050"/>
+        </w:rPr>
+        <w:drawing>
+          <wp:inline distT="0" distB="0" distL="0" distR="0" wp14:anchorId="55F5BEEC" wp14:editId="7F3BF50D">
+            <wp:extent cx="5943600" cy="2482850"/>
+            <wp:effectExtent l="0" t="0" r="0" b="0"/>
+            <wp:docPr id="1697821184" name="Picture 1" descr="A screenshot of a computer&#10;&#10;AI-generated content may be incorrect."/>
+            <wp:cNvGraphicFramePr>
+              <a:graphicFrameLocks xmlns:a="http://schemas.openxmlformats.org/drawingml/2006/main" noChangeAspect="1"/>
+            </wp:cNvGraphicFramePr>
+            <a:graphic xmlns:a="http://schemas.openxmlformats.org/drawingml/2006/main">
+              <a:graphicData uri="http://schemas.openxmlformats.org/drawingml/2006/picture">
+                <pic:pic xmlns:pic="http://schemas.openxmlformats.org/drawingml/2006/picture">
+                  <pic:nvPicPr>
+                    <pic:cNvPr id="1697821184" name="Picture 1" descr="A screenshot of a computer&#10;&#10;AI-generated content may be incorrect."/>
+                    <pic:cNvPicPr/>
+                  </pic:nvPicPr>
+                  <pic:blipFill>
+                    <a:blip r:embed="rId19"/>
+                    <a:stretch>
+                      <a:fillRect/>
+                    </a:stretch>
+                  </pic:blipFill>
+                  <pic:spPr>
+                    <a:xfrm>
+                      <a:off x="0" y="0"/>
+                      <a:ext cx="5943600" cy="2482850"/>
+                    </a:xfrm>
+                    <a:prstGeom prst="rect">
+                      <a:avLst/>
+                    </a:prstGeom>
+                  </pic:spPr>
+                </pic:pic>
+              </a:graphicData>
+            </a:graphic>
+          </wp:inline>
+        </w:drawing>
+      </w:r>
+    </w:p>
+    <w:p>
+      <w:pPr>
+        <w:rPr>
+          <w:b/>
+          <w:bCs/>
+          <w:color w:val="00B050"/>
+        </w:rPr>
+      </w:pPr>
+    </w:p>
+    <w:p>
+      <w:pPr>
+        <w:rPr>
+          <w:b/>
+          <w:bCs/>
+        </w:rPr>
+      </w:pPr>
+      <w:r>
+        <w:rPr>
+          <w:b/>
+          <w:bCs/>
+        </w:rPr>
+        <w:lastRenderedPageBreak/>
+        <w:drawing>
+          <wp:inline distT="0" distB="0" distL="0" distR="0" wp14:anchorId="68DBAAB9" wp14:editId="2C16AE68">
+            <wp:extent cx="5943600" cy="4264660"/>
+            <wp:effectExtent l="0" t="0" r="0" b="2540"/>
+            <wp:docPr id="748863309" name="Picture 1"/>
+            <wp:cNvGraphicFramePr>
+              <a:graphicFrameLocks xmlns:a="http://schemas.openxmlformats.org/drawingml/2006/main" noChangeAspect="1"/>
+            </wp:cNvGraphicFramePr>
+            <a:graphic xmlns:a="http://schemas.openxmlformats.org/drawingml/2006/main">
+              <a:graphicData uri="http://schemas.openxmlformats.org/drawingml/2006/picture">
+                <pic:pic xmlns:pic="http://schemas.openxmlformats.org/drawingml/2006/picture">
+                  <pic:nvPicPr>
+                    <pic:cNvPr id="748863309" name=""/>
+                    <pic:cNvPicPr/>
+                  </pic:nvPicPr>
+                  <pic:blipFill>
+                    <a:blip r:embed="rId20"/>
+                    <a:stretch>
+                      <a:fillRect/>
+                    </a:stretch>
+                  </pic:blipFill>
+                  <pic:spPr>
+                    <a:xfrm>
+                      <a:off x="0" y="0"/>
+                      <a:ext cx="5943600" cy="4264660"/>
+                    </a:xfrm>
+                    <a:prstGeom prst="rect">
+                      <a:avLst/>
+                    </a:prstGeom>
+                  </pic:spPr>
+                </pic:pic>
+              </a:graphicData>
+            </a:graphic>
+          </wp:inline>
+        </w:drawing>
+      </w:r>
+      <w:r>
+        <w:rPr>
+          <w:b/>
+          <w:bCs/>
+        </w:rPr>
+        <w:br w:type="page"/>
+      </w:r>
+    </w:p>
+    <w:p>
+      <w:pPr>
+        <w:rPr>
+          <w:b/>
+          <w:bCs/>
+        </w:rPr>
+      </w:pPr>
+      <w:r>
+        <w:rPr>
+          <w:b/>
+          <w:bCs/>
+        </w:rPr>
+        <w:lastRenderedPageBreak/>
+        <w:t>Great — let’s do it!</w:t>
+      </w:r>
+      <w:r>
+        <w:rPr>
+          <w:b/>
+          <w:bCs/>
+        </w:rPr>
+        <w:br/>
+        <w:t>Setting up a JumboSpot MMDVM with Pi-Star for D-Star is a solid choice if you want your own compact hotspot. I’ll walk you through it step-by-step.</w:t>
+      </w:r>
+    </w:p>
+    <w:p>
+      <w:pPr>
+        <w:rPr>
+          <w:b/>
+          <w:bCs/>
+        </w:rPr>
+      </w:pPr>
+      <w:r>
+        <w:rPr>
+          <w:b/>
+          <w:bCs/>
+        </w:rPr>
+        <w:t xml:space="preserve">Here’s </w:t>
+      </w:r>
+      <w:proofErr w:type="gramStart"/>
+      <w:r>
+        <w:rPr>
+          <w:b/>
+          <w:bCs/>
+        </w:rPr>
+        <w:t>the overall plan</w:t>
+      </w:r>
+      <w:proofErr w:type="gramEnd"/>
+      <w:r>
+        <w:rPr>
+          <w:b/>
+          <w:bCs/>
+        </w:rPr>
+        <w:t>:</w:t>
+      </w:r>
+    </w:p>
+    <w:p>
+      <w:pPr>
+        <w:rPr>
+          <w:b/>
+          <w:bCs/>
+        </w:rPr>
+      </w:pPr>
+      <w:r>
+        <w:rPr>
+          <w:b/>
+          <w:bCs/>
+        </w:rPr>
+        <w:pict w14:anchorId="06AC3D18">
+          <v:rect id="_x0000_i1025" style="width:0;height:1.5pt" o:hralign="center" o:hrstd="t" o:hr="t" fillcolor="#a0a0a0" stroked="f"/>
+        </w:pict>
+      </w:r>
+    </w:p>
+    <w:p>
+      <w:pPr>
+        <w:rPr>
+          <w:b/>
+          <w:bCs/>
+        </w:rPr>
+      </w:pPr>
+      <w:r>
+        <w:rPr>
+          <w:rFonts w:ascii="Segoe UI Emoji" w:hAnsi="Segoe UI Emoji" w:cs="Segoe UI Emoji"/>
+          <w:b/>
+          <w:bCs/>
+        </w:rPr>
+        <w:t>🛠️</w:t>
+      </w:r>
+      <w:r>
+        <w:rPr>
+          <w:b/>
+          <w:bCs/>
+        </w:rPr>
+        <w:t xml:space="preserve"> What You’ll Need:</w:t>
+      </w:r>
+    </w:p>
+    <w:p>
+      <w:pPr>
+        <w:numPr>
+          <w:ilvl w:val="0"/>
+          <w:numId w:val="12"/>
+        </w:numPr>
+        <w:rPr>
+          <w:b/>
+          <w:bCs/>
+        </w:rPr>
+      </w:pPr>
+      <w:r>
+        <w:rPr>
+          <w:b/>
+          <w:bCs/>
+        </w:rPr>
+        <w:t>JumboSpot board (MMDVM board with onboard WiFi, usually single board)</w:t>
+      </w:r>
+    </w:p>
+    <w:p>
+      <w:pPr>
+        <w:numPr>
+          <w:ilvl w:val="0"/>
+          <w:numId w:val="12"/>
+        </w:numPr>
+        <w:rPr>
+          <w:b/>
+          <w:bCs/>
+        </w:rPr>
+      </w:pPr>
+      <w:r>
+        <w:rPr>
+          <w:b/>
+          <w:bCs/>
+        </w:rPr>
+        <w:t>Raspberry Pi Zero W (or Pi 3/4)</w:t>
+      </w:r>
+    </w:p>
+    <w:p>
+      <w:pPr>
+        <w:numPr>
+          <w:ilvl w:val="0"/>
+          <w:numId w:val="12"/>
+        </w:numPr>
+        <w:rPr>
+          <w:b/>
+          <w:bCs/>
+        </w:rPr>
+      </w:pPr>
+      <w:r>
+        <w:rPr>
+          <w:b/>
+          <w:bCs/>
+        </w:rPr>
+        <w:t>microSD card (at least 8 GB, preferably Class 10)</w:t>
+      </w:r>
+    </w:p>
+    <w:p>
+      <w:pPr>
+        <w:numPr>
+          <w:ilvl w:val="0"/>
+          <w:numId w:val="12"/>
+        </w:numPr>
+        <w:rPr>
+          <w:b/>
+          <w:bCs/>
+        </w:rPr>
+      </w:pPr>
+      <w:r>
+        <w:rPr>
+          <w:b/>
+          <w:bCs/>
+        </w:rPr>
+        <w:t>micro-USB cable and power source</w:t>
+      </w:r>
+    </w:p>
+    <w:p>
+      <w:pPr>
+        <w:numPr>
+          <w:ilvl w:val="0"/>
+          <w:numId w:val="12"/>
+        </w:numPr>
+        <w:rPr>
+          <w:b/>
+          <w:bCs/>
+        </w:rPr>
+      </w:pPr>
+      <w:r>
+        <w:rPr>
+          <w:b/>
+          <w:bCs/>
+        </w:rPr>
+        <w:t>Computer (Windows, Mac, Linux) with a **microSD card reader</w:t>
+      </w:r>
+    </w:p>
+    <w:p>
+      <w:pPr>
+        <w:numPr>
+          <w:ilvl w:val="0"/>
+          <w:numId w:val="12"/>
+        </w:numPr>
+        <w:rPr>
+          <w:b/>
+          <w:bCs/>
+        </w:rPr>
+      </w:pPr>
+      <w:r>
+        <w:rPr>
+          <w:b/>
+          <w:bCs/>
+        </w:rPr>
+        <w:t>DMR ID** (yes, you’ll need one even for D-Star registration)</w:t>
+      </w:r>
+    </w:p>
+    <w:p>
+      <w:pPr>
+        <w:numPr>
+          <w:ilvl w:val="0"/>
+          <w:numId w:val="12"/>
+        </w:numPr>
+        <w:rPr>
+          <w:b/>
+          <w:bCs/>
+        </w:rPr>
+      </w:pPr>
+      <w:r>
+        <w:rPr>
+          <w:b/>
+          <w:bCs/>
+        </w:rPr>
+        <w:t>Pi-Star image (</w:t>
+      </w:r>
+      <w:hyperlink r:id="rId21" w:history="1">
+        <w:r>
+          <w:rPr>
+            <w:rStyle w:val="Hyperlink"/>
+            <w:b/>
+            <w:bCs/>
+            <w:color w:val="auto"/>
+          </w:rPr>
+          <w:t>Download here</w:t>
+        </w:r>
+      </w:hyperlink>
+      <w:r>
+        <w:rPr>
+          <w:b/>
+          <w:bCs/>
+        </w:rPr>
+        <w:t>)</w:t>
+      </w:r>
+    </w:p>
+    <w:p>
+      <w:pPr>
+        <w:numPr>
+          <w:ilvl w:val="0"/>
+          <w:numId w:val="12"/>
+        </w:numPr>
+        <w:rPr>
+          <w:b/>
+          <w:bCs/>
+        </w:rPr>
+      </w:pPr>
+      <w:r>
+        <w:rPr>
+          <w:b/>
+          <w:bCs/>
+        </w:rPr>
+        <w:t>Software tools:</w:t>
+      </w:r>
+    </w:p>
+    <w:p>
+      <w:pPr>
+        <w:numPr>
+          <w:ilvl w:val="1"/>
+          <w:numId w:val="12"/>
+        </w:numPr>
+        <w:rPr>
+          <w:b/>
+          <w:bCs/>
+        </w:rPr>
+      </w:pPr>
+      <w:hyperlink r:id="rId22" w:history="1">
+        <w:r>
+          <w:rPr>
+            <w:rStyle w:val="Hyperlink"/>
+            <w:b/>
+            <w:bCs/>
+            <w:color w:val="auto"/>
+          </w:rPr>
+          <w:t>balenaEtcher</w:t>
+        </w:r>
+      </w:hyperlink>
+      <w:r>
+        <w:rPr>
+          <w:b/>
+          <w:bCs/>
+        </w:rPr>
+        <w:t xml:space="preserve"> (for flashing the SD card)</w:t>
+      </w:r>
+    </w:p>
+    <w:p>
+      <w:pPr>
+        <w:numPr>
+          <w:ilvl w:val="1"/>
+          <w:numId w:val="12"/>
+        </w:numPr>
+        <w:rPr>
+          <w:b/>
+          <w:bCs/>
+        </w:rPr>
+      </w:pPr>
+      <w:r>
+        <w:rPr>
+          <w:b/>
+          <w:bCs/>
+        </w:rPr>
+        <w:t>Optional: Advanced IP Scanner or your router’s admin page (to find the IP)</w:t>
+      </w:r>
+    </w:p>
+    <w:p>
+      <w:pPr>
+        <w:rPr>
+          <w:b/>
+          <w:bCs/>
+        </w:rPr>
+      </w:pPr>
+      <w:r>
+        <w:rPr>
+          <w:b/>
+          <w:bCs/>
+        </w:rPr>
+        <w:pict w14:anchorId="18B06756">
+          <v:rect id="_x0000_i1026" style="width:0;height:1.5pt" o:hralign="center" o:hrstd="t" o:hr="t" fillcolor="#a0a0a0" stroked="f"/>
+        </w:pict>
+      </w:r>
+    </w:p>
+    <w:p>
+      <w:pPr>
+        <w:rPr>
+          <w:b/>
+          <w:bCs/>
+        </w:rPr>
+      </w:pPr>
+      <w:r>
+        <w:rPr>
+          <w:rFonts w:ascii="Segoe UI Emoji" w:hAnsi="Segoe UI Emoji" w:cs="Segoe UI Emoji"/>
+          <w:b/>
+          <w:bCs/>
+        </w:rPr>
+        <w:t>📦</w:t>
+      </w:r>
+      <w:r>
+        <w:rPr>
+          <w:b/>
+          <w:bCs/>
+        </w:rPr>
+        <w:t xml:space="preserve"> Step 1: Flash Pi-Star to the SD Card</w:t>
+      </w:r>
+    </w:p>
+    <w:p>
+      <w:pPr>
+        <w:numPr>
+          <w:ilvl w:val="0"/>
+          <w:numId w:val="13"/>
+        </w:numPr>
+        <w:rPr>
+          <w:b/>
+          <w:bCs/>
+        </w:rPr>
+      </w:pPr>
+      <w:r>
+        <w:rPr>
+          <w:b/>
+          <w:bCs/>
+        </w:rPr>
+        <w:t>Download the correct Pi-Star image (probably "Pi-Star_RPi_V4.x.x_xx-Mar-202x.zip" for Raspberry Pi).</w:t>
+      </w:r>
+    </w:p>
+    <w:p>
+      <w:pPr>
+        <w:numPr>
+          <w:ilvl w:val="0"/>
+          <w:numId w:val="13"/>
+        </w:numPr>
+        <w:rPr>
+          <w:b/>
+          <w:bCs/>
+        </w:rPr>
+      </w:pPr>
+      <w:r>
+        <w:rPr>
+          <w:b/>
+          <w:bCs/>
+        </w:rPr>
+        <w:t>Use balenaEtcher to burn the .zip file directly to your microSD card.</w:t>
+      </w:r>
+    </w:p>
+    <w:p>
+      <w:pPr>
+        <w:numPr>
+          <w:ilvl w:val="1"/>
+          <w:numId w:val="13"/>
+        </w:numPr>
+        <w:rPr>
+          <w:b/>
+          <w:bCs/>
+        </w:rPr>
+      </w:pPr>
+      <w:r>
+        <w:rPr>
+          <w:b/>
+          <w:bCs/>
+        </w:rPr>
+        <w:t>You don't need to extract the zip file — Etcher can use it directly.</w:t>
+      </w:r>
+    </w:p>
+    <w:p>
+      <w:pPr>
+        <w:numPr>
+          <w:ilvl w:val="0"/>
+          <w:numId w:val="13"/>
+        </w:numPr>
+        <w:rPr>
+          <w:b/>
+          <w:bCs/>
+        </w:rPr>
+      </w:pPr>
+      <w:r>
+        <w:rPr>
+          <w:b/>
+          <w:bCs/>
+        </w:rPr>
+        <w:t>After Etcher says it's done, eject and reinsert the SD card.</w:t>
+      </w:r>
+      <w:r>
+        <w:rPr>
+          <w:b/>
+          <w:bCs/>
+        </w:rPr>
+        <w:br/>
+        <w:t>A small partition called boot should appear.</w:t>
+      </w:r>
+    </w:p>
+    <w:p>
+      <w:pPr>
+        <w:rPr>
+          <w:b/>
+          <w:bCs/>
+        </w:rPr>
+      </w:pPr>
+      <w:r>
+        <w:rPr>
+          <w:b/>
+          <w:bCs/>
+        </w:rPr>
+        <w:pict w14:anchorId="427908C3">
+          <v:rect id="_x0000_i1027" style="width:0;height:1.5pt" o:hralign="center" o:hrstd="t" o:hr="t" fillcolor="#a0a0a0" stroked="f"/>
+        </w:pict>
+      </w:r>
+    </w:p>
+    <w:p>
+      <w:pPr>
+        <w:rPr>
+          <w:b/>
+          <w:bCs/>
+        </w:rPr>
+      </w:pPr>
+      <w:r>
+        <w:rPr>
+          <w:rFonts w:ascii="Segoe UI Emoji" w:hAnsi="Segoe UI Emoji" w:cs="Segoe UI Emoji"/>
+          <w:b/>
+          <w:bCs/>
+        </w:rPr>
+        <w:t>🌐</w:t>
+      </w:r>
+      <w:r>
+        <w:rPr>
+          <w:b/>
+          <w:bCs/>
+        </w:rPr>
+        <w:t xml:space="preserve"> Step 2: Configure Wi-Fi (before you boot Pi-Star)</w:t>
+      </w:r>
+    </w:p>
+    <w:p>
+      <w:pPr>
+        <w:numPr>
+          <w:ilvl w:val="0"/>
+          <w:numId w:val="14"/>
+        </w:numPr>
+        <w:rPr>
+          <w:b/>
+          <w:bCs/>
+        </w:rPr>
+      </w:pPr>
+      <w:r>
+        <w:rPr>
+          <w:b/>
+          <w:bCs/>
+        </w:rPr>
+        <w:lastRenderedPageBreak/>
+        <w:t>In the boot partition of the SD card, create a file called wpa_supplicant.conf.</w:t>
+      </w:r>
+    </w:p>
+    <w:p>
+      <w:pPr>
+        <w:numPr>
+          <w:ilvl w:val="0"/>
+          <w:numId w:val="14"/>
+        </w:numPr>
+        <w:rPr>
+          <w:b/>
+          <w:bCs/>
+        </w:rPr>
+      </w:pPr>
+      <w:r>
+        <w:rPr>
+          <w:b/>
+          <w:bCs/>
+        </w:rPr>
+        <w:t>Open that file and paste in something like this:</w:t>
+      </w:r>
+    </w:p>
+    <w:p>
+      <w:pPr>
+        <w:rPr>
+          <w:b/>
+          <w:bCs/>
+        </w:rPr>
+      </w:pPr>
+      <w:r>
+        <w:rPr>
+          <w:b/>
+          <w:bCs/>
+        </w:rPr>
+        <w:t>country=US</w:t>
+      </w:r>
+    </w:p>
+    <w:p>
+      <w:pPr>
+        <w:rPr>
+          <w:b/>
+          <w:bCs/>
+        </w:rPr>
+      </w:pPr>
+      <w:r>
+        <w:rPr>
+          <w:b/>
+          <w:bCs/>
+        </w:rPr>
+        <w:t>ctrl_interface=DIR=/var/run/wpa_supplicant GROUP=netdev</w:t>
+      </w:r>
+    </w:p>
+    <w:p>
+      <w:pPr>
+        <w:rPr>
+          <w:b/>
+          <w:bCs/>
+        </w:rPr>
+      </w:pPr>
+      <w:r>
+        <w:rPr>
+          <w:b/>
+          <w:bCs/>
+        </w:rPr>
+        <w:t>update_config=1</w:t>
+      </w:r>
+    </w:p>
+    <w:p>
+      <w:pPr>
+        <w:rPr>
+          <w:b/>
+          <w:bCs/>
+        </w:rPr>
+      </w:pPr>
+    </w:p>
+    <w:p>
+      <w:pPr>
+        <w:rPr>
+          <w:b/>
+          <w:bCs/>
+        </w:rPr>
+      </w:pPr>
+      <w:r>
+        <w:rPr>
+          <w:b/>
+          <w:bCs/>
+        </w:rPr>
+        <w:t>network</w:t>
+      </w:r>
+      <w:proofErr w:type="gramStart"/>
+      <w:r>
+        <w:rPr>
+          <w:b/>
+          <w:bCs/>
+        </w:rPr>
+        <w:t>={</w:t>
+      </w:r>
+      <w:proofErr w:type="gramEnd"/>
+    </w:p>
+    <w:p>
+      <w:pPr>
+        <w:rPr>
+          <w:b/>
+          <w:bCs/>
+        </w:rPr>
+      </w:pPr>
+      <w:r>
+        <w:rPr>
+          <w:b/>
+          <w:bCs/>
+        </w:rPr>
+        <w:t xml:space="preserve">    ssid="YourWiFiNetworkName"</w:t>
+      </w:r>
+    </w:p>
+    <w:p>
+      <w:pPr>
+        <w:rPr>
+          <w:b/>
+          <w:bCs/>
+        </w:rPr>
+      </w:pPr>
+      <w:r>
+        <w:rPr>
+          <w:b/>
+          <w:bCs/>
+        </w:rPr>
+        <w:t xml:space="preserve">    psk="YourWiFiPassword"</w:t>
+      </w:r>
+    </w:p>
+    <w:p>
+      <w:pPr>
+        <w:rPr>
+          <w:b/>
+          <w:bCs/>
+        </w:rPr>
+      </w:pPr>
+      <w:r>
+        <w:rPr>
+          <w:b/>
+          <w:bCs/>
+        </w:rPr>
+        <w:t xml:space="preserve">    scan_ssid=1</w:t>
+      </w:r>
+    </w:p>
+    <w:p>
+      <w:pPr>
+        <w:rPr>
+          <w:b/>
+          <w:bCs/>
+        </w:rPr>
+      </w:pPr>
+      <w:r>
+        <w:rPr>
+          <w:b/>
+          <w:bCs/>
+        </w:rPr>
+        <w:t>}</w:t>
+      </w:r>
+    </w:p>
+    <w:p>
+      <w:pPr>
+        <w:rPr>
+          <w:b/>
+          <w:bCs/>
+        </w:rPr>
+      </w:pPr>
+      <w:r>
+        <w:rPr>
+          <w:b/>
+          <w:bCs/>
+        </w:rPr>
+        <w:t>(Change country=US to yours if needed.)</w:t>
+      </w:r>
+    </w:p>
+    <w:p>
+      <w:pPr>
+        <w:numPr>
+          <w:ilvl w:val="0"/>
+          <w:numId w:val="15"/>
+        </w:numPr>
+        <w:rPr>
+          <w:b/>
+          <w:bCs/>
+        </w:rPr>
+      </w:pPr>
+      <w:r>
+        <w:rPr>
+          <w:b/>
+          <w:bCs/>
+        </w:rPr>
+        <w:t>Save the file.</w:t>
+      </w:r>
+    </w:p>
+    <w:p>
+      <w:pPr>
+        <w:numPr>
+          <w:ilvl w:val="0"/>
+          <w:numId w:val="15"/>
+        </w:numPr>
+        <w:rPr>
+          <w:b/>
+          <w:bCs/>
+        </w:rPr>
+      </w:pPr>
+      <w:r>
+        <w:rPr>
+          <w:b/>
+          <w:bCs/>
+        </w:rPr>
+        <w:t>Safely eject the microSD card.</w:t>
+      </w:r>
+    </w:p>
+    <w:p>
+      <w:pPr>
+        <w:rPr>
+          <w:b/>
+          <w:bCs/>
+        </w:rPr>
+      </w:pPr>
+      <w:r>
+        <w:rPr>
+          <w:b/>
+          <w:bCs/>
+        </w:rPr>
+        <w:pict w14:anchorId="3851F55C">
+          <v:rect id="_x0000_i1028" style="width:0;height:1.5pt" o:hralign="center" o:hrstd="t" o:hr="t" fillcolor="#a0a0a0" stroked="f"/>
+        </w:pict>
+      </w:r>
+    </w:p>
+    <w:p>
+      <w:pPr>
+        <w:rPr>
+          <w:b/>
+          <w:bCs/>
+        </w:rPr>
+      </w:pPr>
+      <w:r>
+        <w:rPr>
+          <w:rFonts w:ascii="Segoe UI Emoji" w:hAnsi="Segoe UI Emoji" w:cs="Segoe UI Emoji"/>
+          <w:b/>
+          <w:bCs/>
+        </w:rPr>
+        <w:t>🔌</w:t>
+      </w:r>
+      <w:r>
+        <w:rPr>
+          <w:b/>
+          <w:bCs/>
+        </w:rPr>
+        <w:t xml:space="preserve"> Step 3: Assemble the Hardware</w:t>
+      </w:r>
+    </w:p>
+    <w:p>
+      <w:pPr>
+        <w:numPr>
+          <w:ilvl w:val="0"/>
+          <w:numId w:val="16"/>
+        </w:numPr>
+        <w:rPr>
+          <w:b/>
+          <w:bCs/>
+        </w:rPr>
+      </w:pPr>
+      <w:r>
+        <w:rPr>
+          <w:b/>
+          <w:bCs/>
+        </w:rPr>
+        <w:t>Mount the JumboSpot onto the Raspberry Pi (GPIO header).</w:t>
+      </w:r>
+    </w:p>
+    <w:p>
+      <w:pPr>
+        <w:numPr>
+          <w:ilvl w:val="0"/>
+          <w:numId w:val="16"/>
+        </w:numPr>
+        <w:rPr>
+          <w:b/>
+          <w:bCs/>
+        </w:rPr>
+      </w:pPr>
+      <w:r>
+        <w:rPr>
+          <w:b/>
+          <w:bCs/>
+        </w:rPr>
+        <w:t>Insert the microSD card.</w:t>
+      </w:r>
+    </w:p>
+    <w:p>
+      <w:pPr>
+        <w:numPr>
+          <w:ilvl w:val="0"/>
+          <w:numId w:val="16"/>
+        </w:numPr>
+        <w:rPr>
+          <w:b/>
+          <w:bCs/>
+        </w:rPr>
+      </w:pPr>
+      <w:r>
+        <w:rPr>
+          <w:b/>
+          <w:bCs/>
+        </w:rPr>
+        <w:t>Power it up with micro-USB power.</w:t>
+      </w:r>
+    </w:p>
+    <w:p>
+      <w:pPr>
+        <w:rPr>
+          <w:b/>
+          <w:bCs/>
+        </w:rPr>
+      </w:pPr>
+      <w:r>
+        <w:rPr>
+          <w:b/>
+          <w:bCs/>
+        </w:rPr>
+        <w:pict w14:anchorId="3B3EA011">
+          <v:rect id="_x0000_i1029" style="width:0;height:1.5pt" o:hralign="center" o:hrstd="t" o:hr="t" fillcolor="#a0a0a0" stroked="f"/>
+        </w:pict>
+      </w:r>
+    </w:p>
+    <w:p>
+      <w:pPr>
+        <w:rPr>
+          <w:b/>
+          <w:bCs/>
+        </w:rPr>
+      </w:pPr>
+      <w:r>
+        <w:rPr>
+          <w:rFonts w:ascii="Segoe UI Emoji" w:hAnsi="Segoe UI Emoji" w:cs="Segoe UI Emoji"/>
+          <w:b/>
+          <w:bCs/>
+        </w:rPr>
+        <w:t>🌍</w:t>
+      </w:r>
+      <w:r>
+        <w:rPr>
+          <w:b/>
+          <w:bCs/>
+        </w:rPr>
+        <w:t xml:space="preserve"> Step 4: Connect to Pi-Star</w:t>
+      </w:r>
+    </w:p>
+    <w:p>
+      <w:pPr>
+        <w:numPr>
+          <w:ilvl w:val="0"/>
+          <w:numId w:val="17"/>
+        </w:numPr>
+        <w:rPr>
+          <w:b/>
+          <w:bCs/>
+        </w:rPr>
+      </w:pPr>
+      <w:r>
+        <w:rPr>
+          <w:b/>
+          <w:bCs/>
+        </w:rPr>
+        <w:t>Wait about 2–3 minutes for Pi-Star to boot.</w:t>
+      </w:r>
+    </w:p>
+    <w:p>
+      <w:pPr>
+        <w:numPr>
+          <w:ilvl w:val="0"/>
+          <w:numId w:val="17"/>
+        </w:numPr>
+        <w:rPr>
+          <w:b/>
+          <w:bCs/>
+        </w:rPr>
+      </w:pPr>
+      <w:r>
+        <w:rPr>
+          <w:b/>
+          <w:bCs/>
+        </w:rPr>
+        <w:t>Find its IP address:</w:t>
+      </w:r>
+    </w:p>
+    <w:p>
+      <w:pPr>
+        <w:numPr>
+          <w:ilvl w:val="1"/>
+          <w:numId w:val="17"/>
+        </w:numPr>
+        <w:rPr>
+          <w:b/>
+          <w:bCs/>
+        </w:rPr>
+      </w:pPr>
+      <w:r>
+        <w:rPr>
+          <w:b/>
+          <w:bCs/>
+        </w:rPr>
+        <w:t>Check your router’s connected devices list.</w:t>
+      </w:r>
+    </w:p>
+    <w:p>
+      <w:pPr>
+        <w:numPr>
+          <w:ilvl w:val="1"/>
+          <w:numId w:val="17"/>
+        </w:numPr>
+        <w:rPr>
+          <w:b/>
+          <w:bCs/>
+        </w:rPr>
+      </w:pPr>
+      <w:r>
+        <w:rPr>
+          <w:b/>
+          <w:bCs/>
+        </w:rPr>
+        <w:t xml:space="preserve">Or use </w:t>
+      </w:r>
+      <w:hyperlink r:id="rId23" w:history="1">
+        <w:r>
+          <w:rPr>
+            <w:rStyle w:val="Hyperlink"/>
+            <w:b/>
+            <w:bCs/>
+            <w:color w:val="auto"/>
+          </w:rPr>
+          <w:t>http://pi-star.local/</w:t>
+        </w:r>
+      </w:hyperlink>
+      <w:r>
+        <w:rPr>
+          <w:b/>
+          <w:bCs/>
+        </w:rPr>
+        <w:t xml:space="preserve"> (works on most networks).</w:t>
+      </w:r>
+    </w:p>
+    <w:p>
+      <w:pPr>
+        <w:numPr>
+          <w:ilvl w:val="0"/>
+          <w:numId w:val="17"/>
+        </w:numPr>
+        <w:rPr>
+          <w:b/>
+          <w:bCs/>
+        </w:rPr>
+      </w:pPr>
+      <w:r>
+        <w:rPr>
+          <w:b/>
+          <w:bCs/>
+        </w:rPr>
+        <w:t>Open a web browser and go to that IP or http://pi-star.local/.</w:t>
+      </w:r>
+    </w:p>
+    <w:p>
+      <w:pPr>
+        <w:rPr>
+          <w:b/>
+          <w:bCs/>
+        </w:rPr>
+      </w:pPr>
+      <w:r>
+        <w:rPr>
+          <w:b/>
+          <w:bCs/>
+        </w:rPr>
+        <w:lastRenderedPageBreak/>
+        <w:pict w14:anchorId="6C8F7740">
+          <v:rect id="_x0000_i1030" style="width:0;height:1.5pt" o:hralign="center" o:hrstd="t" o:hr="t" fillcolor="#a0a0a0" stroked="f"/>
+        </w:pict>
+      </w:r>
+    </w:p>
+    <w:p>
+      <w:pPr>
+        <w:rPr>
+          <w:b/>
+          <w:bCs/>
+        </w:rPr>
+      </w:pPr>
+      <w:r>
+        <w:rPr>
+          <w:rFonts w:ascii="Segoe UI Emoji" w:hAnsi="Segoe UI Emoji" w:cs="Segoe UI Emoji"/>
+          <w:b/>
+          <w:bCs/>
+        </w:rPr>
+        <w:t>🔑</w:t>
+      </w:r>
+      <w:r>
+        <w:rPr>
+          <w:b/>
+          <w:bCs/>
+        </w:rPr>
+        <w:t xml:space="preserve"> Step 5: Basic Configuration</w:t>
+      </w:r>
+    </w:p>
+    <w:p>
+      <w:pPr>
+        <w:numPr>
+          <w:ilvl w:val="0"/>
+          <w:numId w:val="18"/>
+        </w:numPr>
+        <w:rPr>
+          <w:b/>
+          <w:bCs/>
+        </w:rPr>
+      </w:pPr>
+      <w:r>
+        <w:rPr>
+          <w:b/>
+          <w:bCs/>
+        </w:rPr>
+        <w:t>Username/Password:</w:t>
+      </w:r>
+      <w:r>
+        <w:rPr>
+          <w:b/>
+          <w:bCs/>
+        </w:rPr>
+        <w:br/>
+        <w:t>Default is pi-star / raspberry.</w:t>
+      </w:r>
+    </w:p>
+    <w:p>
+      <w:pPr>
+        <w:numPr>
+          <w:ilvl w:val="0"/>
+          <w:numId w:val="18"/>
+        </w:numPr>
+        <w:rPr>
+          <w:b/>
+          <w:bCs/>
+        </w:rPr>
+      </w:pPr>
+      <w:r>
+        <w:rPr>
+          <w:b/>
+          <w:bCs/>
+        </w:rPr>
+        <w:t>Go to Configuration page:</w:t>
+      </w:r>
+    </w:p>
+    <w:p>
+      <w:pPr>
+        <w:numPr>
+          <w:ilvl w:val="1"/>
+          <w:numId w:val="18"/>
+        </w:numPr>
+        <w:rPr>
+          <w:b/>
+          <w:bCs/>
+        </w:rPr>
+      </w:pPr>
+      <w:r>
+        <w:rPr>
+          <w:b/>
+          <w:bCs/>
+        </w:rPr>
+        <w:t>Set Callsign (your ham radio call)</w:t>
+      </w:r>
+    </w:p>
+    <w:p>
+      <w:pPr>
+        <w:numPr>
+          <w:ilvl w:val="1"/>
+          <w:numId w:val="18"/>
+        </w:numPr>
+        <w:rPr>
+          <w:b/>
+          <w:bCs/>
+        </w:rPr>
+      </w:pPr>
+      <w:r>
+        <w:rPr>
+          <w:b/>
+          <w:bCs/>
+        </w:rPr>
+        <w:t>Set DMR ID (needed for D-Star too)</w:t>
+      </w:r>
+    </w:p>
+    <w:p>
+      <w:pPr>
+        <w:numPr>
+          <w:ilvl w:val="1"/>
+          <w:numId w:val="18"/>
+        </w:numPr>
+        <w:rPr>
+          <w:b/>
+          <w:bCs/>
+        </w:rPr>
+      </w:pPr>
+      <w:r>
+        <w:rPr>
+          <w:b/>
+          <w:bCs/>
+        </w:rPr>
+        <w:t>Set Radio Frequency (check sticker on your JumboSpot; usually around 433.550 MHz for UHF models)</w:t>
+      </w:r>
+    </w:p>
+    <w:p>
+      <w:pPr>
+        <w:numPr>
+          <w:ilvl w:val="1"/>
+          <w:numId w:val="18"/>
+        </w:numPr>
+        <w:rPr>
+          <w:b/>
+          <w:bCs/>
+        </w:rPr>
+      </w:pPr>
+      <w:r>
+        <w:rPr>
+          <w:b/>
+          <w:bCs/>
+        </w:rPr>
+        <w:t>Set Mode: Enable only D-Star (disable DMR, P25, etc if you only want D-Star).</w:t>
+      </w:r>
+    </w:p>
+    <w:p>
+      <w:pPr>
+        <w:numPr>
+          <w:ilvl w:val="1"/>
+          <w:numId w:val="18"/>
+        </w:numPr>
+        <w:rPr>
+          <w:b/>
+          <w:bCs/>
+        </w:rPr>
+      </w:pPr>
+      <w:r>
+        <w:rPr>
+          <w:b/>
+          <w:bCs/>
+        </w:rPr>
+        <w:t>Choose your D-Star network (probably "REF" or "XRF" reflectors).</w:t>
+      </w:r>
+    </w:p>
+    <w:p>
+      <w:pPr>
+        <w:numPr>
+          <w:ilvl w:val="0"/>
+          <w:numId w:val="18"/>
+        </w:numPr>
+        <w:rPr>
+          <w:b/>
+          <w:bCs/>
+        </w:rPr>
+      </w:pPr>
+      <w:r>
+        <w:rPr>
+          <w:b/>
+          <w:bCs/>
+        </w:rPr>
+        <w:t>Apply Changes.</w:t>
+      </w:r>
+    </w:p>
+    <w:p>
+      <w:pPr>
+        <w:rPr>
+          <w:b/>
+          <w:bCs/>
+        </w:rPr>
+      </w:pPr>
+      <w:r>
+        <w:rPr>
+          <w:b/>
+          <w:bCs/>
+        </w:rPr>
+        <w:pict w14:anchorId="56DED29A">
+          <v:rect id="_x0000_i1031" style="width:0;height:1.5pt" o:hralign="center" o:hrstd="t" o:hr="t" fillcolor="#a0a0a0" stroked="f"/>
+        </w:pict>
+      </w:r>
+    </w:p>
+    <w:p>
+      <w:pPr>
+        <w:rPr>
+          <w:b/>
+          <w:bCs/>
+        </w:rPr>
+      </w:pPr>
+      <w:r>
+        <w:rPr>
+          <w:rFonts w:ascii="Segoe UI Emoji" w:hAnsi="Segoe UI Emoji" w:cs="Segoe UI Emoji"/>
+          <w:b/>
+          <w:bCs/>
+        </w:rPr>
+        <w:t>🛠️</w:t>
+      </w:r>
+      <w:r>
+        <w:rPr>
+          <w:b/>
+          <w:bCs/>
+        </w:rPr>
+        <w:t xml:space="preserve"> Step 6: Fine-Tuning</w:t>
+      </w:r>
+    </w:p>
+    <w:p>
+      <w:pPr>
+        <w:numPr>
+          <w:ilvl w:val="0"/>
+          <w:numId w:val="19"/>
+        </w:numPr>
+        <w:rPr>
+          <w:b/>
+          <w:bCs/>
+        </w:rPr>
+      </w:pPr>
+      <w:r>
+        <w:rPr>
+          <w:b/>
+          <w:bCs/>
+        </w:rPr>
+        <w:t>Configure D-Star Host settings:</w:t>
+      </w:r>
+    </w:p>
+    <w:p>
+      <w:pPr>
+        <w:numPr>
+          <w:ilvl w:val="1"/>
+          <w:numId w:val="19"/>
+        </w:numPr>
+        <w:rPr>
+          <w:b/>
+          <w:bCs/>
+        </w:rPr>
+      </w:pPr>
+      <w:r>
+        <w:rPr>
+          <w:b/>
+          <w:bCs/>
+        </w:rPr>
+        <w:t>Pick your preferred reflector (e.g., REF001C).</w:t>
+      </w:r>
+    </w:p>
+    <w:p>
+      <w:pPr>
+        <w:numPr>
+          <w:ilvl w:val="0"/>
+          <w:numId w:val="19"/>
+        </w:numPr>
+        <w:rPr>
+          <w:b/>
+          <w:bCs/>
+        </w:rPr>
+      </w:pPr>
+      <w:r>
+        <w:rPr>
+          <w:b/>
+          <w:bCs/>
+        </w:rPr>
+        <w:t>Set your radio (like an Icom or Kenwood HT) with:</w:t>
+      </w:r>
+    </w:p>
+    <w:p>
+      <w:pPr>
+        <w:numPr>
+          <w:ilvl w:val="1"/>
+          <w:numId w:val="19"/>
+        </w:numPr>
+        <w:rPr>
+          <w:b/>
+          <w:bCs/>
+        </w:rPr>
+      </w:pPr>
+      <w:r>
+        <w:rPr>
+          <w:b/>
+          <w:bCs/>
+        </w:rPr>
+        <w:t>Same frequency</w:t>
+      </w:r>
+    </w:p>
+    <w:p>
+      <w:pPr>
+        <w:numPr>
+          <w:ilvl w:val="1"/>
+          <w:numId w:val="19"/>
+        </w:numPr>
+        <w:rPr>
+          <w:b/>
+          <w:bCs/>
+        </w:rPr>
+      </w:pPr>
+      <w:r>
+        <w:rPr>
+          <w:b/>
+          <w:bCs/>
+        </w:rPr>
+        <w:t>Simplex, digital mode, RPT1 and RPT2 fields</w:t>
+      </w:r>
+    </w:p>
+    <w:p>
+      <w:pPr>
+        <w:numPr>
+          <w:ilvl w:val="1"/>
+          <w:numId w:val="19"/>
+        </w:numPr>
+        <w:rPr>
+          <w:b/>
+          <w:bCs/>
+        </w:rPr>
+      </w:pPr>
+      <w:r>
+        <w:rPr>
+          <w:b/>
+          <w:bCs/>
+        </w:rPr>
+        <w:t>Your Callsign in the correct places</w:t>
+      </w:r>
+    </w:p>
+    <w:p>
+      <w:pPr>
+        <w:rPr>
+          <w:b/>
+          <w:bCs/>
+        </w:rPr>
+      </w:pPr>
+      <w:r>
+        <w:rPr>
+          <w:b/>
+          <w:bCs/>
+        </w:rPr>
+        <w:pict w14:anchorId="3D423DA1">
+          <v:rect id="_x0000_i1032" style="width:0;height:1.5pt" o:hralign="center" o:hrstd="t" o:hr="t" fillcolor="#a0a0a0" stroked="f"/>
+        </w:pict>
+      </w:r>
+    </w:p>
+    <w:p>
+      <w:pPr>
+        <w:rPr>
+          <w:b/>
+          <w:bCs/>
+        </w:rPr>
+      </w:pPr>
+      <w:r>
+        <w:rPr>
+          <w:rFonts w:ascii="Segoe UI Emoji" w:hAnsi="Segoe UI Emoji" w:cs="Segoe UI Emoji"/>
+          <w:b/>
+          <w:bCs/>
+        </w:rPr>
+        <w:t>✅</w:t>
+      </w:r>
+      <w:r>
+        <w:rPr>
+          <w:b/>
+          <w:bCs/>
+        </w:rPr>
+        <w:t xml:space="preserve"> Step 7: Test It!</w:t>
+      </w:r>
+    </w:p>
+    <w:p>
+      <w:pPr>
+        <w:numPr>
+          <w:ilvl w:val="0"/>
+          <w:numId w:val="20"/>
+        </w:numPr>
+        <w:rPr>
+          <w:b/>
+          <w:bCs/>
+        </w:rPr>
+      </w:pPr>
+      <w:r>
+        <w:rPr>
+          <w:b/>
+          <w:bCs/>
+        </w:rPr>
+        <w:t>From your radio, key up on the JumboSpot frequency.</w:t>
+      </w:r>
+    </w:p>
+    <w:p>
+      <w:pPr>
+        <w:numPr>
+          <w:ilvl w:val="0"/>
+          <w:numId w:val="20"/>
+        </w:numPr>
+        <w:rPr>
+          <w:b/>
+          <w:bCs/>
+        </w:rPr>
+      </w:pPr>
+      <w:r>
+        <w:rPr>
+          <w:b/>
+          <w:bCs/>
+        </w:rPr>
+        <w:t xml:space="preserve">You should hear the JumboSpot </w:t>
+      </w:r>
+      <w:proofErr w:type="gramStart"/>
+      <w:r>
+        <w:rPr>
+          <w:b/>
+          <w:bCs/>
+        </w:rPr>
+        <w:t>respond</w:t>
+      </w:r>
+      <w:proofErr w:type="gramEnd"/>
+      <w:r>
+        <w:rPr>
+          <w:b/>
+          <w:bCs/>
+        </w:rPr>
+        <w:t>.</w:t>
+      </w:r>
+    </w:p>
+    <w:p>
+      <w:pPr>
+        <w:numPr>
+          <w:ilvl w:val="0"/>
+          <w:numId w:val="20"/>
+        </w:numPr>
+        <w:rPr>
+          <w:b/>
+          <w:bCs/>
+        </w:rPr>
+      </w:pPr>
+      <w:r>
+        <w:rPr>
+          <w:b/>
+          <w:bCs/>
+        </w:rPr>
+        <w:t>It should also show your transmission in Pi-Star's dashboard.</w:t>
+      </w:r>
+    </w:p>
+    <w:p>
+      <w:pPr>
+        <w:rPr>
+          <w:b/>
+          <w:bCs/>
+        </w:rPr>
+      </w:pPr>
+      <w:r>
+        <w:rPr>
+          <w:b/>
+          <w:bCs/>
+        </w:rPr>
+        <w:pict w14:anchorId="3143219B">
+          <v:rect id="_x0000_i1033" style="width:0;height:1.5pt" o:hralign="center" o:hrstd="t" o:hr="t" fillcolor="#a0a0a0" stroked="f"/>
+        </w:pict>
+      </w:r>
+    </w:p>
+    <w:p>
+      <w:pPr>
+        <w:rPr>
+          <w:b/>
+          <w:bCs/>
+        </w:rPr>
+      </w:pPr>
+      <w:r>
+        <w:rPr>
+          <w:rFonts w:ascii="Segoe UI Emoji" w:hAnsi="Segoe UI Emoji" w:cs="Segoe UI Emoji"/>
+          <w:b/>
+          <w:bCs/>
+        </w:rPr>
+        <w:lastRenderedPageBreak/>
+        <w:t>📋</w:t>
+      </w:r>
+      <w:r>
+        <w:rPr>
+          <w:b/>
+          <w:bCs/>
+        </w:rPr>
+        <w:t xml:space="preserve"> Tips:</w:t>
+      </w:r>
+    </w:p>
+    <w:p>
+      <w:pPr>
+        <w:numPr>
+          <w:ilvl w:val="0"/>
+          <w:numId w:val="21"/>
+        </w:numPr>
+        <w:rPr>
+          <w:b/>
+          <w:bCs/>
+        </w:rPr>
+      </w:pPr>
+      <w:r>
+        <w:rPr>
+          <w:b/>
+          <w:bCs/>
+        </w:rPr>
+        <w:t>Auto AP Mode: If it doesn't find Wi-Fi, Pi-Star will create its own Wi-Fi network ("Pi-Star-Setup"). You can connect directly to that from a laptop or phone.</w:t>
+      </w:r>
+    </w:p>
+    <w:p>
+      <w:pPr>
+        <w:numPr>
+          <w:ilvl w:val="0"/>
+          <w:numId w:val="21"/>
+        </w:numPr>
+        <w:rPr>
+          <w:b/>
+          <w:bCs/>
+        </w:rPr>
+      </w:pPr>
+      <w:r>
+        <w:rPr>
+          <w:b/>
+          <w:bCs/>
+        </w:rPr>
+        <w:t>Updates: Use "Update" and "Upgrade" from the Pi-Star dashboard regularly to keep things current.</w:t>
+      </w:r>
+    </w:p>
+    <w:p>
+      <w:pPr>
+        <w:numPr>
+          <w:ilvl w:val="0"/>
+          <w:numId w:val="21"/>
+        </w:numPr>
+        <w:rPr>
+          <w:b/>
+          <w:bCs/>
+        </w:rPr>
+      </w:pPr>
+      <w:r>
+        <w:rPr>
+          <w:b/>
+          <w:bCs/>
+        </w:rPr>
+        <w:t>Backup: After setting up, use Pi-Star’s backup feature so you can restore easily if needed.</w:t>
+      </w:r>
+    </w:p>
+    <w:p>
+      <w:pPr>
+        <w:rPr>
+          <w:b/>
+          <w:bCs/>
+        </w:rPr>
+      </w:pPr>
+      <w:r>
+        <w:rPr>
+          <w:b/>
+          <w:bCs/>
+        </w:rPr>
+        <w:pict w14:anchorId="776D0229">
+          <v:rect id="_x0000_i1034" style="width:0;height:1.5pt" o:hralign="center" o:hrstd="t" o:hr="t" fillcolor="#a0a0a0" stroked="f"/>
+        </w:pict>
+      </w:r>
+    </w:p>
+    <w:p>
+      <w:pPr>
+        <w:rPr>
+          <w:b/>
+          <w:bCs/>
+        </w:rPr>
+      </w:pPr>
+      <w:r>
+        <w:rPr>
+          <w:b/>
+          <w:bCs/>
+        </w:rPr>
+        <w:t>Would you like me to also help you with:</w:t>
+      </w:r>
+    </w:p>
+    <w:p>
+      <w:pPr>
+        <w:numPr>
+          <w:ilvl w:val="0"/>
+          <w:numId w:val="22"/>
+        </w:numPr>
+        <w:rPr>
+          <w:b/>
+          <w:bCs/>
+        </w:rPr>
+      </w:pPr>
+      <w:r>
+        <w:rPr>
+          <w:b/>
+          <w:bCs/>
+        </w:rPr>
+        <w:t>D-Star radio settings? (e.g., setting up RPT1/RPT2 properly)</w:t>
+      </w:r>
+    </w:p>
+    <w:p>
+      <w:pPr>
+        <w:numPr>
+          <w:ilvl w:val="0"/>
+          <w:numId w:val="22"/>
+        </w:numPr>
+        <w:rPr>
+          <w:b/>
+          <w:bCs/>
+        </w:rPr>
+      </w:pPr>
+      <w:r>
+        <w:rPr>
+          <w:b/>
+          <w:bCs/>
+        </w:rPr>
+        <w:t xml:space="preserve">How </w:t>
+      </w:r>
+      <w:proofErr w:type="gramStart"/>
+      <w:r>
+        <w:rPr>
+          <w:b/>
+          <w:bCs/>
+        </w:rPr>
+        <w:t>to</w:t>
+      </w:r>
+      <w:proofErr w:type="gramEnd"/>
+      <w:r>
+        <w:rPr>
+          <w:b/>
+          <w:bCs/>
+        </w:rPr>
+        <w:t xml:space="preserve"> register for D-Star if you haven’t already? (needed for linking)</w:t>
+      </w:r>
+    </w:p>
+    <w:p>
+      <w:pPr>
+        <w:numPr>
+          <w:ilvl w:val="0"/>
+          <w:numId w:val="22"/>
+        </w:numPr>
+        <w:rPr>
+          <w:b/>
+          <w:bCs/>
+        </w:rPr>
+      </w:pPr>
+      <w:r>
+        <w:rPr>
+          <w:b/>
+          <w:bCs/>
+        </w:rPr>
+        <w:t xml:space="preserve">Diagram of how everything </w:t>
+      </w:r>
+      <w:proofErr w:type="gramStart"/>
+      <w:r>
+        <w:rPr>
+          <w:b/>
+          <w:bCs/>
+        </w:rPr>
+        <w:t>connects?</w:t>
+      </w:r>
+      <w:proofErr w:type="gramEnd"/>
+    </w:p>
+    <w:p>
+      <w:pPr>
+        <w:rPr>
+          <w:b/>
+          <w:bCs/>
+        </w:rPr>
+      </w:pPr>
+      <w:r>
+        <w:rPr>
+          <w:b/>
+          <w:bCs/>
+        </w:rPr>
+        <w:t xml:space="preserve">Which part would you like to dive into next? </w:t>
+      </w:r>
+      <w:r>
+        <w:rPr>
+          <w:rFonts w:ascii="Segoe UI Emoji" w:hAnsi="Segoe UI Emoji" w:cs="Segoe UI Emoji"/>
+          <w:b/>
+          <w:bCs/>
+        </w:rPr>
+        <w:t>🚀</w:t>
+      </w:r>
+    </w:p>
+    <w:p>
+      <w:pPr>
+        <w:rPr>
+          <w:b/>
+          <w:bCs/>
+          <w:color w:val="00B050"/>
+        </w:rPr>
+      </w:pPr>
+    </w:p>
     <w:sectPr>
       <w:pgSz w:w="12240" w:h="15840"/>
       <w:pgMar w:top="1440" w:right="1440" w:bottom="1440" w:left="1440" w:header="720" w:footer="720" w:gutter="0"/>
@@ -2772,6 +4645,417 @@
     </w:lvl>
   </w:abstractNum>
   <w:abstractNum w:abstractNumId="1" w15:restartNumberingAfterBreak="0">
+    <w:nsid w:val="0E4E7D61"/>
+    <w:multiLevelType w:val="multilevel"/>
+    <w:tmpl w:val="8C2CE960"/>
+    <w:lvl w:ilvl="0">
+      <w:start w:val="1"/>
+      <w:numFmt w:val="bullet"/>
+      <w:lvlText w:val=""/>
+      <w:lvlJc w:val="left"/>
+      <w:pPr>
+        <w:tabs>
+          <w:tab w:val="num" w:pos="720"/>
+        </w:tabs>
+        <w:ind w:left="720" w:hanging="360"/>
+      </w:pPr>
+      <w:rPr>
+        <w:rFonts w:ascii="Symbol" w:hAnsi="Symbol" w:hint="default"/>
+        <w:sz w:val="20"/>
+      </w:rPr>
+    </w:lvl>
+    <w:lvl w:ilvl="1" w:tentative="1">
+      <w:start w:val="1"/>
+      <w:numFmt w:val="bullet"/>
+      <w:lvlText w:val="o"/>
+      <w:lvlJc w:val="left"/>
+      <w:pPr>
+        <w:tabs>
+          <w:tab w:val="num" w:pos="1440"/>
+        </w:tabs>
+        <w:ind w:left="1440" w:hanging="360"/>
+      </w:pPr>
+      <w:rPr>
+        <w:rFonts w:ascii="Courier New" w:hAnsi="Courier New" w:hint="default"/>
+        <w:sz w:val="20"/>
+      </w:rPr>
+    </w:lvl>
+    <w:lvl w:ilvl="2" w:tentative="1">
+      <w:start w:val="1"/>
+      <w:numFmt w:val="bullet"/>
+      <w:lvlText w:val=""/>
+      <w:lvlJc w:val="left"/>
+      <w:pPr>
+        <w:tabs>
+          <w:tab w:val="num" w:pos="2160"/>
+        </w:tabs>
+        <w:ind w:left="2160" w:hanging="360"/>
+      </w:pPr>
+      <w:rPr>
+        <w:rFonts w:ascii="Wingdings" w:hAnsi="Wingdings" w:hint="default"/>
+        <w:sz w:val="20"/>
+      </w:rPr>
+    </w:lvl>
+    <w:lvl w:ilvl="3" w:tentative="1">
+      <w:start w:val="1"/>
+      <w:numFmt w:val="bullet"/>
+      <w:lvlText w:val=""/>
+      <w:lvlJc w:val="left"/>
+      <w:pPr>
+        <w:tabs>
+          <w:tab w:val="num" w:pos="2880"/>
+        </w:tabs>
+        <w:ind w:left="2880" w:hanging="360"/>
+      </w:pPr>
+      <w:rPr>
+        <w:rFonts w:ascii="Wingdings" w:hAnsi="Wingdings" w:hint="default"/>
+        <w:sz w:val="20"/>
+      </w:rPr>
+    </w:lvl>
+    <w:lvl w:ilvl="4" w:tentative="1">
+      <w:start w:val="1"/>
+      <w:numFmt w:val="bullet"/>
+      <w:lvlText w:val=""/>
+      <w:lvlJc w:val="left"/>
+      <w:pPr>
+        <w:tabs>
+          <w:tab w:val="num" w:pos="3600"/>
+        </w:tabs>
+        <w:ind w:left="3600" w:hanging="360"/>
+      </w:pPr>
+      <w:rPr>
+        <w:rFonts w:ascii="Wingdings" w:hAnsi="Wingdings" w:hint="default"/>
+        <w:sz w:val="20"/>
+      </w:rPr>
+    </w:lvl>
+    <w:lvl w:ilvl="5" w:tentative="1">
+      <w:start w:val="1"/>
+      <w:numFmt w:val="bullet"/>
+      <w:lvlText w:val=""/>
+      <w:lvlJc w:val="left"/>
+      <w:pPr>
+        <w:tabs>
+          <w:tab w:val="num" w:pos="4320"/>
+        </w:tabs>
+        <w:ind w:left="4320" w:hanging="360"/>
+      </w:pPr>
+      <w:rPr>
+        <w:rFonts w:ascii="Wingdings" w:hAnsi="Wingdings" w:hint="default"/>
+        <w:sz w:val="20"/>
+      </w:rPr>
+    </w:lvl>
+    <w:lvl w:ilvl="6" w:tentative="1">
+      <w:start w:val="1"/>
+      <w:numFmt w:val="bullet"/>
+      <w:lvlText w:val=""/>
+      <w:lvlJc w:val="left"/>
+      <w:pPr>
+        <w:tabs>
+          <w:tab w:val="num" w:pos="5040"/>
+        </w:tabs>
+        <w:ind w:left="5040" w:hanging="360"/>
+      </w:pPr>
+      <w:rPr>
+        <w:rFonts w:ascii="Wingdings" w:hAnsi="Wingdings" w:hint="default"/>
+        <w:sz w:val="20"/>
+      </w:rPr>
+    </w:lvl>
+    <w:lvl w:ilvl="7" w:tentative="1">
+      <w:start w:val="1"/>
+      <w:numFmt w:val="bullet"/>
+      <w:lvlText w:val=""/>
+      <w:lvlJc w:val="left"/>
+      <w:pPr>
+        <w:tabs>
+          <w:tab w:val="num" w:pos="5760"/>
+        </w:tabs>
+        <w:ind w:left="5760" w:hanging="360"/>
+      </w:pPr>
+      <w:rPr>
+        <w:rFonts w:ascii="Wingdings" w:hAnsi="Wingdings" w:hint="default"/>
+        <w:sz w:val="20"/>
+      </w:rPr>
+    </w:lvl>
+    <w:lvl w:ilvl="8" w:tentative="1">
+      <w:start w:val="1"/>
+      <w:numFmt w:val="bullet"/>
+      <w:lvlText w:val=""/>
+      <w:lvlJc w:val="left"/>
+      <w:pPr>
+        <w:tabs>
+          <w:tab w:val="num" w:pos="6480"/>
+        </w:tabs>
+        <w:ind w:left="6480" w:hanging="360"/>
+      </w:pPr>
+      <w:rPr>
+        <w:rFonts w:ascii="Wingdings" w:hAnsi="Wingdings" w:hint="default"/>
+        <w:sz w:val="20"/>
+      </w:rPr>
+    </w:lvl>
+  </w:abstractNum>
+  <w:abstractNum w:abstractNumId="2" w15:restartNumberingAfterBreak="0">
+    <w:nsid w:val="0FEE580B"/>
+    <w:multiLevelType w:val="multilevel"/>
+    <w:tmpl w:val="F18AEEC8"/>
+    <w:lvl w:ilvl="0">
+      <w:start w:val="1"/>
+      <w:numFmt w:val="decimal"/>
+      <w:lvlText w:val="%1."/>
+      <w:lvlJc w:val="left"/>
+      <w:pPr>
+        <w:tabs>
+          <w:tab w:val="num" w:pos="720"/>
+        </w:tabs>
+        <w:ind w:left="720" w:hanging="360"/>
+      </w:pPr>
+    </w:lvl>
+    <w:lvl w:ilvl="1" w:tentative="1">
+      <w:start w:val="1"/>
+      <w:numFmt w:val="decimal"/>
+      <w:lvlText w:val="%2."/>
+      <w:lvlJc w:val="left"/>
+      <w:pPr>
+        <w:tabs>
+          <w:tab w:val="num" w:pos="1440"/>
+        </w:tabs>
+        <w:ind w:left="1440" w:hanging="360"/>
+      </w:pPr>
+    </w:lvl>
+    <w:lvl w:ilvl="2" w:tentative="1">
+      <w:start w:val="1"/>
+      <w:numFmt w:val="decimal"/>
+      <w:lvlText w:val="%3."/>
+      <w:lvlJc w:val="left"/>
+      <w:pPr>
+        <w:tabs>
+          <w:tab w:val="num" w:pos="2160"/>
+        </w:tabs>
+        <w:ind w:left="2160" w:hanging="360"/>
+      </w:pPr>
+    </w:lvl>
+    <w:lvl w:ilvl="3" w:tentative="1">
+      <w:start w:val="1"/>
+      <w:numFmt w:val="decimal"/>
+      <w:lvlText w:val="%4."/>
+      <w:lvlJc w:val="left"/>
+      <w:pPr>
+        <w:tabs>
+          <w:tab w:val="num" w:pos="2880"/>
+        </w:tabs>
+        <w:ind w:left="2880" w:hanging="360"/>
+      </w:pPr>
+    </w:lvl>
+    <w:lvl w:ilvl="4" w:tentative="1">
+      <w:start w:val="1"/>
+      <w:numFmt w:val="decimal"/>
+      <w:lvlText w:val="%5."/>
+      <w:lvlJc w:val="left"/>
+      <w:pPr>
+        <w:tabs>
+          <w:tab w:val="num" w:pos="3600"/>
+        </w:tabs>
+        <w:ind w:left="3600" w:hanging="360"/>
+      </w:pPr>
+    </w:lvl>
+    <w:lvl w:ilvl="5" w:tentative="1">
+      <w:start w:val="1"/>
+      <w:numFmt w:val="decimal"/>
+      <w:lvlText w:val="%6."/>
+      <w:lvlJc w:val="left"/>
+      <w:pPr>
+        <w:tabs>
+          <w:tab w:val="num" w:pos="4320"/>
+        </w:tabs>
+        <w:ind w:left="4320" w:hanging="360"/>
+      </w:pPr>
+    </w:lvl>
+    <w:lvl w:ilvl="6" w:tentative="1">
+      <w:start w:val="1"/>
+      <w:numFmt w:val="decimal"/>
+      <w:lvlText w:val="%7."/>
+      <w:lvlJc w:val="left"/>
+      <w:pPr>
+        <w:tabs>
+          <w:tab w:val="num" w:pos="5040"/>
+        </w:tabs>
+        <w:ind w:left="5040" w:hanging="360"/>
+      </w:pPr>
+    </w:lvl>
+    <w:lvl w:ilvl="7" w:tentative="1">
+      <w:start w:val="1"/>
+      <w:numFmt w:val="decimal"/>
+      <w:lvlText w:val="%8."/>
+      <w:lvlJc w:val="left"/>
+      <w:pPr>
+        <w:tabs>
+          <w:tab w:val="num" w:pos="5760"/>
+        </w:tabs>
+        <w:ind w:left="5760" w:hanging="360"/>
+      </w:pPr>
+    </w:lvl>
+    <w:lvl w:ilvl="8" w:tentative="1">
+      <w:start w:val="1"/>
+      <w:numFmt w:val="decimal"/>
+      <w:lvlText w:val="%9."/>
+      <w:lvlJc w:val="left"/>
+      <w:pPr>
+        <w:tabs>
+          <w:tab w:val="num" w:pos="6480"/>
+        </w:tabs>
+        <w:ind w:left="6480" w:hanging="360"/>
+      </w:pPr>
+    </w:lvl>
+  </w:abstractNum>
+  <w:abstractNum w:abstractNumId="3" w15:restartNumberingAfterBreak="0">
+    <w:nsid w:val="11896B2A"/>
+    <w:multiLevelType w:val="multilevel"/>
+    <w:tmpl w:val="DD2450AA"/>
+    <w:lvl w:ilvl="0">
+      <w:start w:val="1"/>
+      <w:numFmt w:val="bullet"/>
+      <w:lvlText w:val=""/>
+      <w:lvlJc w:val="left"/>
+      <w:pPr>
+        <w:tabs>
+          <w:tab w:val="num" w:pos="720"/>
+        </w:tabs>
+        <w:ind w:left="720" w:hanging="360"/>
+      </w:pPr>
+      <w:rPr>
+        <w:rFonts w:ascii="Symbol" w:hAnsi="Symbol" w:hint="default"/>
+        <w:sz w:val="20"/>
+      </w:rPr>
+    </w:lvl>
+    <w:lvl w:ilvl="1">
+      <w:start w:val="1"/>
+      <w:numFmt w:val="bullet"/>
+      <w:lvlText w:val="o"/>
+      <w:lvlJc w:val="left"/>
+      <w:pPr>
+        <w:tabs>
+          <w:tab w:val="num" w:pos="1440"/>
+        </w:tabs>
+        <w:ind w:left="1440" w:hanging="360"/>
+      </w:pPr>
+      <w:rPr>
+        <w:rFonts w:ascii="Courier New" w:hAnsi="Courier New" w:hint="default"/>
+        <w:sz w:val="20"/>
+      </w:rPr>
+    </w:lvl>
+    <w:lvl w:ilvl="2" w:tentative="1">
+      <w:start w:val="1"/>
+      <w:numFmt w:val="bullet"/>
+      <w:lvlText w:val=""/>
+      <w:lvlJc w:val="left"/>
+      <w:pPr>
+        <w:tabs>
+          <w:tab w:val="num" w:pos="2160"/>
+        </w:tabs>
+        <w:ind w:left="2160" w:hanging="360"/>
+      </w:pPr>
+      <w:rPr>
+        <w:rFonts w:ascii="Wingdings" w:hAnsi="Wingdings" w:hint="default"/>
+        <w:sz w:val="20"/>
+      </w:rPr>
+    </w:lvl>
+    <w:lvl w:ilvl="3" w:tentative="1">
+      <w:start w:val="1"/>
+      <w:numFmt w:val="bullet"/>
+      <w:lvlText w:val=""/>
+      <w:lvlJc w:val="left"/>
+      <w:pPr>
+        <w:tabs>
+          <w:tab w:val="num" w:pos="2880"/>
+        </w:tabs>
+        <w:ind w:left="2880" w:hanging="360"/>
+      </w:pPr>
+      <w:rPr>
+        <w:rFonts w:ascii="Wingdings" w:hAnsi="Wingdings" w:hint="default"/>
+        <w:sz w:val="20"/>
+      </w:rPr>
+    </w:lvl>
+    <w:lvl w:ilvl="4" w:tentative="1">
+      <w:start w:val="1"/>
+      <w:numFmt w:val="bullet"/>
+      <w:lvlText w:val=""/>
+      <w:lvlJc w:val="left"/>
+      <w:pPr>
+        <w:tabs>
+          <w:tab w:val="num" w:pos="3600"/>
+        </w:tabs>
+        <w:ind w:left="3600" w:hanging="360"/>
+      </w:pPr>
+      <w:rPr>
+        <w:rFonts w:ascii="Wingdings" w:hAnsi="Wingdings" w:hint="default"/>
+        <w:sz w:val="20"/>
+      </w:rPr>
+    </w:lvl>
+    <w:lvl w:ilvl="5" w:tentative="1">
+      <w:start w:val="1"/>
+      <w:numFmt w:val="bullet"/>
+      <w:lvlText w:val=""/>
+      <w:lvlJc w:val="left"/>
+      <w:pPr>
+        <w:tabs>
+          <w:tab w:val="num" w:pos="4320"/>
+        </w:tabs>
+        <w:ind w:left="4320" w:hanging="360"/>
+      </w:pPr>
+      <w:rPr>
+        <w:rFonts w:ascii="Wingdings" w:hAnsi="Wingdings" w:hint="default"/>
+        <w:sz w:val="20"/>
+      </w:rPr>
+    </w:lvl>
+    <w:lvl w:ilvl="6" w:tentative="1">
+      <w:start w:val="1"/>
+      <w:numFmt w:val="bullet"/>
+      <w:lvlText w:val=""/>
+      <w:lvlJc w:val="left"/>
+      <w:pPr>
+        <w:tabs>
+          <w:tab w:val="num" w:pos="5040"/>
+        </w:tabs>
+        <w:ind w:left="5040" w:hanging="360"/>
+      </w:pPr>
+      <w:rPr>
+        <w:rFonts w:ascii="Wingdings" w:hAnsi="Wingdings" w:hint="default"/>
+        <w:sz w:val="20"/>
+      </w:rPr>
+    </w:lvl>
+    <w:lvl w:ilvl="7" w:tentative="1">
+      <w:start w:val="1"/>
+      <w:numFmt w:val="bullet"/>
+      <w:lvlText w:val=""/>
+      <w:lvlJc w:val="left"/>
+      <w:pPr>
+        <w:tabs>
+          <w:tab w:val="num" w:pos="5760"/>
+        </w:tabs>
+        <w:ind w:left="5760" w:hanging="360"/>
+      </w:pPr>
+      <w:rPr>
+        <w:rFonts w:ascii="Wingdings" w:hAnsi="Wingdings" w:hint="default"/>
+        <w:sz w:val="20"/>
+      </w:rPr>
+    </w:lvl>
+    <w:lvl w:ilvl="8" w:tentative="1">
+      <w:start w:val="1"/>
+      <w:numFmt w:val="bullet"/>
+      <w:lvlText w:val=""/>
+      <w:lvlJc w:val="left"/>
+      <w:pPr>
+        <w:tabs>
+          <w:tab w:val="num" w:pos="6480"/>
+        </w:tabs>
+        <w:ind w:left="6480" w:hanging="360"/>
+      </w:pPr>
+      <w:rPr>
+        <w:rFonts w:ascii="Wingdings" w:hAnsi="Wingdings" w:hint="default"/>
+        <w:sz w:val="20"/>
+      </w:rPr>
+    </w:lvl>
+  </w:abstractNum>
+  <w:abstractNum w:abstractNumId="4" w15:restartNumberingAfterBreak="0">
     <w:nsid w:val="12B611D3"/>
     <w:multiLevelType w:val="multilevel"/>
     <w:tmpl w:val="FA760594"/>
@@ -2920,7 +5204,120 @@
       </w:rPr>
     </w:lvl>
   </w:abstractNum>
-  <w:abstractNum w:abstractNumId="2" w15:restartNumberingAfterBreak="0">
+  <w:abstractNum w:abstractNumId="5" w15:restartNumberingAfterBreak="0">
+    <w:nsid w:val="131A72C2"/>
+    <w:multiLevelType w:val="multilevel"/>
+    <w:tmpl w:val="7BE46A6E"/>
+    <w:lvl w:ilvl="0">
+      <w:start w:val="3"/>
+      <w:numFmt w:val="decimal"/>
+      <w:lvlText w:val="%1."/>
+      <w:lvlJc w:val="left"/>
+      <w:pPr>
+        <w:tabs>
+          <w:tab w:val="num" w:pos="720"/>
+        </w:tabs>
+        <w:ind w:left="720" w:hanging="360"/>
+      </w:pPr>
+    </w:lvl>
+    <w:lvl w:ilvl="1" w:tentative="1">
+      <w:start w:val="1"/>
+      <w:numFmt w:val="decimal"/>
+      <w:lvlText w:val="%2."/>
+      <w:lvlJc w:val="left"/>
+      <w:pPr>
+        <w:tabs>
+          <w:tab w:val="num" w:pos="1440"/>
+        </w:tabs>
+        <w:ind w:left="1440" w:hanging="360"/>
+      </w:pPr>
+    </w:lvl>
+    <w:lvl w:ilvl="2" w:tentative="1">
+      <w:start w:val="1"/>
+      <w:numFmt w:val="decimal"/>
+      <w:lvlText w:val="%3."/>
+      <w:lvlJc w:val="left"/>
+      <w:pPr>
+        <w:tabs>
+          <w:tab w:val="num" w:pos="2160"/>
+        </w:tabs>
+        <w:ind w:left="2160" w:hanging="360"/>
+      </w:pPr>
+    </w:lvl>
+    <w:lvl w:ilvl="3" w:tentative="1">
+      <w:start w:val="1"/>
+      <w:numFmt w:val="decimal"/>
+      <w:lvlText w:val="%4."/>
+      <w:lvlJc w:val="left"/>
+      <w:pPr>
+        <w:tabs>
+          <w:tab w:val="num" w:pos="2880"/>
+        </w:tabs>
+        <w:ind w:left="2880" w:hanging="360"/>
+      </w:pPr>
+    </w:lvl>
+    <w:lvl w:ilvl="4" w:tentative="1">
+      <w:start w:val="1"/>
+      <w:numFmt w:val="decimal"/>
+      <w:lvlText w:val="%5."/>
+      <w:lvlJc w:val="left"/>
+      <w:pPr>
+        <w:tabs>
+          <w:tab w:val="num" w:pos="3600"/>
+        </w:tabs>
+        <w:ind w:left="3600" w:hanging="360"/>
+      </w:pPr>
+    </w:lvl>
+    <w:lvl w:ilvl="5" w:tentative="1">
+      <w:start w:val="1"/>
+      <w:numFmt w:val="decimal"/>
+      <w:lvlText w:val="%6."/>
+      <w:lvlJc w:val="left"/>
+      <w:pPr>
+        <w:tabs>
+          <w:tab w:val="num" w:pos="4320"/>
+        </w:tabs>
+        <w:ind w:left="4320" w:hanging="360"/>
+      </w:pPr>
+    </w:lvl>
+    <w:lvl w:ilvl="6" w:tentative="1">
+      <w:start w:val="1"/>
+      <w:numFmt w:val="decimal"/>
+      <w:lvlText w:val="%7."/>
+      <w:lvlJc w:val="left"/>
+      <w:pPr>
+        <w:tabs>
+          <w:tab w:val="num" w:pos="5040"/>
+        </w:tabs>
+        <w:ind w:left="5040" w:hanging="360"/>
+      </w:pPr>
+    </w:lvl>
+    <w:lvl w:ilvl="7" w:tentative="1">
+      <w:start w:val="1"/>
+      <w:numFmt w:val="decimal"/>
+      <w:lvlText w:val="%8."/>
+      <w:lvlJc w:val="left"/>
+      <w:pPr>
+        <w:tabs>
+          <w:tab w:val="num" w:pos="5760"/>
+        </w:tabs>
+        <w:ind w:left="5760" w:hanging="360"/>
+      </w:pPr>
+    </w:lvl>
+    <w:lvl w:ilvl="8" w:tentative="1">
+      <w:start w:val="1"/>
+      <w:numFmt w:val="decimal"/>
+      <w:lvlText w:val="%9."/>
+      <w:lvlJc w:val="left"/>
+      <w:pPr>
+        <w:tabs>
+          <w:tab w:val="num" w:pos="6480"/>
+        </w:tabs>
+        <w:ind w:left="6480" w:hanging="360"/>
+      </w:pPr>
+    </w:lvl>
+  </w:abstractNum>
+  <w:abstractNum w:abstractNumId="6" w15:restartNumberingAfterBreak="0">
     <w:nsid w:val="1D0E5786"/>
     <w:multiLevelType w:val="multilevel"/>
     <w:tmpl w:val="08FCF7F2"/>
@@ -3069,7 +5466,7 @@
       </w:rPr>
     </w:lvl>
   </w:abstractNum>
-  <w:abstractNum w:abstractNumId="3" w15:restartNumberingAfterBreak="0">
+  <w:abstractNum w:abstractNumId="7" w15:restartNumberingAfterBreak="0">
     <w:nsid w:val="21A31948"/>
     <w:multiLevelType w:val="multilevel"/>
     <w:tmpl w:val="08FE4D0E"/>
@@ -3218,7 +5615,156 @@
       </w:rPr>
     </w:lvl>
   </w:abstractNum>
-  <w:abstractNum w:abstractNumId="4" w15:restartNumberingAfterBreak="0">
+  <w:abstractNum w:abstractNumId="8" w15:restartNumberingAfterBreak="0">
+    <w:nsid w:val="26460378"/>
+    <w:multiLevelType w:val="multilevel"/>
+    <w:tmpl w:val="A492EC94"/>
+    <w:lvl w:ilvl="0">
+      <w:start w:val="1"/>
+      <w:numFmt w:val="bullet"/>
+      <w:lvlText w:val=""/>
+      <w:lvlJc w:val="left"/>
+      <w:pPr>
+        <w:tabs>
+          <w:tab w:val="num" w:pos="720"/>
+        </w:tabs>
+        <w:ind w:left="720" w:hanging="360"/>
+      </w:pPr>
+      <w:rPr>
+        <w:rFonts w:ascii="Symbol" w:hAnsi="Symbol" w:hint="default"/>
+        <w:sz w:val="20"/>
+      </w:rPr>
+    </w:lvl>
+    <w:lvl w:ilvl="1" w:tentative="1">
+      <w:start w:val="1"/>
+      <w:numFmt w:val="bullet"/>
+      <w:lvlText w:val="o"/>
+      <w:lvlJc w:val="left"/>
+      <w:pPr>
+        <w:tabs>
+          <w:tab w:val="num" w:pos="1440"/>
+        </w:tabs>
+        <w:ind w:left="1440" w:hanging="360"/>
+      </w:pPr>
+      <w:rPr>
+        <w:rFonts w:ascii="Courier New" w:hAnsi="Courier New" w:hint="default"/>
+        <w:sz w:val="20"/>
+      </w:rPr>
+    </w:lvl>
+    <w:lvl w:ilvl="2" w:tentative="1">
+      <w:start w:val="1"/>
+      <w:numFmt w:val="bullet"/>
+      <w:lvlText w:val=""/>
+      <w:lvlJc w:val="left"/>
+      <w:pPr>
+        <w:tabs>
+          <w:tab w:val="num" w:pos="2160"/>
+        </w:tabs>
+        <w:ind w:left="2160" w:hanging="360"/>
+      </w:pPr>
+      <w:rPr>
+        <w:rFonts w:ascii="Wingdings" w:hAnsi="Wingdings" w:hint="default"/>
+        <w:sz w:val="20"/>
+      </w:rPr>
+    </w:lvl>
+    <w:lvl w:ilvl="3" w:tentative="1">
+      <w:start w:val="1"/>
+      <w:numFmt w:val="bullet"/>
+      <w:lvlText w:val=""/>
+      <w:lvlJc w:val="left"/>
+      <w:pPr>
+        <w:tabs>
+          <w:tab w:val="num" w:pos="2880"/>
+        </w:tabs>
+        <w:ind w:left="2880" w:hanging="360"/>
+      </w:pPr>
+      <w:rPr>
+        <w:rFonts w:ascii="Wingdings" w:hAnsi="Wingdings" w:hint="default"/>
+        <w:sz w:val="20"/>
+      </w:rPr>
+    </w:lvl>
+    <w:lvl w:ilvl="4" w:tentative="1">
+      <w:start w:val="1"/>
+      <w:numFmt w:val="bullet"/>
+      <w:lvlText w:val=""/>
+      <w:lvlJc w:val="left"/>
+      <w:pPr>
+        <w:tabs>
+          <w:tab w:val="num" w:pos="3600"/>
+        </w:tabs>
+        <w:ind w:left="3600" w:hanging="360"/>
+      </w:pPr>
+      <w:rPr>
+        <w:rFonts w:ascii="Wingdings" w:hAnsi="Wingdings" w:hint="default"/>
+        <w:sz w:val="20"/>
+      </w:rPr>
+    </w:lvl>
+    <w:lvl w:ilvl="5" w:tentative="1">
+      <w:start w:val="1"/>
+      <w:numFmt w:val="bullet"/>
+      <w:lvlText w:val=""/>
+      <w:lvlJc w:val="left"/>
+      <w:pPr>
+        <w:tabs>
+          <w:tab w:val="num" w:pos="4320"/>
+        </w:tabs>
+        <w:ind w:left="4320" w:hanging="360"/>
+      </w:pPr>
+      <w:rPr>
+        <w:rFonts w:ascii="Wingdings" w:hAnsi="Wingdings" w:hint="default"/>
+        <w:sz w:val="20"/>
+      </w:rPr>
+    </w:lvl>
+    <w:lvl w:ilvl="6" w:tentative="1">
+      <w:start w:val="1"/>
+      <w:numFmt w:val="bullet"/>
+      <w:lvlText w:val=""/>
+      <w:lvlJc w:val="left"/>
+      <w:pPr>
+        <w:tabs>
+          <w:tab w:val="num" w:pos="5040"/>
+        </w:tabs>
+        <w:ind w:left="5040" w:hanging="360"/>
+      </w:pPr>
+      <w:rPr>
+        <w:rFonts w:ascii="Wingdings" w:hAnsi="Wingdings" w:hint="default"/>
+        <w:sz w:val="20"/>
+      </w:rPr>
+    </w:lvl>
+    <w:lvl w:ilvl="7" w:tentative="1">
+      <w:start w:val="1"/>
+      <w:numFmt w:val="bullet"/>
+      <w:lvlText w:val=""/>
+      <w:lvlJc w:val="left"/>
+      <w:pPr>
+        <w:tabs>
+          <w:tab w:val="num" w:pos="5760"/>
+        </w:tabs>
+        <w:ind w:left="5760" w:hanging="360"/>
+      </w:pPr>
+      <w:rPr>
+        <w:rFonts w:ascii="Wingdings" w:hAnsi="Wingdings" w:hint="default"/>
+        <w:sz w:val="20"/>
+      </w:rPr>
+    </w:lvl>
+    <w:lvl w:ilvl="8" w:tentative="1">
+      <w:start w:val="1"/>
+      <w:numFmt w:val="bullet"/>
+      <w:lvlText w:val=""/>
+      <w:lvlJc w:val="left"/>
+      <w:pPr>
+        <w:tabs>
+          <w:tab w:val="num" w:pos="6480"/>
+        </w:tabs>
+        <w:ind w:left="6480" w:hanging="360"/>
+      </w:pPr>
+      <w:rPr>
+        <w:rFonts w:ascii="Wingdings" w:hAnsi="Wingdings" w:hint="default"/>
+        <w:sz w:val="20"/>
+      </w:rPr>
+    </w:lvl>
+  </w:abstractNum>
+  <w:abstractNum w:abstractNumId="9" w15:restartNumberingAfterBreak="0">
     <w:nsid w:val="2C0B4F3A"/>
     <w:multiLevelType w:val="multilevel"/>
     <w:tmpl w:val="481603D0"/>
@@ -3367,7 +5913,120 @@
       </w:rPr>
     </w:lvl>
   </w:abstractNum>
-  <w:abstractNum w:abstractNumId="5" w15:restartNumberingAfterBreak="0">
+  <w:abstractNum w:abstractNumId="10" w15:restartNumberingAfterBreak="0">
+    <w:nsid w:val="2F7C53B9"/>
+    <w:multiLevelType w:val="hybridMultilevel"/>
+    <w:tmpl w:val="5852CA7A"/>
+    <w:lvl w:ilvl="0" w:tplc="04090001">
+      <w:start w:val="1"/>
+      <w:numFmt w:val="bullet"/>
+      <w:lvlText w:val=""/>
+      <w:lvlJc w:val="left"/>
+      <w:pPr>
+        <w:ind w:left="720" w:hanging="360"/>
+      </w:pPr>
+      <w:rPr>
+        <w:rFonts w:ascii="Symbol" w:hAnsi="Symbol" w:hint="default"/>
+      </w:rPr>
+    </w:lvl>
+    <w:lvl w:ilvl="1" w:tplc="04090003">
+      <w:start w:val="1"/>
+      <w:numFmt w:val="bullet"/>
+      <w:lvlText w:val="o"/>
+      <w:lvlJc w:val="left"/>
+      <w:pPr>
+        <w:ind w:left="1440" w:hanging="360"/>
+      </w:pPr>
+      <w:rPr>
+        <w:rFonts w:ascii="Courier New" w:hAnsi="Courier New" w:cs="Courier New" w:hint="default"/>
+      </w:rPr>
+    </w:lvl>
+    <w:lvl w:ilvl="2" w:tplc="04090005" w:tentative="1">
+      <w:start w:val="1"/>
+      <w:numFmt w:val="bullet"/>
+      <w:lvlText w:val=""/>
+      <w:lvlJc w:val="left"/>
+      <w:pPr>
+        <w:ind w:left="2160" w:hanging="360"/>
+      </w:pPr>
+      <w:rPr>
+        <w:rFonts w:ascii="Wingdings" w:hAnsi="Wingdings" w:hint="default"/>
+      </w:rPr>
+    </w:lvl>
+    <w:lvl w:ilvl="3" w:tplc="04090001" w:tentative="1">
+      <w:start w:val="1"/>
+      <w:numFmt w:val="bullet"/>
+      <w:lvlText w:val=""/>
+      <w:lvlJc w:val="left"/>
+      <w:pPr>
+        <w:ind w:left="2880" w:hanging="360"/>
+      </w:pPr>
+      <w:rPr>
+        <w:rFonts w:ascii="Symbol" w:hAnsi="Symbol" w:hint="default"/>
+      </w:rPr>
+    </w:lvl>
+    <w:lvl w:ilvl="4" w:tplc="04090003" w:tentative="1">
+      <w:start w:val="1"/>
+      <w:numFmt w:val="bullet"/>
+      <w:lvlText w:val="o"/>
+      <w:lvlJc w:val="left"/>
+      <w:pPr>
+        <w:ind w:left="3600" w:hanging="360"/>
+      </w:pPr>
+      <w:rPr>
+        <w:rFonts w:ascii="Courier New" w:hAnsi="Courier New" w:cs="Courier New" w:hint="default"/>
+      </w:rPr>
+    </w:lvl>
+    <w:lvl w:ilvl="5" w:tplc="04090005" w:tentative="1">
+      <w:start w:val="1"/>
+      <w:numFmt w:val="bullet"/>
+      <w:lvlText w:val=""/>
+      <w:lvlJc w:val="left"/>
+      <w:pPr>
+        <w:ind w:left="4320" w:hanging="360"/>
+      </w:pPr>
+      <w:rPr>
+        <w:rFonts w:ascii="Wingdings" w:hAnsi="Wingdings" w:hint="default"/>
+      </w:rPr>
+    </w:lvl>
+    <w:lvl w:ilvl="6" w:tplc="04090001" w:tentative="1">
+      <w:start w:val="1"/>
+      <w:numFmt w:val="bullet"/>
+      <w:lvlText w:val=""/>
+      <w:lvlJc w:val="left"/>
+      <w:pPr>
+        <w:ind w:left="5040" w:hanging="360"/>
+      </w:pPr>
+      <w:rPr>
+        <w:rFonts w:ascii="Symbol" w:hAnsi="Symbol" w:hint="default"/>
+      </w:rPr>
+    </w:lvl>
+    <w:lvl w:ilvl="7" w:tplc="04090003" w:tentative="1">
+      <w:start w:val="1"/>
+      <w:numFmt w:val="bullet"/>
+      <w:lvlText w:val="o"/>
+      <w:lvlJc w:val="left"/>
+      <w:pPr>
+        <w:ind w:left="5760" w:hanging="360"/>
+      </w:pPr>
+      <w:rPr>
+        <w:rFonts w:ascii="Courier New" w:hAnsi="Courier New" w:cs="Courier New" w:hint="default"/>
+      </w:rPr>
+    </w:lvl>
+    <w:lvl w:ilvl="8" w:tplc="04090005" w:tentative="1">
+      <w:start w:val="1"/>
+      <w:numFmt w:val="bullet"/>
+      <w:lvlText w:val=""/>
+      <w:lvlJc w:val="left"/>
+      <w:pPr>
+        <w:ind w:left="6480" w:hanging="360"/>
+      </w:pPr>
+      <w:rPr>
+        <w:rFonts w:ascii="Wingdings" w:hAnsi="Wingdings" w:hint="default"/>
+      </w:rPr>
+    </w:lvl>
+  </w:abstractNum>
+  <w:abstractNum w:abstractNumId="11" w15:restartNumberingAfterBreak="0">
     <w:nsid w:val="42E16BF5"/>
     <w:multiLevelType w:val="multilevel"/>
     <w:tmpl w:val="7A04507A"/>
@@ -3513,7 +6172,156 @@
       </w:rPr>
     </w:lvl>
   </w:abstractNum>
-  <w:abstractNum w:abstractNumId="6" w15:restartNumberingAfterBreak="0">
+  <w:abstractNum w:abstractNumId="12" w15:restartNumberingAfterBreak="0">
+    <w:nsid w:val="47FE258C"/>
+    <w:multiLevelType w:val="multilevel"/>
+    <w:tmpl w:val="53C41AD0"/>
+    <w:lvl w:ilvl="0">
+      <w:start w:val="1"/>
+      <w:numFmt w:val="bullet"/>
+      <w:lvlText w:val=""/>
+      <w:lvlJc w:val="left"/>
+      <w:pPr>
+        <w:tabs>
+          <w:tab w:val="num" w:pos="720"/>
+        </w:tabs>
+        <w:ind w:left="720" w:hanging="360"/>
+      </w:pPr>
+      <w:rPr>
+        <w:rFonts w:ascii="Symbol" w:hAnsi="Symbol" w:hint="default"/>
+        <w:sz w:val="20"/>
+      </w:rPr>
+    </w:lvl>
+    <w:lvl w:ilvl="1">
+      <w:start w:val="1"/>
+      <w:numFmt w:val="bullet"/>
+      <w:lvlText w:val="o"/>
+      <w:lvlJc w:val="left"/>
+      <w:pPr>
+        <w:tabs>
+          <w:tab w:val="num" w:pos="1440"/>
+        </w:tabs>
+        <w:ind w:left="1440" w:hanging="360"/>
+      </w:pPr>
+      <w:rPr>
+        <w:rFonts w:ascii="Courier New" w:hAnsi="Courier New" w:hint="default"/>
+        <w:sz w:val="20"/>
+      </w:rPr>
+    </w:lvl>
+    <w:lvl w:ilvl="2" w:tentative="1">
+      <w:start w:val="1"/>
+      <w:numFmt w:val="bullet"/>
+      <w:lvlText w:val=""/>
+      <w:lvlJc w:val="left"/>
+      <w:pPr>
+        <w:tabs>
+          <w:tab w:val="num" w:pos="2160"/>
+        </w:tabs>
+        <w:ind w:left="2160" w:hanging="360"/>
+      </w:pPr>
+      <w:rPr>
+        <w:rFonts w:ascii="Wingdings" w:hAnsi="Wingdings" w:hint="default"/>
+        <w:sz w:val="20"/>
+      </w:rPr>
+    </w:lvl>
+    <w:lvl w:ilvl="3" w:tentative="1">
+      <w:start w:val="1"/>
+      <w:numFmt w:val="bullet"/>
+      <w:lvlText w:val=""/>
+      <w:lvlJc w:val="left"/>
+      <w:pPr>
+        <w:tabs>
+          <w:tab w:val="num" w:pos="2880"/>
+        </w:tabs>
+        <w:ind w:left="2880" w:hanging="360"/>
+      </w:pPr>
+      <w:rPr>
+        <w:rFonts w:ascii="Wingdings" w:hAnsi="Wingdings" w:hint="default"/>
+        <w:sz w:val="20"/>
+      </w:rPr>
+    </w:lvl>
+    <w:lvl w:ilvl="4" w:tentative="1">
+      <w:start w:val="1"/>
+      <w:numFmt w:val="bullet"/>
+      <w:lvlText w:val=""/>
+      <w:lvlJc w:val="left"/>
+      <w:pPr>
+        <w:tabs>
+          <w:tab w:val="num" w:pos="3600"/>
+        </w:tabs>
+        <w:ind w:left="3600" w:hanging="360"/>
+      </w:pPr>
+      <w:rPr>
+        <w:rFonts w:ascii="Wingdings" w:hAnsi="Wingdings" w:hint="default"/>
+        <w:sz w:val="20"/>
+      </w:rPr>
+    </w:lvl>
+    <w:lvl w:ilvl="5" w:tentative="1">
+      <w:start w:val="1"/>
+      <w:numFmt w:val="bullet"/>
+      <w:lvlText w:val=""/>
+      <w:lvlJc w:val="left"/>
+      <w:pPr>
+        <w:tabs>
+          <w:tab w:val="num" w:pos="4320"/>
+        </w:tabs>
+        <w:ind w:left="4320" w:hanging="360"/>
+      </w:pPr>
+      <w:rPr>
+        <w:rFonts w:ascii="Wingdings" w:hAnsi="Wingdings" w:hint="default"/>
+        <w:sz w:val="20"/>
+      </w:rPr>
+    </w:lvl>
+    <w:lvl w:ilvl="6" w:tentative="1">
+      <w:start w:val="1"/>
+      <w:numFmt w:val="bullet"/>
+      <w:lvlText w:val=""/>
+      <w:lvlJc w:val="left"/>
+      <w:pPr>
+        <w:tabs>
+          <w:tab w:val="num" w:pos="5040"/>
+        </w:tabs>
+        <w:ind w:left="5040" w:hanging="360"/>
+      </w:pPr>
+      <w:rPr>
+        <w:rFonts w:ascii="Wingdings" w:hAnsi="Wingdings" w:hint="default"/>
+        <w:sz w:val="20"/>
+      </w:rPr>
+    </w:lvl>
+    <w:lvl w:ilvl="7" w:tentative="1">
+      <w:start w:val="1"/>
+      <w:numFmt w:val="bullet"/>
+      <w:lvlText w:val=""/>
+      <w:lvlJc w:val="left"/>
+      <w:pPr>
+        <w:tabs>
+          <w:tab w:val="num" w:pos="5760"/>
+        </w:tabs>
+        <w:ind w:left="5760" w:hanging="360"/>
+      </w:pPr>
+      <w:rPr>
+        <w:rFonts w:ascii="Wingdings" w:hAnsi="Wingdings" w:hint="default"/>
+        <w:sz w:val="20"/>
+      </w:rPr>
+    </w:lvl>
+    <w:lvl w:ilvl="8" w:tentative="1">
+      <w:start w:val="1"/>
+      <w:numFmt w:val="bullet"/>
+      <w:lvlText w:val=""/>
+      <w:lvlJc w:val="left"/>
+      <w:pPr>
+        <w:tabs>
+          <w:tab w:val="num" w:pos="6480"/>
+        </w:tabs>
+        <w:ind w:left="6480" w:hanging="360"/>
+      </w:pPr>
+      <w:rPr>
+        <w:rFonts w:ascii="Wingdings" w:hAnsi="Wingdings" w:hint="default"/>
+        <w:sz w:val="20"/>
+      </w:rPr>
+    </w:lvl>
+  </w:abstractNum>
+  <w:abstractNum w:abstractNumId="13" w15:restartNumberingAfterBreak="0">
     <w:nsid w:val="48692A8A"/>
     <w:multiLevelType w:val="multilevel"/>
     <w:tmpl w:val="3264A654"/>
@@ -3662,7 +6470,539 @@
       </w:rPr>
     </w:lvl>
   </w:abstractNum>
-  <w:abstractNum w:abstractNumId="7" w15:restartNumberingAfterBreak="0">
+  <w:abstractNum w:abstractNumId="14" w15:restartNumberingAfterBreak="0">
+    <w:nsid w:val="4F1A57CE"/>
+    <w:multiLevelType w:val="multilevel"/>
+    <w:tmpl w:val="60B46F70"/>
+    <w:lvl w:ilvl="0">
+      <w:start w:val="1"/>
+      <w:numFmt w:val="bullet"/>
+      <w:lvlText w:val=""/>
+      <w:lvlJc w:val="left"/>
+      <w:pPr>
+        <w:tabs>
+          <w:tab w:val="num" w:pos="720"/>
+        </w:tabs>
+        <w:ind w:left="720" w:hanging="360"/>
+      </w:pPr>
+      <w:rPr>
+        <w:rFonts w:ascii="Symbol" w:hAnsi="Symbol" w:hint="default"/>
+        <w:sz w:val="20"/>
+      </w:rPr>
+    </w:lvl>
+    <w:lvl w:ilvl="1" w:tentative="1">
+      <w:start w:val="1"/>
+      <w:numFmt w:val="bullet"/>
+      <w:lvlText w:val="o"/>
+      <w:lvlJc w:val="left"/>
+      <w:pPr>
+        <w:tabs>
+          <w:tab w:val="num" w:pos="1440"/>
+        </w:tabs>
+        <w:ind w:left="1440" w:hanging="360"/>
+      </w:pPr>
+      <w:rPr>
+        <w:rFonts w:ascii="Courier New" w:hAnsi="Courier New" w:hint="default"/>
+        <w:sz w:val="20"/>
+      </w:rPr>
+    </w:lvl>
+    <w:lvl w:ilvl="2" w:tentative="1">
+      <w:start w:val="1"/>
+      <w:numFmt w:val="bullet"/>
+      <w:lvlText w:val=""/>
+      <w:lvlJc w:val="left"/>
+      <w:pPr>
+        <w:tabs>
+          <w:tab w:val="num" w:pos="2160"/>
+        </w:tabs>
+        <w:ind w:left="2160" w:hanging="360"/>
+      </w:pPr>
+      <w:rPr>
+        <w:rFonts w:ascii="Wingdings" w:hAnsi="Wingdings" w:hint="default"/>
+        <w:sz w:val="20"/>
+      </w:rPr>
+    </w:lvl>
+    <w:lvl w:ilvl="3" w:tentative="1">
+      <w:start w:val="1"/>
+      <w:numFmt w:val="bullet"/>
+      <w:lvlText w:val=""/>
+      <w:lvlJc w:val="left"/>
+      <w:pPr>
+        <w:tabs>
+          <w:tab w:val="num" w:pos="2880"/>
+        </w:tabs>
+        <w:ind w:left="2880" w:hanging="360"/>
+      </w:pPr>
+      <w:rPr>
+        <w:rFonts w:ascii="Wingdings" w:hAnsi="Wingdings" w:hint="default"/>
+        <w:sz w:val="20"/>
+      </w:rPr>
+    </w:lvl>
+    <w:lvl w:ilvl="4" w:tentative="1">
+      <w:start w:val="1"/>
+      <w:numFmt w:val="bullet"/>
+      <w:lvlText w:val=""/>
+      <w:lvlJc w:val="left"/>
+      <w:pPr>
+        <w:tabs>
+          <w:tab w:val="num" w:pos="3600"/>
+        </w:tabs>
+        <w:ind w:left="3600" w:hanging="360"/>
+      </w:pPr>
+      <w:rPr>
+        <w:rFonts w:ascii="Wingdings" w:hAnsi="Wingdings" w:hint="default"/>
+        <w:sz w:val="20"/>
+      </w:rPr>
+    </w:lvl>
+    <w:lvl w:ilvl="5" w:tentative="1">
+      <w:start w:val="1"/>
+      <w:numFmt w:val="bullet"/>
+      <w:lvlText w:val=""/>
+      <w:lvlJc w:val="left"/>
+      <w:pPr>
+        <w:tabs>
+          <w:tab w:val="num" w:pos="4320"/>
+        </w:tabs>
+        <w:ind w:left="4320" w:hanging="360"/>
+      </w:pPr>
+      <w:rPr>
+        <w:rFonts w:ascii="Wingdings" w:hAnsi="Wingdings" w:hint="default"/>
+        <w:sz w:val="20"/>
+      </w:rPr>
+    </w:lvl>
+    <w:lvl w:ilvl="6" w:tentative="1">
+      <w:start w:val="1"/>
+      <w:numFmt w:val="bullet"/>
+      <w:lvlText w:val=""/>
+      <w:lvlJc w:val="left"/>
+      <w:pPr>
+        <w:tabs>
+          <w:tab w:val="num" w:pos="5040"/>
+        </w:tabs>
+        <w:ind w:left="5040" w:hanging="360"/>
+      </w:pPr>
+      <w:rPr>
+        <w:rFonts w:ascii="Wingdings" w:hAnsi="Wingdings" w:hint="default"/>
+        <w:sz w:val="20"/>
+      </w:rPr>
+    </w:lvl>
+    <w:lvl w:ilvl="7" w:tentative="1">
+      <w:start w:val="1"/>
+      <w:numFmt w:val="bullet"/>
+      <w:lvlText w:val=""/>
+      <w:lvlJc w:val="left"/>
+      <w:pPr>
+        <w:tabs>
+          <w:tab w:val="num" w:pos="5760"/>
+        </w:tabs>
+        <w:ind w:left="5760" w:hanging="360"/>
+      </w:pPr>
+      <w:rPr>
+        <w:rFonts w:ascii="Wingdings" w:hAnsi="Wingdings" w:hint="default"/>
+        <w:sz w:val="20"/>
+      </w:rPr>
+    </w:lvl>
+    <w:lvl w:ilvl="8" w:tentative="1">
+      <w:start w:val="1"/>
+      <w:numFmt w:val="bullet"/>
+      <w:lvlText w:val=""/>
+      <w:lvlJc w:val="left"/>
+      <w:pPr>
+        <w:tabs>
+          <w:tab w:val="num" w:pos="6480"/>
+        </w:tabs>
+        <w:ind w:left="6480" w:hanging="360"/>
+      </w:pPr>
+      <w:rPr>
+        <w:rFonts w:ascii="Wingdings" w:hAnsi="Wingdings" w:hint="default"/>
+        <w:sz w:val="20"/>
+      </w:rPr>
+    </w:lvl>
+  </w:abstractNum>
+  <w:abstractNum w:abstractNumId="15" w15:restartNumberingAfterBreak="0">
+    <w:nsid w:val="58796EAD"/>
+    <w:multiLevelType w:val="multilevel"/>
+    <w:tmpl w:val="7B90CF50"/>
+    <w:lvl w:ilvl="0">
+      <w:start w:val="1"/>
+      <w:numFmt w:val="bullet"/>
+      <w:lvlText w:val=""/>
+      <w:lvlJc w:val="left"/>
+      <w:pPr>
+        <w:tabs>
+          <w:tab w:val="num" w:pos="720"/>
+        </w:tabs>
+        <w:ind w:left="720" w:hanging="360"/>
+      </w:pPr>
+      <w:rPr>
+        <w:rFonts w:ascii="Symbol" w:hAnsi="Symbol" w:hint="default"/>
+        <w:sz w:val="20"/>
+      </w:rPr>
+    </w:lvl>
+    <w:lvl w:ilvl="1" w:tentative="1">
+      <w:start w:val="1"/>
+      <w:numFmt w:val="bullet"/>
+      <w:lvlText w:val="o"/>
+      <w:lvlJc w:val="left"/>
+      <w:pPr>
+        <w:tabs>
+          <w:tab w:val="num" w:pos="1440"/>
+        </w:tabs>
+        <w:ind w:left="1440" w:hanging="360"/>
+      </w:pPr>
+      <w:rPr>
+        <w:rFonts w:ascii="Courier New" w:hAnsi="Courier New" w:hint="default"/>
+        <w:sz w:val="20"/>
+      </w:rPr>
+    </w:lvl>
+    <w:lvl w:ilvl="2" w:tentative="1">
+      <w:start w:val="1"/>
+      <w:numFmt w:val="bullet"/>
+      <w:lvlText w:val=""/>
+      <w:lvlJc w:val="left"/>
+      <w:pPr>
+        <w:tabs>
+          <w:tab w:val="num" w:pos="2160"/>
+        </w:tabs>
+        <w:ind w:left="2160" w:hanging="360"/>
+      </w:pPr>
+      <w:rPr>
+        <w:rFonts w:ascii="Wingdings" w:hAnsi="Wingdings" w:hint="default"/>
+        <w:sz w:val="20"/>
+      </w:rPr>
+    </w:lvl>
+    <w:lvl w:ilvl="3" w:tentative="1">
+      <w:start w:val="1"/>
+      <w:numFmt w:val="bullet"/>
+      <w:lvlText w:val=""/>
+      <w:lvlJc w:val="left"/>
+      <w:pPr>
+        <w:tabs>
+          <w:tab w:val="num" w:pos="2880"/>
+        </w:tabs>
+        <w:ind w:left="2880" w:hanging="360"/>
+      </w:pPr>
+      <w:rPr>
+        <w:rFonts w:ascii="Wingdings" w:hAnsi="Wingdings" w:hint="default"/>
+        <w:sz w:val="20"/>
+      </w:rPr>
+    </w:lvl>
+    <w:lvl w:ilvl="4" w:tentative="1">
+      <w:start w:val="1"/>
+      <w:numFmt w:val="bullet"/>
+      <w:lvlText w:val=""/>
+      <w:lvlJc w:val="left"/>
+      <w:pPr>
+        <w:tabs>
+          <w:tab w:val="num" w:pos="3600"/>
+        </w:tabs>
+        <w:ind w:left="3600" w:hanging="360"/>
+      </w:pPr>
+      <w:rPr>
+        <w:rFonts w:ascii="Wingdings" w:hAnsi="Wingdings" w:hint="default"/>
+        <w:sz w:val="20"/>
+      </w:rPr>
+    </w:lvl>
+    <w:lvl w:ilvl="5" w:tentative="1">
+      <w:start w:val="1"/>
+      <w:numFmt w:val="bullet"/>
+      <w:lvlText w:val=""/>
+      <w:lvlJc w:val="left"/>
+      <w:pPr>
+        <w:tabs>
+          <w:tab w:val="num" w:pos="4320"/>
+        </w:tabs>
+        <w:ind w:left="4320" w:hanging="360"/>
+      </w:pPr>
+      <w:rPr>
+        <w:rFonts w:ascii="Wingdings" w:hAnsi="Wingdings" w:hint="default"/>
+        <w:sz w:val="20"/>
+      </w:rPr>
+    </w:lvl>
+    <w:lvl w:ilvl="6" w:tentative="1">
+      <w:start w:val="1"/>
+      <w:numFmt w:val="bullet"/>
+      <w:lvlText w:val=""/>
+      <w:lvlJc w:val="left"/>
+      <w:pPr>
+        <w:tabs>
+          <w:tab w:val="num" w:pos="5040"/>
+        </w:tabs>
+        <w:ind w:left="5040" w:hanging="360"/>
+      </w:pPr>
+      <w:rPr>
+        <w:rFonts w:ascii="Wingdings" w:hAnsi="Wingdings" w:hint="default"/>
+        <w:sz w:val="20"/>
+      </w:rPr>
+    </w:lvl>
+    <w:lvl w:ilvl="7" w:tentative="1">
+      <w:start w:val="1"/>
+      <w:numFmt w:val="bullet"/>
+      <w:lvlText w:val=""/>
+      <w:lvlJc w:val="left"/>
+      <w:pPr>
+        <w:tabs>
+          <w:tab w:val="num" w:pos="5760"/>
+        </w:tabs>
+        <w:ind w:left="5760" w:hanging="360"/>
+      </w:pPr>
+      <w:rPr>
+        <w:rFonts w:ascii="Wingdings" w:hAnsi="Wingdings" w:hint="default"/>
+        <w:sz w:val="20"/>
+      </w:rPr>
+    </w:lvl>
+    <w:lvl w:ilvl="8" w:tentative="1">
+      <w:start w:val="1"/>
+      <w:numFmt w:val="bullet"/>
+      <w:lvlText w:val=""/>
+      <w:lvlJc w:val="left"/>
+      <w:pPr>
+        <w:tabs>
+          <w:tab w:val="num" w:pos="6480"/>
+        </w:tabs>
+        <w:ind w:left="6480" w:hanging="360"/>
+      </w:pPr>
+      <w:rPr>
+        <w:rFonts w:ascii="Wingdings" w:hAnsi="Wingdings" w:hint="default"/>
+        <w:sz w:val="20"/>
+      </w:rPr>
+    </w:lvl>
+  </w:abstractNum>
+  <w:abstractNum w:abstractNumId="16" w15:restartNumberingAfterBreak="0">
+    <w:nsid w:val="5C376406"/>
+    <w:multiLevelType w:val="multilevel"/>
+    <w:tmpl w:val="2BA491B8"/>
+    <w:lvl w:ilvl="0">
+      <w:start w:val="1"/>
+      <w:numFmt w:val="decimal"/>
+      <w:lvlText w:val="%1."/>
+      <w:lvlJc w:val="left"/>
+      <w:pPr>
+        <w:tabs>
+          <w:tab w:val="num" w:pos="720"/>
+        </w:tabs>
+        <w:ind w:left="720" w:hanging="360"/>
+      </w:pPr>
+    </w:lvl>
+    <w:lvl w:ilvl="1">
+      <w:start w:val="1"/>
+      <w:numFmt w:val="bullet"/>
+      <w:lvlText w:val="o"/>
+      <w:lvlJc w:val="left"/>
+      <w:pPr>
+        <w:tabs>
+          <w:tab w:val="num" w:pos="1440"/>
+        </w:tabs>
+        <w:ind w:left="1440" w:hanging="360"/>
+      </w:pPr>
+      <w:rPr>
+        <w:rFonts w:ascii="Courier New" w:hAnsi="Courier New" w:hint="default"/>
+        <w:sz w:val="20"/>
+      </w:rPr>
+    </w:lvl>
+    <w:lvl w:ilvl="2" w:tentative="1">
+      <w:start w:val="1"/>
+      <w:numFmt w:val="decimal"/>
+      <w:lvlText w:val="%3."/>
+      <w:lvlJc w:val="left"/>
+      <w:pPr>
+        <w:tabs>
+          <w:tab w:val="num" w:pos="2160"/>
+        </w:tabs>
+        <w:ind w:left="2160" w:hanging="360"/>
+      </w:pPr>
+    </w:lvl>
+    <w:lvl w:ilvl="3" w:tentative="1">
+      <w:start w:val="1"/>
+      <w:numFmt w:val="decimal"/>
+      <w:lvlText w:val="%4."/>
+      <w:lvlJc w:val="left"/>
+      <w:pPr>
+        <w:tabs>
+          <w:tab w:val="num" w:pos="2880"/>
+        </w:tabs>
+        <w:ind w:left="2880" w:hanging="360"/>
+      </w:pPr>
+    </w:lvl>
+    <w:lvl w:ilvl="4" w:tentative="1">
+      <w:start w:val="1"/>
+      <w:numFmt w:val="decimal"/>
+      <w:lvlText w:val="%5."/>
+      <w:lvlJc w:val="left"/>
+      <w:pPr>
+        <w:tabs>
+          <w:tab w:val="num" w:pos="3600"/>
+        </w:tabs>
+        <w:ind w:left="3600" w:hanging="360"/>
+      </w:pPr>
+    </w:lvl>
+    <w:lvl w:ilvl="5" w:tentative="1">
+      <w:start w:val="1"/>
+      <w:numFmt w:val="decimal"/>
+      <w:lvlText w:val="%6."/>
+      <w:lvlJc w:val="left"/>
+      <w:pPr>
+        <w:tabs>
+          <w:tab w:val="num" w:pos="4320"/>
+        </w:tabs>
+        <w:ind w:left="4320" w:hanging="360"/>
+      </w:pPr>
+    </w:lvl>
+    <w:lvl w:ilvl="6" w:tentative="1">
+      <w:start w:val="1"/>
+      <w:numFmt w:val="decimal"/>
+      <w:lvlText w:val="%7."/>
+      <w:lvlJc w:val="left"/>
+      <w:pPr>
+        <w:tabs>
+          <w:tab w:val="num" w:pos="5040"/>
+        </w:tabs>
+        <w:ind w:left="5040" w:hanging="360"/>
+      </w:pPr>
+    </w:lvl>
+    <w:lvl w:ilvl="7" w:tentative="1">
+      <w:start w:val="1"/>
+      <w:numFmt w:val="decimal"/>
+      <w:lvlText w:val="%8."/>
+      <w:lvlJc w:val="left"/>
+      <w:pPr>
+        <w:tabs>
+          <w:tab w:val="num" w:pos="5760"/>
+        </w:tabs>
+        <w:ind w:left="5760" w:hanging="360"/>
+      </w:pPr>
+    </w:lvl>
+    <w:lvl w:ilvl="8" w:tentative="1">
+      <w:start w:val="1"/>
+      <w:numFmt w:val="decimal"/>
+      <w:lvlText w:val="%9."/>
+      <w:lvlJc w:val="left"/>
+      <w:pPr>
+        <w:tabs>
+          <w:tab w:val="num" w:pos="6480"/>
+        </w:tabs>
+        <w:ind w:left="6480" w:hanging="360"/>
+      </w:pPr>
+    </w:lvl>
+  </w:abstractNum>
+  <w:abstractNum w:abstractNumId="17" w15:restartNumberingAfterBreak="0">
+    <w:nsid w:val="5E360151"/>
+    <w:multiLevelType w:val="multilevel"/>
+    <w:tmpl w:val="7E86742A"/>
+    <w:lvl w:ilvl="0">
+      <w:start w:val="1"/>
+      <w:numFmt w:val="decimal"/>
+      <w:lvlText w:val="%1."/>
+      <w:lvlJc w:val="left"/>
+      <w:pPr>
+        <w:tabs>
+          <w:tab w:val="num" w:pos="720"/>
+        </w:tabs>
+        <w:ind w:left="720" w:hanging="360"/>
+      </w:pPr>
+    </w:lvl>
+    <w:lvl w:ilvl="1">
+      <w:start w:val="1"/>
+      <w:numFmt w:val="bullet"/>
+      <w:lvlText w:val="o"/>
+      <w:lvlJc w:val="left"/>
+      <w:pPr>
+        <w:tabs>
+          <w:tab w:val="num" w:pos="1440"/>
+        </w:tabs>
+        <w:ind w:left="1440" w:hanging="360"/>
+      </w:pPr>
+      <w:rPr>
+        <w:rFonts w:ascii="Courier New" w:hAnsi="Courier New" w:hint="default"/>
+        <w:sz w:val="20"/>
+      </w:rPr>
+    </w:lvl>
+    <w:lvl w:ilvl="2" w:tentative="1">
+      <w:start w:val="1"/>
+      <w:numFmt w:val="decimal"/>
+      <w:lvlText w:val="%3."/>
+      <w:lvlJc w:val="left"/>
+      <w:pPr>
+        <w:tabs>
+          <w:tab w:val="num" w:pos="2160"/>
+        </w:tabs>
+        <w:ind w:left="2160" w:hanging="360"/>
+      </w:pPr>
+    </w:lvl>
+    <w:lvl w:ilvl="3" w:tentative="1">
+      <w:start w:val="1"/>
+      <w:numFmt w:val="decimal"/>
+      <w:lvlText w:val="%4."/>
+      <w:lvlJc w:val="left"/>
+      <w:pPr>
+        <w:tabs>
+          <w:tab w:val="num" w:pos="2880"/>
+        </w:tabs>
+        <w:ind w:left="2880" w:hanging="360"/>
+      </w:pPr>
+    </w:lvl>
+    <w:lvl w:ilvl="4" w:tentative="1">
+      <w:start w:val="1"/>
+      <w:numFmt w:val="decimal"/>
+      <w:lvlText w:val="%5."/>
+      <w:lvlJc w:val="left"/>
+      <w:pPr>
+        <w:tabs>
+          <w:tab w:val="num" w:pos="3600"/>
+        </w:tabs>
+        <w:ind w:left="3600" w:hanging="360"/>
+      </w:pPr>
+    </w:lvl>
+    <w:lvl w:ilvl="5" w:tentative="1">
+      <w:start w:val="1"/>
+      <w:numFmt w:val="decimal"/>
+      <w:lvlText w:val="%6."/>
+      <w:lvlJc w:val="left"/>
+      <w:pPr>
+        <w:tabs>
+          <w:tab w:val="num" w:pos="4320"/>
+        </w:tabs>
+        <w:ind w:left="4320" w:hanging="360"/>
+      </w:pPr>
+    </w:lvl>
+    <w:lvl w:ilvl="6" w:tentative="1">
+      <w:start w:val="1"/>
+      <w:numFmt w:val="decimal"/>
+      <w:lvlText w:val="%7."/>
+      <w:lvlJc w:val="left"/>
+      <w:pPr>
+        <w:tabs>
+          <w:tab w:val="num" w:pos="5040"/>
+        </w:tabs>
+        <w:ind w:left="5040" w:hanging="360"/>
+      </w:pPr>
+    </w:lvl>
+    <w:lvl w:ilvl="7" w:tentative="1">
+      <w:start w:val="1"/>
+      <w:numFmt w:val="decimal"/>
+      <w:lvlText w:val="%8."/>
+      <w:lvlJc w:val="left"/>
+      <w:pPr>
+        <w:tabs>
+          <w:tab w:val="num" w:pos="5760"/>
+        </w:tabs>
+        <w:ind w:left="5760" w:hanging="360"/>
+      </w:pPr>
+    </w:lvl>
+    <w:lvl w:ilvl="8" w:tentative="1">
+      <w:start w:val="1"/>
+      <w:numFmt w:val="decimal"/>
+      <w:lvlText w:val="%9."/>
+      <w:lvlJc w:val="left"/>
+      <w:pPr>
+        <w:tabs>
+          <w:tab w:val="num" w:pos="6480"/>
+        </w:tabs>
+        <w:ind w:left="6480" w:hanging="360"/>
+      </w:pPr>
+    </w:lvl>
+  </w:abstractNum>
+  <w:abstractNum w:abstractNumId="18" w15:restartNumberingAfterBreak="0">
     <w:nsid w:val="5FF20ACE"/>
     <w:multiLevelType w:val="multilevel"/>
     <w:tmpl w:val="54300600"/>
@@ -3811,7 +7151,7 @@
       </w:rPr>
     </w:lvl>
   </w:abstractNum>
-  <w:abstractNum w:abstractNumId="8" w15:restartNumberingAfterBreak="0">
+  <w:abstractNum w:abstractNumId="19" w15:restartNumberingAfterBreak="0">
     <w:nsid w:val="607D6EE7"/>
     <w:multiLevelType w:val="multilevel"/>
     <w:tmpl w:val="A600C958"/>
@@ -3960,7 +7300,156 @@
       </w:rPr>
     </w:lvl>
   </w:abstractNum>
-  <w:abstractNum w:abstractNumId="9" w15:restartNumberingAfterBreak="0">
+  <w:abstractNum w:abstractNumId="20" w15:restartNumberingAfterBreak="0">
+    <w:nsid w:val="61D7497E"/>
+    <w:multiLevelType w:val="multilevel"/>
+    <w:tmpl w:val="4666495E"/>
+    <w:lvl w:ilvl="0">
+      <w:start w:val="1"/>
+      <w:numFmt w:val="bullet"/>
+      <w:lvlText w:val=""/>
+      <w:lvlJc w:val="left"/>
+      <w:pPr>
+        <w:tabs>
+          <w:tab w:val="num" w:pos="720"/>
+        </w:tabs>
+        <w:ind w:left="720" w:hanging="360"/>
+      </w:pPr>
+      <w:rPr>
+        <w:rFonts w:ascii="Symbol" w:hAnsi="Symbol" w:hint="default"/>
+        <w:sz w:val="20"/>
+      </w:rPr>
+    </w:lvl>
+    <w:lvl w:ilvl="1">
+      <w:start w:val="1"/>
+      <w:numFmt w:val="bullet"/>
+      <w:lvlText w:val="o"/>
+      <w:lvlJc w:val="left"/>
+      <w:pPr>
+        <w:tabs>
+          <w:tab w:val="num" w:pos="1440"/>
+        </w:tabs>
+        <w:ind w:left="1440" w:hanging="360"/>
+      </w:pPr>
+      <w:rPr>
+        <w:rFonts w:ascii="Courier New" w:hAnsi="Courier New" w:hint="default"/>
+        <w:sz w:val="20"/>
+      </w:rPr>
+    </w:lvl>
+    <w:lvl w:ilvl="2" w:tentative="1">
+      <w:start w:val="1"/>
+      <w:numFmt w:val="bullet"/>
+      <w:lvlText w:val=""/>
+      <w:lvlJc w:val="left"/>
+      <w:pPr>
+        <w:tabs>
+          <w:tab w:val="num" w:pos="2160"/>
+        </w:tabs>
+        <w:ind w:left="2160" w:hanging="360"/>
+      </w:pPr>
+      <w:rPr>
+        <w:rFonts w:ascii="Wingdings" w:hAnsi="Wingdings" w:hint="default"/>
+        <w:sz w:val="20"/>
+      </w:rPr>
+    </w:lvl>
+    <w:lvl w:ilvl="3" w:tentative="1">
+      <w:start w:val="1"/>
+      <w:numFmt w:val="bullet"/>
+      <w:lvlText w:val=""/>
+      <w:lvlJc w:val="left"/>
+      <w:pPr>
+        <w:tabs>
+          <w:tab w:val="num" w:pos="2880"/>
+        </w:tabs>
+        <w:ind w:left="2880" w:hanging="360"/>
+      </w:pPr>
+      <w:rPr>
+        <w:rFonts w:ascii="Wingdings" w:hAnsi="Wingdings" w:hint="default"/>
+        <w:sz w:val="20"/>
+      </w:rPr>
+    </w:lvl>
+    <w:lvl w:ilvl="4" w:tentative="1">
+      <w:start w:val="1"/>
+      <w:numFmt w:val="bullet"/>
+      <w:lvlText w:val=""/>
+      <w:lvlJc w:val="left"/>
+      <w:pPr>
+        <w:tabs>
+          <w:tab w:val="num" w:pos="3600"/>
+        </w:tabs>
+        <w:ind w:left="3600" w:hanging="360"/>
+      </w:pPr>
+      <w:rPr>
+        <w:rFonts w:ascii="Wingdings" w:hAnsi="Wingdings" w:hint="default"/>
+        <w:sz w:val="20"/>
+      </w:rPr>
+    </w:lvl>
+    <w:lvl w:ilvl="5" w:tentative="1">
+      <w:start w:val="1"/>
+      <w:numFmt w:val="bullet"/>
+      <w:lvlText w:val=""/>
+      <w:lvlJc w:val="left"/>
+      <w:pPr>
+        <w:tabs>
+          <w:tab w:val="num" w:pos="4320"/>
+        </w:tabs>
+        <w:ind w:left="4320" w:hanging="360"/>
+      </w:pPr>
+      <w:rPr>
+        <w:rFonts w:ascii="Wingdings" w:hAnsi="Wingdings" w:hint="default"/>
+        <w:sz w:val="20"/>
+      </w:rPr>
+    </w:lvl>
+    <w:lvl w:ilvl="6" w:tentative="1">
+      <w:start w:val="1"/>
+      <w:numFmt w:val="bullet"/>
+      <w:lvlText w:val=""/>
+      <w:lvlJc w:val="left"/>
+      <w:pPr>
+        <w:tabs>
+          <w:tab w:val="num" w:pos="5040"/>
+        </w:tabs>
+        <w:ind w:left="5040" w:hanging="360"/>
+      </w:pPr>
+      <w:rPr>
+        <w:rFonts w:ascii="Wingdings" w:hAnsi="Wingdings" w:hint="default"/>
+        <w:sz w:val="20"/>
+      </w:rPr>
+    </w:lvl>
+    <w:lvl w:ilvl="7" w:tentative="1">
+      <w:start w:val="1"/>
+      <w:numFmt w:val="bullet"/>
+      <w:lvlText w:val=""/>
+      <w:lvlJc w:val="left"/>
+      <w:pPr>
+        <w:tabs>
+          <w:tab w:val="num" w:pos="5760"/>
+        </w:tabs>
+        <w:ind w:left="5760" w:hanging="360"/>
+      </w:pPr>
+      <w:rPr>
+        <w:rFonts w:ascii="Wingdings" w:hAnsi="Wingdings" w:hint="default"/>
+        <w:sz w:val="20"/>
+      </w:rPr>
+    </w:lvl>
+    <w:lvl w:ilvl="8" w:tentative="1">
+      <w:start w:val="1"/>
+      <w:numFmt w:val="bullet"/>
+      <w:lvlText w:val=""/>
+      <w:lvlJc w:val="left"/>
+      <w:pPr>
+        <w:tabs>
+          <w:tab w:val="num" w:pos="6480"/>
+        </w:tabs>
+        <w:ind w:left="6480" w:hanging="360"/>
+      </w:pPr>
+      <w:rPr>
+        <w:rFonts w:ascii="Wingdings" w:hAnsi="Wingdings" w:hint="default"/>
+        <w:sz w:val="20"/>
+      </w:rPr>
+    </w:lvl>
+  </w:abstractNum>
+  <w:abstractNum w:abstractNumId="21" w15:restartNumberingAfterBreak="0">
     <w:nsid w:val="6CE30487"/>
     <w:multiLevelType w:val="multilevel"/>
     <w:tmpl w:val="54300600"/>
@@ -4110,34 +7599,70 @@
     </w:lvl>
   </w:abstractNum>
   <w:num w:numId="1" w16cid:durableId="1224100648">
+    <w:abstractNumId w:val="13"/>
+  </w:num>
+  <w:num w:numId="2" w16cid:durableId="462499139">
+    <w:abstractNumId w:val="4"/>
+  </w:num>
+  <w:num w:numId="3" w16cid:durableId="1084182276">
+    <w:abstractNumId w:val="9"/>
+  </w:num>
+  <w:num w:numId="4" w16cid:durableId="1293175750">
     <w:abstractNumId w:val="6"/>
   </w:num>
-  <w:num w:numId="2" w16cid:durableId="462499139">
-    <w:abstractNumId w:val="1"/>
-  </w:num>
-  <w:num w:numId="3" w16cid:durableId="1084182276">
-    <w:abstractNumId w:val="4"/>
-  </w:num>
-  <w:num w:numId="4" w16cid:durableId="1293175750">
-    <w:abstractNumId w:val="2"/>
-  </w:num>
   <w:num w:numId="5" w16cid:durableId="1385904858">
-    <w:abstractNumId w:val="5"/>
+    <w:abstractNumId w:val="11"/>
   </w:num>
   <w:num w:numId="6" w16cid:durableId="422070613">
     <w:abstractNumId w:val="0"/>
   </w:num>
   <w:num w:numId="7" w16cid:durableId="1072509075">
+    <w:abstractNumId w:val="18"/>
+  </w:num>
+  <w:num w:numId="8" w16cid:durableId="1033917594">
+    <w:abstractNumId w:val="21"/>
+  </w:num>
+  <w:num w:numId="9" w16cid:durableId="1983844424">
+    <w:abstractNumId w:val="19"/>
+  </w:num>
+  <w:num w:numId="10" w16cid:durableId="944072138">
     <w:abstractNumId w:val="7"/>
   </w:num>
-  <w:num w:numId="8" w16cid:durableId="1033917594">
-    <w:abstractNumId w:val="9"/>
+  <w:num w:numId="11" w16cid:durableId="56587562">
+    <w:abstractNumId w:val="10"/>
   </w:num>
-  <w:num w:numId="9" w16cid:durableId="1983844424">
+  <w:num w:numId="12" w16cid:durableId="2083141574">
+    <w:abstractNumId w:val="20"/>
+  </w:num>
+  <w:num w:numId="13" w16cid:durableId="1862665189">
+    <w:abstractNumId w:val="16"/>
+  </w:num>
+  <w:num w:numId="14" w16cid:durableId="442499905">
+    <w:abstractNumId w:val="2"/>
+  </w:num>
+  <w:num w:numId="15" w16cid:durableId="1024480338">
+    <w:abstractNumId w:val="5"/>
+  </w:num>
+  <w:num w:numId="16" w16cid:durableId="1187333779">
     <w:abstractNumId w:val="8"/>
   </w:num>
-  <w:num w:numId="10" w16cid:durableId="944072138">
+  <w:num w:numId="17" w16cid:durableId="288173027">
+    <w:abstractNumId w:val="12"/>
+  </w:num>
+  <w:num w:numId="18" w16cid:durableId="2133009390">
+    <w:abstractNumId w:val="17"/>
+  </w:num>
+  <w:num w:numId="19" w16cid:durableId="256211631">
     <w:abstractNumId w:val="3"/>
+  </w:num>
+  <w:num w:numId="20" w16cid:durableId="1076324272">
+    <w:abstractNumId w:val="14"/>
+  </w:num>
+  <w:num w:numId="21" w16cid:durableId="1222717958">
+    <w:abstractNumId w:val="1"/>
+  </w:num>
+  <w:num w:numId="22" w16cid:durableId="1904679948">
+    <w:abstractNumId w:val="15"/>
   </w:num>
 </w:numbering>
 </file>
@@ -4745,6 +8270,7 @@
   <w:style w:type="character" w:default="1" w:styleId="DefaultParagraphFont">
     <w:name w:val="Default Paragraph Font"/>
     <w:uiPriority w:val="1"/>
+    <w:semiHidden/>
     <w:unhideWhenUsed/>
   </w:style>
   <w:style w:type="table" w:default="1" w:styleId="TableNormal">

</xml_diff>

<commit_message>
Successfully On The Air!
</commit_message>
<xml_diff>
--- a/DIY_Hotspot/DIY_Hotspot_Project_Management.docx
+++ b/DIY_Hotspot/DIY_Hotspot_Project_Management.docx
@@ -97,7 +97,25 @@
           <w:iCs/>
           <w:strike/>
         </w:rPr>
-        <w:t xml:space="preserve">Check uSD Card Inventory </w:t>
+        <w:t xml:space="preserve">Check </w:t>
+      </w:r>
+      <w:proofErr w:type="spellStart"/>
+      <w:r>
+        <w:rPr>
+          <w:i/>
+          <w:iCs/>
+          <w:strike/>
+        </w:rPr>
+        <w:t>uSD</w:t>
+      </w:r>
+      <w:proofErr w:type="spellEnd"/>
+      <w:r>
+        <w:rPr>
+          <w:i/>
+          <w:iCs/>
+          <w:strike/>
+        </w:rPr>
+        <w:t xml:space="preserve"> Card Inventory </w:t>
       </w:r>
     </w:p>
     <w:p>
@@ -564,7 +582,7 @@
         </w:rPr>
         <w:lastRenderedPageBreak/>
         <w:drawing>
-          <wp:inline distT="0" distB="0" distL="0" distR="0" wp14:anchorId="016F343B" wp14:editId="7D2D9AFA">
+          <wp:inline distT="0" distB="0" distL="0" distR="0" wp14:anchorId="016F343B" wp14:editId="2574E1A7">
             <wp:extent cx="4572000" cy="4267200"/>
             <wp:effectExtent l="0" t="0" r="0" b="0"/>
             <wp:docPr id="1432228605" name="Picture 4"/>
@@ -877,7 +895,23 @@
     <w:p/>
     <w:p>
       <w:r>
-        <w:t xml:space="preserve">New uSD Card DS 2 dot Validrive Report </w:t>
+        <w:t xml:space="preserve">New </w:t>
+      </w:r>
+      <w:proofErr w:type="spellStart"/>
+      <w:r>
+        <w:t>uSD</w:t>
+      </w:r>
+      <w:proofErr w:type="spellEnd"/>
+      <w:r>
+        <w:t xml:space="preserve"> Card DS 2 dot </w:t>
+      </w:r>
+      <w:proofErr w:type="spellStart"/>
+      <w:r>
+        <w:t>Validrive</w:t>
+      </w:r>
+      <w:proofErr w:type="spellEnd"/>
+      <w:r>
+        <w:t xml:space="preserve"> Report </w:t>
       </w:r>
       <w:r>
         <w:rPr>
@@ -1133,8 +1167,13 @@
           </w:tcPr>
           <w:p>
             <w:r>
-              <w:t> storage_device</w:t>
+              <w:t> </w:t>
             </w:r>
+            <w:proofErr w:type="spellStart"/>
+            <w:r>
+              <w:t>storage_device</w:t>
+            </w:r>
+            <w:proofErr w:type="spellEnd"/>
           </w:p>
         </w:tc>
       </w:tr>
@@ -1932,8 +1971,21 @@
       </w:r>
     </w:p>
     <w:p>
-      <w:r>
-        <w:t>CertUtil: -hashfile command completed successfully.</w:t>
+      <w:proofErr w:type="spellStart"/>
+      <w:r>
+        <w:t>CertUtil</w:t>
+      </w:r>
+      <w:proofErr w:type="spellEnd"/>
+      <w:r>
+        <w:t>: -</w:t>
+      </w:r>
+      <w:proofErr w:type="spellStart"/>
+      <w:r>
+        <w:t>hashfile</w:t>
+      </w:r>
+      <w:proofErr w:type="spellEnd"/>
+      <w:r>
+        <w:t xml:space="preserve"> command completed successfully.</w:t>
       </w:r>
     </w:p>
     <w:p/>
@@ -2135,7 +2187,21 @@
         <w:rPr>
           <w:color w:val="00B050"/>
         </w:rPr>
-        <w:t>Click "Select" to choose the Pi-Star .img file you extracted.</w:t>
+        <w:t>Click "Select" to choose the Pi-Star .</w:t>
+      </w:r>
+      <w:proofErr w:type="spellStart"/>
+      <w:r>
+        <w:rPr>
+          <w:color w:val="00B050"/>
+        </w:rPr>
+        <w:t>img</w:t>
+      </w:r>
+      <w:proofErr w:type="spellEnd"/>
+      <w:r>
+        <w:rPr>
+          <w:color w:val="00B050"/>
+        </w:rPr>
+        <w:t xml:space="preserve"> file you extracted.</w:t>
       </w:r>
     </w:p>
     <w:p>
@@ -2266,8 +2332,13 @@
       </w:r>
       <w:r>
         <w:br/>
-        <w:t>download, and then flash the image to your SD card (using your prefered</w:t>
-      </w:r>
+        <w:t xml:space="preserve">download, and then flash the image to your SD card (using your </w:t>
+      </w:r>
+      <w:proofErr w:type="spellStart"/>
+      <w:r>
+        <w:t>prefered</w:t>
+      </w:r>
+      <w:proofErr w:type="spellEnd"/>
       <w:r>
         <w:br/>
         <w:t>image writing tool - see links below for some basic instructions), boot the</w:t>
@@ -2424,7 +2495,25 @@
           <w:bCs/>
           <w:color w:val="00B050"/>
         </w:rPr>
-        <w:t>?) needs the legcy OS – Try That</w:t>
+        <w:t xml:space="preserve">?) needs the </w:t>
+      </w:r>
+      <w:proofErr w:type="spellStart"/>
+      <w:r>
+        <w:rPr>
+          <w:b/>
+          <w:bCs/>
+          <w:color w:val="00B050"/>
+        </w:rPr>
+        <w:t>legcy</w:t>
+      </w:r>
+      <w:proofErr w:type="spellEnd"/>
+      <w:r>
+        <w:rPr>
+          <w:b/>
+          <w:bCs/>
+          <w:color w:val="00B050"/>
+        </w:rPr>
+        <w:t xml:space="preserve"> OS – Try That</w:t>
       </w:r>
       <w:r>
         <w:rPr>
@@ -2462,7 +2551,25 @@
           <w:bCs/>
           <w:color w:val="00B050"/>
         </w:rPr>
-        <w:t>Successfully SSH’d in via Putty and ran OS updates</w:t>
+        <w:t xml:space="preserve">Successfully </w:t>
+      </w:r>
+      <w:proofErr w:type="spellStart"/>
+      <w:r>
+        <w:rPr>
+          <w:b/>
+          <w:bCs/>
+          <w:color w:val="00B050"/>
+        </w:rPr>
+        <w:t>SSH’d</w:t>
+      </w:r>
+      <w:proofErr w:type="spellEnd"/>
+      <w:r>
+        <w:rPr>
+          <w:b/>
+          <w:bCs/>
+          <w:color w:val="00B050"/>
+        </w:rPr>
+        <w:t xml:space="preserve"> in via Putty and ran OS updates</w:t>
       </w:r>
       <w:r>
         <w:rPr>
@@ -2486,13 +2593,23 @@
           <w:color w:val="00B050"/>
         </w:rPr>
       </w:pPr>
+      <w:proofErr w:type="spellStart"/>
       <w:r>
         <w:rPr>
           <w:b/>
           <w:bCs/>
           <w:color w:val="00B050"/>
         </w:rPr>
-        <w:t>sudo apt-get update</w:t>
+        <w:t>sudo</w:t>
+      </w:r>
+      <w:proofErr w:type="spellEnd"/>
+      <w:r>
+        <w:rPr>
+          <w:b/>
+          <w:bCs/>
+          <w:color w:val="00B050"/>
+        </w:rPr>
+        <w:t xml:space="preserve"> apt-get update</w:t>
       </w:r>
     </w:p>
     <w:p>
@@ -2508,13 +2625,23 @@
           <w:color w:val="00B050"/>
         </w:rPr>
       </w:pPr>
+      <w:proofErr w:type="spellStart"/>
       <w:r>
         <w:rPr>
           <w:b/>
           <w:bCs/>
           <w:color w:val="00B050"/>
         </w:rPr>
-        <w:t>sudo apt-get upgrade</w:t>
+        <w:t>sudo</w:t>
+      </w:r>
+      <w:proofErr w:type="spellEnd"/>
+      <w:r>
+        <w:rPr>
+          <w:b/>
+          <w:bCs/>
+          <w:color w:val="00B050"/>
+        </w:rPr>
+        <w:t xml:space="preserve"> apt-get upgrade</w:t>
       </w:r>
     </w:p>
     <w:p>
@@ -2530,46 +2657,97 @@
           <w:color w:val="00B050"/>
         </w:rPr>
       </w:pPr>
+      <w:proofErr w:type="spellStart"/>
       <w:r>
         <w:rPr>
           <w:b/>
           <w:bCs/>
           <w:color w:val="00B050"/>
         </w:rPr>
-        <w:t>sudo apt-get dist-upgrade</w:t>
-      </w:r>
-    </w:p>
-    <w:p>
-      <w:pPr>
+        <w:t>sudo</w:t>
+      </w:r>
+      <w:proofErr w:type="spellEnd"/>
+      <w:r>
         <w:rPr>
           <w:b/>
           <w:bCs/>
           <w:color w:val="00B050"/>
         </w:rPr>
-      </w:pPr>
-    </w:p>
-    <w:p>
-      <w:pPr>
+        <w:t xml:space="preserve"> apt-get </w:t>
+      </w:r>
+      <w:proofErr w:type="spellStart"/>
+      <w:r>
         <w:rPr>
           <w:b/>
           <w:bCs/>
           <w:color w:val="00B050"/>
         </w:rPr>
-      </w:pPr>
-    </w:p>
-    <w:p>
-      <w:r>
-        <w:t>sudo apt-get update</w:t>
-      </w:r>
-    </w:p>
-    <w:p>
-      <w:r>
-        <w:t>sudo apt-get upgrade</w:t>
-      </w:r>
-    </w:p>
-    <w:p>
-      <w:r>
-        <w:t>sudo apt-get dist-upgrade</w:t>
+        <w:t>dist</w:t>
+      </w:r>
+      <w:proofErr w:type="spellEnd"/>
+      <w:r>
+        <w:rPr>
+          <w:b/>
+          <w:bCs/>
+          <w:color w:val="00B050"/>
+        </w:rPr>
+        <w:t>-upgrade</w:t>
+      </w:r>
+    </w:p>
+    <w:p>
+      <w:pPr>
+        <w:rPr>
+          <w:b/>
+          <w:bCs/>
+          <w:color w:val="00B050"/>
+        </w:rPr>
+      </w:pPr>
+    </w:p>
+    <w:p>
+      <w:pPr>
+        <w:rPr>
+          <w:b/>
+          <w:bCs/>
+          <w:color w:val="00B050"/>
+        </w:rPr>
+      </w:pPr>
+    </w:p>
+    <w:p>
+      <w:proofErr w:type="spellStart"/>
+      <w:r>
+        <w:t>sudo</w:t>
+      </w:r>
+      <w:proofErr w:type="spellEnd"/>
+      <w:r>
+        <w:t xml:space="preserve"> apt-get update</w:t>
+      </w:r>
+    </w:p>
+    <w:p>
+      <w:proofErr w:type="spellStart"/>
+      <w:r>
+        <w:t>sudo</w:t>
+      </w:r>
+      <w:proofErr w:type="spellEnd"/>
+      <w:r>
+        <w:t xml:space="preserve"> apt-get upgrade</w:t>
+      </w:r>
+    </w:p>
+    <w:p>
+      <w:proofErr w:type="spellStart"/>
+      <w:r>
+        <w:t>sudo</w:t>
+      </w:r>
+      <w:proofErr w:type="spellEnd"/>
+      <w:r>
+        <w:t xml:space="preserve"> apt-get </w:t>
+      </w:r>
+      <w:proofErr w:type="spellStart"/>
+      <w:r>
+        <w:t>dist</w:t>
+      </w:r>
+      <w:proofErr w:type="spellEnd"/>
+      <w:r>
+        <w:t>-upgrade</w:t>
       </w:r>
     </w:p>
     <w:p>
@@ -2578,13 +2756,23 @@
       </w:r>
     </w:p>
     <w:p>
-      <w:r>
-        <w:t>sudo reboot</w:t>
-      </w:r>
-    </w:p>
-    <w:p>
-      <w:r>
-        <w:t xml:space="preserve">sudo </w:t>
+      <w:proofErr w:type="spellStart"/>
+      <w:r>
+        <w:t>sudo</w:t>
+      </w:r>
+      <w:proofErr w:type="spellEnd"/>
+      <w:r>
+        <w:t xml:space="preserve"> reboot</w:t>
+      </w:r>
+    </w:p>
+    <w:p>
+      <w:proofErr w:type="spellStart"/>
+      <w:r>
+        <w:t>sudo</w:t>
+      </w:r>
+      <w:proofErr w:type="spellEnd"/>
+      <w:r>
+        <w:t xml:space="preserve"> </w:t>
       </w:r>
       <w:r>
         <w:t>shutdown -h now</w:t>
@@ -2768,6 +2956,7 @@
         <w:rPr>
           <w:b/>
           <w:bCs/>
+          <w:noProof/>
         </w:rPr>
         <w:lastRenderedPageBreak/>
         <w:drawing>
@@ -2806,6 +2995,94 @@
           </wp:inline>
         </w:drawing>
       </w:r>
+    </w:p>
+    <w:p>
+      <w:pPr>
+        <w:rPr>
+          <w:b/>
+          <w:bCs/>
+        </w:rPr>
+      </w:pPr>
+    </w:p>
+    <w:p>
+      <w:pPr>
+        <w:rPr>
+          <w:b/>
+          <w:bCs/>
+        </w:rPr>
+      </w:pPr>
+    </w:p>
+    <w:p>
+      <w:pPr>
+        <w:rPr>
+          <w:b/>
+          <w:bCs/>
+        </w:rPr>
+      </w:pPr>
+    </w:p>
+    <w:p>
+      <w:pPr>
+        <w:rPr>
+          <w:b/>
+          <w:bCs/>
+          <w:color w:val="00B050"/>
+          <w:sz w:val="40"/>
+          <w:szCs w:val="40"/>
+          <w:u w:val="single"/>
+        </w:rPr>
+      </w:pPr>
+      <w:r>
+        <w:rPr>
+          <w:b/>
+          <w:bCs/>
+          <w:color w:val="00B050"/>
+          <w:sz w:val="40"/>
+          <w:szCs w:val="40"/>
+          <w:u w:val="single"/>
+        </w:rPr>
+        <w:t xml:space="preserve">Successfully set up the Hotspot and </w:t>
+      </w:r>
+      <w:r>
+        <w:rPr>
+          <w:b/>
+          <w:bCs/>
+          <w:color w:val="00B050"/>
+          <w:sz w:val="40"/>
+          <w:szCs w:val="40"/>
+          <w:u w:val="single"/>
+        </w:rPr>
+        <w:t>entered it in the TH-D74.</w:t>
+      </w:r>
+    </w:p>
+    <w:p>
+      <w:pPr>
+        <w:rPr>
+          <w:b/>
+          <w:bCs/>
+        </w:rPr>
+      </w:pPr>
+      <w:r>
+        <w:rPr>
+          <w:b/>
+          <w:bCs/>
+          <w:color w:val="00B050"/>
+          <w:sz w:val="40"/>
+          <w:szCs w:val="40"/>
+          <w:u w:val="single"/>
+        </w:rPr>
+        <w:t xml:space="preserve">Successfully linked to reflector and </w:t>
+      </w:r>
+      <w:r>
+        <w:rPr>
+          <w:b/>
+          <w:bCs/>
+          <w:color w:val="00B050"/>
+          <w:sz w:val="40"/>
+          <w:szCs w:val="40"/>
+          <w:u w:val="single"/>
+        </w:rPr>
+        <w:t>did Info and Echo Test</w:t>
+      </w:r>
       <w:r>
         <w:rPr>
           <w:b/>
@@ -2835,7 +3112,23 @@
           <w:bCs/>
         </w:rPr>
         <w:br/>
-        <w:t>Setting up a JumboSpot MMDVM with Pi-Star for D-Star is a solid choice if you want your own compact hotspot. I’ll walk you through it step-by-step.</w:t>
+        <w:t xml:space="preserve">Setting up a </w:t>
+      </w:r>
+      <w:proofErr w:type="spellStart"/>
+      <w:r>
+        <w:rPr>
+          <w:b/>
+          <w:bCs/>
+        </w:rPr>
+        <w:t>JumboSpot</w:t>
+      </w:r>
+      <w:proofErr w:type="spellEnd"/>
+      <w:r>
+        <w:rPr>
+          <w:b/>
+          <w:bCs/>
+        </w:rPr>
+        <w:t xml:space="preserve"> MMDVM with Pi-Star for D-Star is a solid choice if you want your own compact hotspot. I’ll walk you through it step-by-step.</w:t>
       </w:r>
     </w:p>
     <w:p>
@@ -2920,12 +3213,37 @@
           <w:bCs/>
         </w:rPr>
       </w:pPr>
-      <w:r>
-        <w:rPr>
-          <w:b/>
-          <w:bCs/>
-        </w:rPr>
-        <w:t>JumboSpot board (MMDVM board with onboard WiFi, usually single board)</w:t>
+      <w:proofErr w:type="spellStart"/>
+      <w:r>
+        <w:rPr>
+          <w:b/>
+          <w:bCs/>
+        </w:rPr>
+        <w:t>JumboSpot</w:t>
+      </w:r>
+      <w:proofErr w:type="spellEnd"/>
+      <w:r>
+        <w:rPr>
+          <w:b/>
+          <w:bCs/>
+        </w:rPr>
+        <w:t xml:space="preserve"> board (MMDVM board with onboard </w:t>
+      </w:r>
+      <w:proofErr w:type="spellStart"/>
+      <w:r>
+        <w:rPr>
+          <w:b/>
+          <w:bCs/>
+        </w:rPr>
+        <w:t>WiFi</w:t>
+      </w:r>
+      <w:proofErr w:type="spellEnd"/>
+      <w:r>
+        <w:rPr>
+          <w:b/>
+          <w:bCs/>
+        </w:rPr>
+        <w:t>, usually single board)</w:t>
       </w:r>
     </w:p>
     <w:p>
@@ -3091,6 +3409,7 @@
         </w:rPr>
       </w:pPr>
       <w:hyperlink r:id="rId22" w:history="1">
+        <w:proofErr w:type="spellStart"/>
         <w:r>
           <w:rPr>
             <w:rStyle w:val="Hyperlink"/>
@@ -3100,6 +3419,7 @@
           </w:rPr>
           <w:t>balenaEtcher</w:t>
         </w:r>
+        <w:proofErr w:type="spellEnd"/>
       </w:hyperlink>
       <w:r>
         <w:rPr>
@@ -3203,7 +3523,23 @@
           <w:b/>
           <w:bCs/>
         </w:rPr>
-        <w:t>Use balenaEtcher to burn the .zip file directly to your microSD card.</w:t>
+        <w:t xml:space="preserve">Use </w:t>
+      </w:r>
+      <w:proofErr w:type="spellStart"/>
+      <w:r>
+        <w:rPr>
+          <w:b/>
+          <w:bCs/>
+        </w:rPr>
+        <w:t>balenaEtcher</w:t>
+      </w:r>
+      <w:proofErr w:type="spellEnd"/>
+      <w:r>
+        <w:rPr>
+          <w:b/>
+          <w:bCs/>
+        </w:rPr>
+        <w:t xml:space="preserve"> to burn the .zip file directly to your microSD card.</w:t>
       </w:r>
     </w:p>
     <w:p>
@@ -3309,7 +3645,23 @@
           <w:bCs/>
         </w:rPr>
         <w:lastRenderedPageBreak/>
-        <w:t>In the boot partition of the SD card, create a file called wpa_supplicant.conf.</w:t>
+        <w:t xml:space="preserve">In the boot partition of the SD card, create a file called </w:t>
+      </w:r>
+      <w:proofErr w:type="spellStart"/>
+      <w:r>
+        <w:rPr>
+          <w:b/>
+          <w:bCs/>
+        </w:rPr>
+        <w:t>wpa_supplicant.conf</w:t>
+      </w:r>
+      <w:proofErr w:type="spellEnd"/>
+      <w:r>
+        <w:rPr>
+          <w:b/>
+          <w:bCs/>
+        </w:rPr>
+        <w:t>.</w:t>
       </w:r>
     </w:p>
     <w:p>
@@ -3353,27 +3705,70 @@
           <w:bCs/>
         </w:rPr>
       </w:pPr>
-      <w:r>
-        <w:rPr>
-          <w:b/>
-          <w:bCs/>
-        </w:rPr>
-        <w:t>ctrl_interface=DIR=/var/run/wpa_supplicant GROUP=netdev</w:t>
-      </w:r>
-    </w:p>
-    <w:p>
-      <w:pPr>
-        <w:rPr>
-          <w:b/>
-          <w:bCs/>
-        </w:rPr>
-      </w:pPr>
-      <w:r>
-        <w:rPr>
-          <w:b/>
-          <w:bCs/>
-        </w:rPr>
-        <w:t>update_config=1</w:t>
+      <w:proofErr w:type="spellStart"/>
+      <w:r>
+        <w:rPr>
+          <w:b/>
+          <w:bCs/>
+        </w:rPr>
+        <w:t>ctrl_interface</w:t>
+      </w:r>
+      <w:proofErr w:type="spellEnd"/>
+      <w:r>
+        <w:rPr>
+          <w:b/>
+          <w:bCs/>
+        </w:rPr>
+        <w:t>=DIR=/var/run/</w:t>
+      </w:r>
+      <w:proofErr w:type="spellStart"/>
+      <w:r>
+        <w:rPr>
+          <w:b/>
+          <w:bCs/>
+        </w:rPr>
+        <w:t>wpa_supplicant</w:t>
+      </w:r>
+      <w:proofErr w:type="spellEnd"/>
+      <w:r>
+        <w:rPr>
+          <w:b/>
+          <w:bCs/>
+        </w:rPr>
+        <w:t xml:space="preserve"> GROUP=</w:t>
+      </w:r>
+      <w:proofErr w:type="spellStart"/>
+      <w:r>
+        <w:rPr>
+          <w:b/>
+          <w:bCs/>
+        </w:rPr>
+        <w:t>netdev</w:t>
+      </w:r>
+      <w:proofErr w:type="spellEnd"/>
+    </w:p>
+    <w:p>
+      <w:pPr>
+        <w:rPr>
+          <w:b/>
+          <w:bCs/>
+        </w:rPr>
+      </w:pPr>
+      <w:proofErr w:type="spellStart"/>
+      <w:r>
+        <w:rPr>
+          <w:b/>
+          <w:bCs/>
+        </w:rPr>
+        <w:t>update_config</w:t>
+      </w:r>
+      <w:proofErr w:type="spellEnd"/>
+      <w:r>
+        <w:rPr>
+          <w:b/>
+          <w:bCs/>
+        </w:rPr>
+        <w:t>=1</w:t>
       </w:r>
     </w:p>
     <w:p>
@@ -3420,37 +3815,117 @@
           <w:b/>
           <w:bCs/>
         </w:rPr>
-        <w:t xml:space="preserve">    ssid="YourWiFiNetworkName"</w:t>
-      </w:r>
-    </w:p>
-    <w:p>
-      <w:pPr>
-        <w:rPr>
-          <w:b/>
-          <w:bCs/>
-        </w:rPr>
-      </w:pPr>
-      <w:r>
-        <w:rPr>
-          <w:b/>
-          <w:bCs/>
-        </w:rPr>
-        <w:t xml:space="preserve">    psk="YourWiFiPassword"</w:t>
-      </w:r>
-    </w:p>
-    <w:p>
-      <w:pPr>
-        <w:rPr>
-          <w:b/>
-          <w:bCs/>
-        </w:rPr>
-      </w:pPr>
-      <w:r>
-        <w:rPr>
-          <w:b/>
-          <w:bCs/>
-        </w:rPr>
-        <w:t xml:space="preserve">    scan_ssid=1</w:t>
+        <w:t xml:space="preserve">    </w:t>
+      </w:r>
+      <w:proofErr w:type="spellStart"/>
+      <w:r>
+        <w:rPr>
+          <w:b/>
+          <w:bCs/>
+        </w:rPr>
+        <w:t>ssid</w:t>
+      </w:r>
+      <w:proofErr w:type="spellEnd"/>
+      <w:r>
+        <w:rPr>
+          <w:b/>
+          <w:bCs/>
+        </w:rPr>
+        <w:t>="</w:t>
+      </w:r>
+      <w:proofErr w:type="spellStart"/>
+      <w:r>
+        <w:rPr>
+          <w:b/>
+          <w:bCs/>
+        </w:rPr>
+        <w:t>YourWiFiNetworkName</w:t>
+      </w:r>
+      <w:proofErr w:type="spellEnd"/>
+      <w:r>
+        <w:rPr>
+          <w:b/>
+          <w:bCs/>
+        </w:rPr>
+        <w:t>"</w:t>
+      </w:r>
+    </w:p>
+    <w:p>
+      <w:pPr>
+        <w:rPr>
+          <w:b/>
+          <w:bCs/>
+        </w:rPr>
+      </w:pPr>
+      <w:r>
+        <w:rPr>
+          <w:b/>
+          <w:bCs/>
+        </w:rPr>
+        <w:t xml:space="preserve">    </w:t>
+      </w:r>
+      <w:proofErr w:type="spellStart"/>
+      <w:r>
+        <w:rPr>
+          <w:b/>
+          <w:bCs/>
+        </w:rPr>
+        <w:t>psk</w:t>
+      </w:r>
+      <w:proofErr w:type="spellEnd"/>
+      <w:r>
+        <w:rPr>
+          <w:b/>
+          <w:bCs/>
+        </w:rPr>
+        <w:t>="</w:t>
+      </w:r>
+      <w:proofErr w:type="spellStart"/>
+      <w:r>
+        <w:rPr>
+          <w:b/>
+          <w:bCs/>
+        </w:rPr>
+        <w:t>YourWiFiPassword</w:t>
+      </w:r>
+      <w:proofErr w:type="spellEnd"/>
+      <w:r>
+        <w:rPr>
+          <w:b/>
+          <w:bCs/>
+        </w:rPr>
+        <w:t>"</w:t>
+      </w:r>
+    </w:p>
+    <w:p>
+      <w:pPr>
+        <w:rPr>
+          <w:b/>
+          <w:bCs/>
+        </w:rPr>
+      </w:pPr>
+      <w:r>
+        <w:rPr>
+          <w:b/>
+          <w:bCs/>
+        </w:rPr>
+        <w:t xml:space="preserve">    </w:t>
+      </w:r>
+      <w:proofErr w:type="spellStart"/>
+      <w:r>
+        <w:rPr>
+          <w:b/>
+          <w:bCs/>
+        </w:rPr>
+        <w:t>scan_ssid</w:t>
+      </w:r>
+      <w:proofErr w:type="spellEnd"/>
+      <w:r>
+        <w:rPr>
+          <w:b/>
+          <w:bCs/>
+        </w:rPr>
+        <w:t>=1</w:t>
       </w:r>
     </w:p>
     <w:p>
@@ -3577,7 +4052,23 @@
           <w:b/>
           <w:bCs/>
         </w:rPr>
-        <w:t>Mount the JumboSpot onto the Raspberry Pi (GPIO header).</w:t>
+        <w:t xml:space="preserve">Mount the </w:t>
+      </w:r>
+      <w:proofErr w:type="spellStart"/>
+      <w:r>
+        <w:rPr>
+          <w:b/>
+          <w:bCs/>
+        </w:rPr>
+        <w:t>JumboSpot</w:t>
+      </w:r>
+      <w:proofErr w:type="spellEnd"/>
+      <w:r>
+        <w:rPr>
+          <w:b/>
+          <w:bCs/>
+        </w:rPr>
+        <w:t xml:space="preserve"> onto the Raspberry Pi (GPIO header).</w:t>
       </w:r>
     </w:p>
     <w:p>
@@ -3912,7 +4403,23 @@
           <w:b/>
           <w:bCs/>
         </w:rPr>
-        <w:t>Set Radio Frequency (check sticker on your JumboSpot; usually around 433.550 MHz for UHF models)</w:t>
+        <w:t xml:space="preserve">Set Radio Frequency (check sticker on your </w:t>
+      </w:r>
+      <w:proofErr w:type="spellStart"/>
+      <w:r>
+        <w:rPr>
+          <w:b/>
+          <w:bCs/>
+        </w:rPr>
+        <w:t>JumboSpot</w:t>
+      </w:r>
+      <w:proofErr w:type="spellEnd"/>
+      <w:r>
+        <w:rPr>
+          <w:b/>
+          <w:bCs/>
+        </w:rPr>
+        <w:t>; usually around 433.550 MHz for UHF models)</w:t>
       </w:r>
     </w:p>
     <w:p>
@@ -3931,7 +4438,23 @@
           <w:b/>
           <w:bCs/>
         </w:rPr>
-        <w:t>Set Mode: Enable only D-Star (disable DMR, P25, etc if you only want D-Star).</w:t>
+        <w:t xml:space="preserve">Set Mode: Enable only D-Star (disable DMR, P25, </w:t>
+      </w:r>
+      <w:proofErr w:type="spellStart"/>
+      <w:r>
+        <w:rPr>
+          <w:b/>
+          <w:bCs/>
+        </w:rPr>
+        <w:t>etc</w:t>
+      </w:r>
+      <w:proofErr w:type="spellEnd"/>
+      <w:r>
+        <w:rPr>
+          <w:b/>
+          <w:bCs/>
+        </w:rPr>
+        <w:t xml:space="preserve"> if you only want D-Star).</w:t>
       </w:r>
     </w:p>
     <w:p>
@@ -4066,7 +4589,23 @@
           <w:b/>
           <w:bCs/>
         </w:rPr>
-        <w:t>Set your radio (like an Icom or Kenwood HT) with:</w:t>
+        <w:t xml:space="preserve">Set your radio (like an </w:t>
+      </w:r>
+      <w:proofErr w:type="spellStart"/>
+      <w:r>
+        <w:rPr>
+          <w:b/>
+          <w:bCs/>
+        </w:rPr>
+        <w:t>Icom</w:t>
+      </w:r>
+      <w:proofErr w:type="spellEnd"/>
+      <w:r>
+        <w:rPr>
+          <w:b/>
+          <w:bCs/>
+        </w:rPr>
+        <w:t xml:space="preserve"> or Kenwood HT) with:</w:t>
       </w:r>
     </w:p>
     <w:p>
@@ -4182,7 +4721,23 @@
           <w:b/>
           <w:bCs/>
         </w:rPr>
-        <w:t>From your radio, key up on the JumboSpot frequency.</w:t>
+        <w:t xml:space="preserve">From your radio, key up on the </w:t>
+      </w:r>
+      <w:proofErr w:type="spellStart"/>
+      <w:r>
+        <w:rPr>
+          <w:b/>
+          <w:bCs/>
+        </w:rPr>
+        <w:t>JumboSpot</w:t>
+      </w:r>
+      <w:proofErr w:type="spellEnd"/>
+      <w:r>
+        <w:rPr>
+          <w:b/>
+          <w:bCs/>
+        </w:rPr>
+        <w:t xml:space="preserve"> frequency.</w:t>
       </w:r>
     </w:p>
     <w:p>
@@ -4201,7 +4756,23 @@
           <w:b/>
           <w:bCs/>
         </w:rPr>
-        <w:t xml:space="preserve">You should hear the JumboSpot </w:t>
+        <w:t xml:space="preserve">You should hear the </w:t>
+      </w:r>
+      <w:proofErr w:type="spellStart"/>
+      <w:r>
+        <w:rPr>
+          <w:b/>
+          <w:bCs/>
+        </w:rPr>
+        <w:t>JumboSpot</w:t>
+      </w:r>
+      <w:proofErr w:type="spellEnd"/>
+      <w:r>
+        <w:rPr>
+          <w:b/>
+          <w:bCs/>
+        </w:rPr>
+        <w:t xml:space="preserve"> </w:t>
       </w:r>
       <w:proofErr w:type="gramStart"/>
       <w:r>

</xml_diff>